<commit_message>
Sync: core redundancy trim (6 cuts), regenerated PDF + Word
Co-Authored-By: Claude Opus 4.8 <noreply@anthropic.com>
</commit_message>
<xml_diff>
--- a/JouleFlex-proposal-2026-09-06.docx
+++ b/JouleFlex-proposal-2026-09-06.docx
@@ -5,6 +5,9 @@
     <w:bookmarkStart w:id="20" w:name="title-researchers-and-institution"/>
     <w:p>
       <w:pPr>
+        <w:keepLines w:val="0"/>
+        <w:keepNext w:val="0"/>
+        <w:widowControl w:val="0"/>
         <w:pStyle w:val="Heading2"/>
         <w:pBdr>
           <w:bottom w:val="single" w:sz="6" w:space="2" w:color="C8C8C8"/>
@@ -20,6 +23,7 @@
     </w:p>
     <w:p>
       <w:pPr>
+        <w:widowControl w:val="0"/>
         <w:pStyle w:val="FirstParagraph"/>
         <w:bidi/>
         <w:jc w:val="both"/>
@@ -35,6 +39,9 @@
     <w:bookmarkStart w:id="21" w:name="X537fc3236f3e3d119533c1bfba3910d0446fc41"/>
     <w:p>
       <w:pPr>
+        <w:keepLines w:val="0"/>
+        <w:keepNext w:val="0"/>
+        <w:widowControl w:val="0"/>
         <w:pStyle w:val="Heading1"/>
         <w:jc w:val="left"/>
       </w:pPr>
@@ -47,6 +54,7 @@
     </w:p>
     <w:p>
       <w:pPr>
+        <w:widowControl w:val="0"/>
         <w:pStyle w:val="FirstParagraph"/>
         <w:bidi/>
         <w:jc w:val="both"/>
@@ -60,6 +68,7 @@
     </w:p>
     <w:p>
       <w:pPr>
+        <w:widowControl w:val="0"/>
         <w:pStyle w:val="BodyText"/>
         <w:jc w:val="both"/>
       </w:pPr>
@@ -97,6 +106,9 @@
     <w:bookmarkStart w:id="24" w:name="abstract-תקציר"/>
     <w:p>
       <w:pPr>
+        <w:keepLines w:val="0"/>
+        <w:keepNext w:val="0"/>
+        <w:widowControl w:val="0"/>
         <w:pStyle w:val="Heading2"/>
         <w:pBdr>
           <w:bottom w:val="single" w:sz="6" w:space="2" w:color="C8C8C8"/>
@@ -113,6 +125,9 @@
     <w:bookmarkStart w:id="22" w:name="english-299300-words"/>
     <w:p>
       <w:pPr>
+        <w:keepLines w:val="0"/>
+        <w:keepNext w:val="0"/>
+        <w:widowControl w:val="0"/>
         <w:pStyle w:val="Heading3"/>
         <w:jc w:val="left"/>
       </w:pPr>
@@ -125,6 +140,7 @@
     </w:p>
     <w:p>
       <w:pPr>
+        <w:widowControl w:val="0"/>
         <w:pStyle w:val="FirstParagraph"/>
         <w:jc w:val="both"/>
       </w:pPr>
@@ -134,6 +150,7 @@
     </w:p>
     <w:p>
       <w:pPr>
+        <w:widowControl w:val="0"/>
         <w:pStyle w:val="BodyText"/>
         <w:jc w:val="both"/>
       </w:pPr>
@@ -143,6 +160,7 @@
     </w:p>
     <w:p>
       <w:pPr>
+        <w:widowControl w:val="0"/>
         <w:pStyle w:val="BodyText"/>
         <w:jc w:val="both"/>
       </w:pPr>
@@ -160,6 +178,9 @@
     <w:bookmarkStart w:id="23" w:name="עברית-300300-מילים"/>
     <w:p>
       <w:pPr>
+        <w:keepLines w:val="0"/>
+        <w:keepNext w:val="0"/>
+        <w:widowControl w:val="0"/>
         <w:pStyle w:val="Heading3"/>
         <w:bidi/>
         <w:jc w:val="right"/>
@@ -174,6 +195,7 @@
     </w:p>
     <w:p>
       <w:pPr>
+        <w:widowControl w:val="0"/>
         <w:pStyle w:val="FirstParagraph"/>
         <w:bidi/>
         <w:jc w:val="both"/>
@@ -187,6 +209,7 @@
     </w:p>
     <w:p>
       <w:pPr>
+        <w:widowControl w:val="0"/>
         <w:pStyle w:val="BodyText"/>
         <w:bidi/>
         <w:jc w:val="both"/>
@@ -200,6 +223,7 @@
     </w:p>
     <w:p>
       <w:pPr>
+        <w:widowControl w:val="0"/>
         <w:pStyle w:val="BodyText"/>
         <w:bidi/>
         <w:jc w:val="both"/>
@@ -216,6 +240,9 @@
     <w:bookmarkStart w:id="25" w:name="glossary"/>
     <w:p>
       <w:pPr>
+        <w:keepLines w:val="0"/>
+        <w:keepNext w:val="0"/>
+        <w:widowControl w:val="0"/>
         <w:pStyle w:val="Heading2"/>
         <w:pBdr>
           <w:bottom w:val="single" w:sz="6" w:space="2" w:color="C8C8C8"/>
@@ -255,6 +282,7 @@
           <w:tcPr/>
           <w:p>
             <w:pPr>
+              <w:widowControl w:val="0"/>
               <w:pStyle w:val="Compact"/>
               <w:jc w:val="both"/>
             </w:pPr>
@@ -267,6 +295,7 @@
           <w:tcPr/>
           <w:p>
             <w:pPr>
+              <w:widowControl w:val="0"/>
               <w:pStyle w:val="Compact"/>
               <w:jc w:val="both"/>
             </w:pPr>
@@ -277,10 +306,12 @@
         </w:tc>
       </w:tr>
       <w:tr>
-        <w:tc>
-          <w:tcPr/>
-          <w:p>
-            <w:pPr>
+        <w:trPr/>
+        <w:tc>
+          <w:tcPr/>
+          <w:p>
+            <w:pPr>
+              <w:widowControl w:val="0"/>
               <w:pStyle w:val="Compact"/>
               <w:jc w:val="both"/>
             </w:pPr>
@@ -293,6 +324,7 @@
           <w:tcPr/>
           <w:p>
             <w:pPr>
+              <w:widowControl w:val="0"/>
               <w:pStyle w:val="Compact"/>
               <w:jc w:val="both"/>
             </w:pPr>
@@ -303,10 +335,12 @@
         </w:tc>
       </w:tr>
       <w:tr>
-        <w:tc>
-          <w:tcPr/>
-          <w:p>
-            <w:pPr>
+        <w:trPr/>
+        <w:tc>
+          <w:tcPr/>
+          <w:p>
+            <w:pPr>
+              <w:widowControl w:val="0"/>
               <w:pStyle w:val="Compact"/>
               <w:jc w:val="both"/>
             </w:pPr>
@@ -319,6 +353,7 @@
           <w:tcPr/>
           <w:p>
             <w:pPr>
+              <w:widowControl w:val="0"/>
               <w:pStyle w:val="Compact"/>
               <w:jc w:val="both"/>
             </w:pPr>
@@ -329,10 +364,12 @@
         </w:tc>
       </w:tr>
       <w:tr>
-        <w:tc>
-          <w:tcPr/>
-          <w:p>
-            <w:pPr>
+        <w:trPr/>
+        <w:tc>
+          <w:tcPr/>
+          <w:p>
+            <w:pPr>
+              <w:widowControl w:val="0"/>
               <w:pStyle w:val="Compact"/>
               <w:jc w:val="both"/>
             </w:pPr>
@@ -345,6 +382,7 @@
           <w:tcPr/>
           <w:p>
             <w:pPr>
+              <w:widowControl w:val="0"/>
               <w:pStyle w:val="Compact"/>
               <w:jc w:val="both"/>
             </w:pPr>
@@ -355,10 +393,12 @@
         </w:tc>
       </w:tr>
       <w:tr>
-        <w:tc>
-          <w:tcPr/>
-          <w:p>
-            <w:pPr>
+        <w:trPr/>
+        <w:tc>
+          <w:tcPr/>
+          <w:p>
+            <w:pPr>
+              <w:widowControl w:val="0"/>
               <w:pStyle w:val="Compact"/>
               <w:jc w:val="both"/>
             </w:pPr>
@@ -371,6 +411,7 @@
           <w:tcPr/>
           <w:p>
             <w:pPr>
+              <w:widowControl w:val="0"/>
               <w:pStyle w:val="Compact"/>
               <w:jc w:val="both"/>
             </w:pPr>
@@ -381,10 +422,12 @@
         </w:tc>
       </w:tr>
       <w:tr>
-        <w:tc>
-          <w:tcPr/>
-          <w:p>
-            <w:pPr>
+        <w:trPr/>
+        <w:tc>
+          <w:tcPr/>
+          <w:p>
+            <w:pPr>
+              <w:widowControl w:val="0"/>
               <w:pStyle w:val="Compact"/>
               <w:jc w:val="both"/>
             </w:pPr>
@@ -397,6 +440,7 @@
           <w:tcPr/>
           <w:p>
             <w:pPr>
+              <w:widowControl w:val="0"/>
               <w:pStyle w:val="Compact"/>
               <w:jc w:val="both"/>
             </w:pPr>
@@ -407,10 +451,12 @@
         </w:tc>
       </w:tr>
       <w:tr>
-        <w:tc>
-          <w:tcPr/>
-          <w:p>
-            <w:pPr>
+        <w:trPr/>
+        <w:tc>
+          <w:tcPr/>
+          <w:p>
+            <w:pPr>
+              <w:widowControl w:val="0"/>
               <w:pStyle w:val="Compact"/>
               <w:jc w:val="both"/>
             </w:pPr>
@@ -423,6 +469,7 @@
           <w:tcPr/>
           <w:p>
             <w:pPr>
+              <w:widowControl w:val="0"/>
               <w:pStyle w:val="Compact"/>
               <w:jc w:val="both"/>
             </w:pPr>
@@ -433,10 +480,12 @@
         </w:tc>
       </w:tr>
       <w:tr>
-        <w:tc>
-          <w:tcPr/>
-          <w:p>
-            <w:pPr>
+        <w:trPr/>
+        <w:tc>
+          <w:tcPr/>
+          <w:p>
+            <w:pPr>
+              <w:widowControl w:val="0"/>
               <w:pStyle w:val="Compact"/>
               <w:jc w:val="both"/>
             </w:pPr>
@@ -449,6 +498,7 @@
           <w:tcPr/>
           <w:p>
             <w:pPr>
+              <w:widowControl w:val="0"/>
               <w:pStyle w:val="Compact"/>
               <w:jc w:val="both"/>
             </w:pPr>
@@ -459,10 +509,12 @@
         </w:tc>
       </w:tr>
       <w:tr>
-        <w:tc>
-          <w:tcPr/>
-          <w:p>
-            <w:pPr>
+        <w:trPr/>
+        <w:tc>
+          <w:tcPr/>
+          <w:p>
+            <w:pPr>
+              <w:widowControl w:val="0"/>
               <w:pStyle w:val="Compact"/>
               <w:jc w:val="both"/>
             </w:pPr>
@@ -475,6 +527,7 @@
           <w:tcPr/>
           <w:p>
             <w:pPr>
+              <w:widowControl w:val="0"/>
               <w:pStyle w:val="Compact"/>
               <w:jc w:val="both"/>
             </w:pPr>
@@ -485,10 +538,12 @@
         </w:tc>
       </w:tr>
       <w:tr>
-        <w:tc>
-          <w:tcPr/>
-          <w:p>
-            <w:pPr>
+        <w:trPr/>
+        <w:tc>
+          <w:tcPr/>
+          <w:p>
+            <w:pPr>
+              <w:widowControl w:val="0"/>
               <w:pStyle w:val="Compact"/>
               <w:jc w:val="both"/>
             </w:pPr>
@@ -501,6 +556,7 @@
           <w:tcPr/>
           <w:p>
             <w:pPr>
+              <w:widowControl w:val="0"/>
               <w:pStyle w:val="Compact"/>
               <w:jc w:val="both"/>
             </w:pPr>
@@ -511,10 +567,12 @@
         </w:tc>
       </w:tr>
       <w:tr>
-        <w:tc>
-          <w:tcPr/>
-          <w:p>
-            <w:pPr>
+        <w:trPr/>
+        <w:tc>
+          <w:tcPr/>
+          <w:p>
+            <w:pPr>
+              <w:widowControl w:val="0"/>
               <w:pStyle w:val="Compact"/>
               <w:jc w:val="both"/>
             </w:pPr>
@@ -527,6 +585,7 @@
           <w:tcPr/>
           <w:p>
             <w:pPr>
+              <w:widowControl w:val="0"/>
               <w:pStyle w:val="Compact"/>
               <w:jc w:val="both"/>
             </w:pPr>
@@ -537,10 +596,12 @@
         </w:tc>
       </w:tr>
       <w:tr>
-        <w:tc>
-          <w:tcPr/>
-          <w:p>
-            <w:pPr>
+        <w:trPr/>
+        <w:tc>
+          <w:tcPr/>
+          <w:p>
+            <w:pPr>
+              <w:widowControl w:val="0"/>
               <w:pStyle w:val="Compact"/>
               <w:jc w:val="both"/>
             </w:pPr>
@@ -553,6 +614,7 @@
           <w:tcPr/>
           <w:p>
             <w:pPr>
+              <w:widowControl w:val="0"/>
               <w:pStyle w:val="Compact"/>
               <w:jc w:val="both"/>
             </w:pPr>
@@ -563,10 +625,12 @@
         </w:tc>
       </w:tr>
       <w:tr>
-        <w:tc>
-          <w:tcPr/>
-          <w:p>
-            <w:pPr>
+        <w:trPr/>
+        <w:tc>
+          <w:tcPr/>
+          <w:p>
+            <w:pPr>
+              <w:widowControl w:val="0"/>
               <w:pStyle w:val="Compact"/>
               <w:jc w:val="both"/>
             </w:pPr>
@@ -579,6 +643,7 @@
           <w:tcPr/>
           <w:p>
             <w:pPr>
+              <w:widowControl w:val="0"/>
               <w:pStyle w:val="Compact"/>
               <w:jc w:val="both"/>
             </w:pPr>
@@ -593,6 +658,9 @@
     <w:bookmarkStart w:id="28" w:name="objectives-of-the-program"/>
     <w:p>
       <w:pPr>
+        <w:keepLines w:val="0"/>
+        <w:keepNext w:val="0"/>
+        <w:widowControl w:val="0"/>
         <w:pStyle w:val="Heading2"/>
         <w:pBdr>
           <w:bottom w:val="single" w:sz="6" w:space="2" w:color="C8C8C8"/>
@@ -609,6 +677,9 @@
     <w:bookmarkStart w:id="26" w:name="the-objective"/>
     <w:p>
       <w:pPr>
+        <w:keepLines w:val="0"/>
+        <w:keepNext w:val="0"/>
+        <w:widowControl w:val="0"/>
         <w:pStyle w:val="Heading3"/>
         <w:jc w:val="left"/>
       </w:pPr>
@@ -621,6 +692,7 @@
     </w:p>
     <w:p>
       <w:pPr>
+        <w:widowControl w:val="0"/>
         <w:pStyle w:val="FirstParagraph"/>
         <w:jc w:val="both"/>
       </w:pPr>
@@ -653,6 +725,7 @@
     </w:p>
     <w:p>
       <w:pPr>
+        <w:widowControl w:val="0"/>
         <w:pStyle w:val="BodyText"/>
         <w:jc w:val="both"/>
       </w:pPr>
@@ -743,6 +816,9 @@
     <w:bookmarkStart w:id="27" w:name="the-research-question"/>
     <w:p>
       <w:pPr>
+        <w:keepLines w:val="0"/>
+        <w:keepNext w:val="0"/>
+        <w:widowControl w:val="0"/>
         <w:pStyle w:val="Heading3"/>
         <w:jc w:val="left"/>
       </w:pPr>
@@ -755,6 +831,7 @@
     </w:p>
     <w:p>
       <w:pPr>
+        <w:widowControl w:val="0"/>
         <w:pStyle w:val="FirstParagraph"/>
         <w:jc w:val="both"/>
       </w:pPr>
@@ -764,6 +841,7 @@
     </w:p>
     <w:p>
       <w:pPr>
+        <w:widowControl w:val="0"/>
         <w:pStyle w:val="BodyText"/>
         <w:jc w:val="both"/>
       </w:pPr>
@@ -773,6 +851,7 @@
     </w:p>
     <w:p>
       <w:pPr>
+        <w:widowControl w:val="0"/>
         <w:pStyle w:val="Compact"/>
         <w:numPr>
           <w:ilvl w:val="0"/>
@@ -796,6 +875,7 @@
     </w:p>
     <w:p>
       <w:pPr>
+        <w:widowControl w:val="0"/>
         <w:pStyle w:val="Compact"/>
         <w:numPr>
           <w:ilvl w:val="0"/>
@@ -819,6 +899,7 @@
     </w:p>
     <w:p>
       <w:pPr>
+        <w:widowControl w:val="0"/>
         <w:pStyle w:val="Compact"/>
         <w:numPr>
           <w:ilvl w:val="0"/>
@@ -842,6 +923,7 @@
     </w:p>
     <w:p>
       <w:pPr>
+        <w:widowControl w:val="0"/>
         <w:pStyle w:val="Compact"/>
         <w:numPr>
           <w:ilvl w:val="0"/>
@@ -865,6 +947,7 @@
     </w:p>
     <w:p>
       <w:pPr>
+        <w:widowControl w:val="0"/>
         <w:pStyle w:val="Compact"/>
         <w:numPr>
           <w:ilvl w:val="0"/>
@@ -888,6 +971,7 @@
     </w:p>
     <w:p>
       <w:pPr>
+        <w:widowControl w:val="0"/>
         <w:pStyle w:val="Compact"/>
         <w:numPr>
           <w:ilvl w:val="0"/>
@@ -914,6 +998,9 @@
     <w:bookmarkStart w:id="37" w:name="the-proposed-research"/>
     <w:p>
       <w:pPr>
+        <w:keepLines w:val="0"/>
+        <w:keepNext w:val="0"/>
+        <w:widowControl w:val="0"/>
         <w:pStyle w:val="Heading2"/>
         <w:pBdr>
           <w:bottom w:val="single" w:sz="6" w:space="2" w:color="C8C8C8"/>
@@ -930,6 +1017,9 @@
     <w:bookmarkStart w:id="29" w:name="scientific-and-technological-background"/>
     <w:p>
       <w:pPr>
+        <w:keepLines w:val="0"/>
+        <w:keepNext w:val="0"/>
+        <w:widowControl w:val="0"/>
         <w:pStyle w:val="Heading3"/>
         <w:jc w:val="left"/>
       </w:pPr>
@@ -942,6 +1032,7 @@
     </w:p>
     <w:p>
       <w:pPr>
+        <w:widowControl w:val="0"/>
         <w:pStyle w:val="FirstParagraph"/>
         <w:jc w:val="both"/>
       </w:pPr>
@@ -973,6 +1064,7 @@
     </w:p>
     <w:p>
       <w:pPr>
+        <w:widowControl w:val="0"/>
         <w:pStyle w:val="BodyText"/>
         <w:jc w:val="both"/>
       </w:pPr>
@@ -987,11 +1079,12 @@
         <w:t xml:space="preserve"> </w:t>
       </w:r>
       <w:r>
-        <w:t xml:space="preserve">Under stress a data center switches GPUs off, discarding service, or caps power energy-blind: a capped GPU runs slower and pays its fixed power floor longer, so capping too deep lowers the dashboard watts while raising the joules on the bill, and unconstrained the default is full rated power, where the last increment of speed carries a steep surcharge. A further choice goes unweighed: for a fixed workload, whether to concentrate it on fewer cards at full power or spread it across more at partial power, where the measurements show the second is more efficient when power, not capital, binds.</w:t>
-      </w:r>
-    </w:p>
-    <w:p>
-      <w:pPr>
+        <w:t xml:space="preserve">Under stress a data center switches GPUs off, discarding service, or caps power energy-blind: a capped GPU runs slower and pays its fixed power floor longer, so capping too deep lowers the dashboard watts while raising the joules on the bill, and unconstrained the default is full rated power, where the last increment of speed carries a steep surcharge.</w:t>
+      </w:r>
+    </w:p>
+    <w:p>
+      <w:pPr>
+        <w:widowControl w:val="0"/>
         <w:pStyle w:val="BodyText"/>
         <w:jc w:val="both"/>
       </w:pPr>
@@ -1023,6 +1116,7 @@
     </w:p>
     <w:p>
       <w:pPr>
+        <w:widowControl w:val="0"/>
         <w:pStyle w:val="BodyText"/>
         <w:jc w:val="both"/>
       </w:pPr>
@@ -1124,6 +1218,7 @@
     </w:p>
     <w:p>
       <w:pPr>
+        <w:widowControl w:val="0"/>
         <w:pStyle w:val="BodyText"/>
         <w:jc w:val="both"/>
       </w:pPr>
@@ -1154,6 +1249,9 @@
     <w:bookmarkStart w:id="30" w:name="review-of-existing-knowledge"/>
     <w:p>
       <w:pPr>
+        <w:keepLines w:val="0"/>
+        <w:keepNext w:val="0"/>
+        <w:widowControl w:val="0"/>
         <w:pStyle w:val="Heading3"/>
         <w:jc w:val="left"/>
       </w:pPr>
@@ -1166,6 +1264,7 @@
     </w:p>
     <w:p>
       <w:pPr>
+        <w:widowControl w:val="0"/>
         <w:pStyle w:val="FirstParagraph"/>
         <w:jc w:val="both"/>
       </w:pPr>
@@ -1283,6 +1382,9 @@
     <w:bookmarkStart w:id="31" w:name="knowledge-gaps"/>
     <w:p>
       <w:pPr>
+        <w:keepLines w:val="0"/>
+        <w:keepNext w:val="0"/>
+        <w:widowControl w:val="0"/>
         <w:pStyle w:val="Heading3"/>
         <w:jc w:val="left"/>
       </w:pPr>
@@ -1295,6 +1397,7 @@
     </w:p>
     <w:p>
       <w:pPr>
+        <w:widowControl w:val="0"/>
         <w:pStyle w:val="Compact"/>
         <w:numPr>
           <w:ilvl w:val="0"/>
@@ -1318,6 +1421,7 @@
     </w:p>
     <w:p>
       <w:pPr>
+        <w:widowControl w:val="0"/>
         <w:pStyle w:val="Compact"/>
         <w:numPr>
           <w:ilvl w:val="0"/>
@@ -1341,6 +1445,7 @@
     </w:p>
     <w:p>
       <w:pPr>
+        <w:widowControl w:val="0"/>
         <w:pStyle w:val="Compact"/>
         <w:numPr>
           <w:ilvl w:val="0"/>
@@ -1364,6 +1469,7 @@
     </w:p>
     <w:p>
       <w:pPr>
+        <w:widowControl w:val="0"/>
         <w:pStyle w:val="Compact"/>
         <w:numPr>
           <w:ilvl w:val="0"/>
@@ -1387,6 +1493,7 @@
     </w:p>
     <w:p>
       <w:pPr>
+        <w:widowControl w:val="0"/>
         <w:pStyle w:val="Compact"/>
         <w:numPr>
           <w:ilvl w:val="0"/>
@@ -1410,6 +1517,7 @@
     </w:p>
     <w:p>
       <w:pPr>
+        <w:widowControl w:val="0"/>
         <w:pStyle w:val="Compact"/>
         <w:numPr>
           <w:ilvl w:val="0"/>
@@ -1435,6 +1543,9 @@
     <w:bookmarkStart w:id="32" w:name="description-of-the-proposed-research"/>
     <w:p>
       <w:pPr>
+        <w:keepLines w:val="0"/>
+        <w:keepNext w:val="0"/>
+        <w:widowControl w:val="0"/>
         <w:pStyle w:val="Heading3"/>
         <w:jc w:val="left"/>
       </w:pPr>
@@ -1447,6 +1558,7 @@
     </w:p>
     <w:p>
       <w:pPr>
+        <w:widowControl w:val="0"/>
         <w:pStyle w:val="FirstParagraph"/>
         <w:jc w:val="both"/>
       </w:pPr>
@@ -1503,6 +1615,9 @@
     <w:bookmarkStart w:id="33" w:name="methods-work-packages"/>
     <w:p>
       <w:pPr>
+        <w:keepLines w:val="0"/>
+        <w:keepNext w:val="0"/>
+        <w:widowControl w:val="0"/>
         <w:pStyle w:val="Heading3"/>
         <w:jc w:val="left"/>
       </w:pPr>
@@ -1540,6 +1655,7 @@
           <w:tcPr/>
           <w:p>
             <w:pPr>
+              <w:widowControl w:val="0"/>
               <w:pStyle w:val="Compact"/>
               <w:jc w:val="both"/>
             </w:pPr>
@@ -1552,6 +1668,7 @@
           <w:tcPr/>
           <w:p>
             <w:pPr>
+              <w:widowControl w:val="0"/>
               <w:pStyle w:val="Compact"/>
               <w:jc w:val="both"/>
             </w:pPr>
@@ -1564,6 +1681,7 @@
           <w:tcPr/>
           <w:p>
             <w:pPr>
+              <w:widowControl w:val="0"/>
               <w:pStyle w:val="Compact"/>
               <w:jc w:val="both"/>
             </w:pPr>
@@ -1574,10 +1692,12 @@
         </w:tc>
       </w:tr>
       <w:tr>
-        <w:tc>
-          <w:tcPr/>
-          <w:p>
-            <w:pPr>
+        <w:trPr/>
+        <w:tc>
+          <w:tcPr/>
+          <w:p>
+            <w:pPr>
+              <w:widowControl w:val="0"/>
               <w:pStyle w:val="Compact"/>
               <w:jc w:val="both"/>
             </w:pPr>
@@ -1594,6 +1714,7 @@
           <w:tcPr/>
           <w:p>
             <w:pPr>
+              <w:widowControl w:val="0"/>
               <w:pStyle w:val="Compact"/>
               <w:jc w:val="both"/>
             </w:pPr>
@@ -1606,6 +1727,7 @@
           <w:tcPr/>
           <w:p>
             <w:pPr>
+              <w:widowControl w:val="0"/>
               <w:pStyle w:val="Compact"/>
               <w:jc w:val="both"/>
             </w:pPr>
@@ -1632,10 +1754,12 @@
         </w:tc>
       </w:tr>
       <w:tr>
-        <w:tc>
-          <w:tcPr/>
-          <w:p>
-            <w:pPr>
+        <w:trPr/>
+        <w:tc>
+          <w:tcPr/>
+          <w:p>
+            <w:pPr>
+              <w:widowControl w:val="0"/>
               <w:pStyle w:val="Compact"/>
               <w:jc w:val="both"/>
             </w:pPr>
@@ -1652,6 +1776,7 @@
           <w:tcPr/>
           <w:p>
             <w:pPr>
+              <w:widowControl w:val="0"/>
               <w:pStyle w:val="Compact"/>
               <w:jc w:val="both"/>
             </w:pPr>
@@ -1664,6 +1789,7 @@
           <w:tcPr/>
           <w:p>
             <w:pPr>
+              <w:widowControl w:val="0"/>
               <w:pStyle w:val="Compact"/>
               <w:jc w:val="both"/>
             </w:pPr>
@@ -1690,10 +1816,12 @@
         </w:tc>
       </w:tr>
       <w:tr>
-        <w:tc>
-          <w:tcPr/>
-          <w:p>
-            <w:pPr>
+        <w:trPr/>
+        <w:tc>
+          <w:tcPr/>
+          <w:p>
+            <w:pPr>
+              <w:widowControl w:val="0"/>
               <w:pStyle w:val="Compact"/>
               <w:jc w:val="both"/>
             </w:pPr>
@@ -1710,6 +1838,7 @@
           <w:tcPr/>
           <w:p>
             <w:pPr>
+              <w:widowControl w:val="0"/>
               <w:pStyle w:val="Compact"/>
               <w:jc w:val="both"/>
             </w:pPr>
@@ -1722,6 +1851,7 @@
           <w:tcPr/>
           <w:p>
             <w:pPr>
+              <w:widowControl w:val="0"/>
               <w:pStyle w:val="Compact"/>
               <w:jc w:val="both"/>
             </w:pPr>
@@ -1748,10 +1878,12 @@
         </w:tc>
       </w:tr>
       <w:tr>
-        <w:tc>
-          <w:tcPr/>
-          <w:p>
-            <w:pPr>
+        <w:trPr/>
+        <w:tc>
+          <w:tcPr/>
+          <w:p>
+            <w:pPr>
+              <w:widowControl w:val="0"/>
               <w:pStyle w:val="Compact"/>
               <w:jc w:val="both"/>
             </w:pPr>
@@ -1768,6 +1900,7 @@
           <w:tcPr/>
           <w:p>
             <w:pPr>
+              <w:widowControl w:val="0"/>
               <w:pStyle w:val="Compact"/>
               <w:jc w:val="both"/>
             </w:pPr>
@@ -1780,6 +1913,7 @@
           <w:tcPr/>
           <w:p>
             <w:pPr>
+              <w:widowControl w:val="0"/>
               <w:pStyle w:val="Compact"/>
               <w:jc w:val="both"/>
             </w:pPr>
@@ -1806,10 +1940,12 @@
         </w:tc>
       </w:tr>
       <w:tr>
-        <w:tc>
-          <w:tcPr/>
-          <w:p>
-            <w:pPr>
+        <w:trPr/>
+        <w:tc>
+          <w:tcPr/>
+          <w:p>
+            <w:pPr>
+              <w:widowControl w:val="0"/>
               <w:pStyle w:val="Compact"/>
               <w:jc w:val="both"/>
             </w:pPr>
@@ -1826,6 +1962,7 @@
           <w:tcPr/>
           <w:p>
             <w:pPr>
+              <w:widowControl w:val="0"/>
               <w:pStyle w:val="Compact"/>
               <w:jc w:val="both"/>
             </w:pPr>
@@ -1838,6 +1975,7 @@
           <w:tcPr/>
           <w:p>
             <w:pPr>
+              <w:widowControl w:val="0"/>
               <w:pStyle w:val="Compact"/>
               <w:jc w:val="both"/>
             </w:pPr>
@@ -1866,6 +2004,7 @@
     </w:tbl>
     <w:p>
       <w:pPr>
+        <w:widowControl w:val="0"/>
         <w:pStyle w:val="BodyText"/>
         <w:jc w:val="both"/>
       </w:pPr>
@@ -1877,6 +2016,9 @@
     <w:bookmarkStart w:id="34" w:name="novelty-and-originality"/>
     <w:p>
       <w:pPr>
+        <w:keepLines w:val="0"/>
+        <w:keepNext w:val="0"/>
+        <w:widowControl w:val="0"/>
         <w:pStyle w:val="Heading3"/>
         <w:jc w:val="left"/>
       </w:pPr>
@@ -1889,6 +2031,7 @@
     </w:p>
     <w:p>
       <w:pPr>
+        <w:widowControl w:val="0"/>
         <w:pStyle w:val="FirstParagraph"/>
         <w:jc w:val="both"/>
       </w:pPr>
@@ -1898,6 +2041,7 @@
     </w:p>
     <w:p>
       <w:pPr>
+        <w:widowControl w:val="0"/>
         <w:pStyle w:val="Compact"/>
         <w:numPr>
           <w:ilvl w:val="0"/>
@@ -1921,6 +2065,7 @@
     </w:p>
     <w:p>
       <w:pPr>
+        <w:widowControl w:val="0"/>
         <w:pStyle w:val="Compact"/>
         <w:numPr>
           <w:ilvl w:val="0"/>
@@ -1944,6 +2089,7 @@
     </w:p>
     <w:p>
       <w:pPr>
+        <w:widowControl w:val="0"/>
         <w:pStyle w:val="Compact"/>
         <w:numPr>
           <w:ilvl w:val="0"/>
@@ -1962,11 +2108,12 @@
         <w:t xml:space="preserve"> </w:t>
       </w:r>
       <w:r>
-        <w:t xml:space="preserve">Inference power-capping saves energy at a chosen cap [20] and can be inert for memory-bound decode [23]; JouleFlex instead sets power to the computed energy optimum per (card, job) in the loaded regime where the cap binds; the measured cost of universal full-power operation is about 30 percent of inference energy.</w:t>
-      </w:r>
-    </w:p>
-    <w:p>
-      <w:pPr>
+        <w:t xml:space="preserve">Inference power-capping saves energy at a chosen cap [20] and can be inert for memory-bound decode [23]; JouleFlex instead sets power to the computed energy optimum per (card, job) in the loaded regime where the cap binds.</w:t>
+      </w:r>
+    </w:p>
+    <w:p>
+      <w:pPr>
+        <w:widowControl w:val="0"/>
         <w:pStyle w:val="Compact"/>
         <w:numPr>
           <w:ilvl w:val="0"/>
@@ -1979,17 +2126,18 @@
           <w:b/>
           <w:bCs/>
         </w:rPr>
-        <w:t xml:space="preserve">From the board to the wall.</w:t>
-      </w:r>
-      <w:r>
-        <w:t xml:space="preserve"> </w:t>
-      </w:r>
-      <w:r>
-        <w:t xml:space="preserve">Published GPU energy results are board-power results; measuring the node’s JP at server-input power moves the claim toward what the grid actually meters.</w:t>
-      </w:r>
-    </w:p>
-    <w:p>
-      <w:pPr>
+        <w:t xml:space="preserve">An open dataset with no equivalent.</w:t>
+      </w:r>
+      <w:r>
+        <w:t xml:space="preserve"> </w:t>
+      </w:r>
+      <w:r>
+        <w:t xml:space="preserve">WattGPU [22] predicts inference power at a single operating point and ML.ENERGY [9,10] reports one point; open power-cap sweeps cover training or HPC. The intersection, a dense power-cap sweep across many inference models and GPUs at the granularity to locate the energy-optimal point, does not exist. ELF fills it.</w:t>
+      </w:r>
+    </w:p>
+    <w:p>
+      <w:pPr>
+        <w:widowControl w:val="0"/>
         <w:pStyle w:val="Compact"/>
         <w:numPr>
           <w:ilvl w:val="0"/>
@@ -2002,29 +2150,6 @@
           <w:b/>
           <w:bCs/>
         </w:rPr>
-        <w:t xml:space="preserve">An open dataset with no equivalent.</w:t>
-      </w:r>
-      <w:r>
-        <w:t xml:space="preserve"> </w:t>
-      </w:r>
-      <w:r>
-        <w:t xml:space="preserve">WattGPU [22] predicts inference power at a single operating point and ML.ENERGY [9,10] reports one point; open power-cap sweeps cover training or HPC. The intersection, a dense power-cap sweep across many inference models and GPUs at the granularity to locate the energy-optimal point, does not exist. ELF fills it, so the project extends an existing asset rather than first building one.</w:t>
-      </w:r>
-    </w:p>
-    <w:p>
-      <w:pPr>
-        <w:pStyle w:val="Compact"/>
-        <w:numPr>
-          <w:ilvl w:val="0"/>
-          <w:numId w:val="1003"/>
-        </w:numPr>
-        <w:jc w:val="both"/>
-      </w:pPr>
-      <w:r>
-        <w:rPr>
-          <w:b/>
-          <w:bCs/>
-        </w:rPr>
         <w:t xml:space="preserve">The joint allocation-and-capping problem, to the measured optimum.</w:t>
       </w:r>
       <w:r>
@@ -2038,6 +2163,9 @@
     <w:bookmarkStart w:id="35" w:name="fit-to-the-ministrys-rd-goals"/>
     <w:p>
       <w:pPr>
+        <w:keepLines w:val="0"/>
+        <w:keepNext w:val="0"/>
+        <w:widowControl w:val="0"/>
         <w:pStyle w:val="Heading3"/>
         <w:jc w:val="left"/>
       </w:pPr>
@@ -2050,6 +2178,7 @@
     </w:p>
     <w:p>
       <w:pPr>
+        <w:widowControl w:val="0"/>
         <w:pStyle w:val="FirstParagraph"/>
         <w:jc w:val="both"/>
       </w:pPr>
@@ -2083,6 +2212,7 @@
           <w:tcPr/>
           <w:p>
             <w:pPr>
+              <w:widowControl w:val="0"/>
               <w:pStyle w:val="Compact"/>
               <w:jc w:val="both"/>
             </w:pPr>
@@ -2095,6 +2225,7 @@
           <w:tcPr/>
           <w:p>
             <w:pPr>
+              <w:widowControl w:val="0"/>
               <w:pStyle w:val="Compact"/>
               <w:jc w:val="both"/>
             </w:pPr>
@@ -2105,10 +2236,12 @@
         </w:tc>
       </w:tr>
       <w:tr>
-        <w:tc>
-          <w:tcPr/>
-          <w:p>
-            <w:pPr>
+        <w:trPr/>
+        <w:tc>
+          <w:tcPr/>
+          <w:p>
+            <w:pPr>
+              <w:widowControl w:val="0"/>
               <w:pStyle w:val="Compact"/>
               <w:bidi/>
               <w:jc w:val="both"/>
@@ -2139,6 +2272,7 @@
           <w:tcPr/>
           <w:p>
             <w:pPr>
+              <w:widowControl w:val="0"/>
               <w:pStyle w:val="Compact"/>
               <w:jc w:val="both"/>
             </w:pPr>
@@ -2149,10 +2283,12 @@
         </w:tc>
       </w:tr>
       <w:tr>
-        <w:tc>
-          <w:tcPr/>
-          <w:p>
-            <w:pPr>
+        <w:trPr/>
+        <w:tc>
+          <w:tcPr/>
+          <w:p>
+            <w:pPr>
+              <w:widowControl w:val="0"/>
               <w:pStyle w:val="Compact"/>
               <w:bidi/>
               <w:jc w:val="both"/>
@@ -2195,6 +2331,7 @@
           <w:tcPr/>
           <w:p>
             <w:pPr>
+              <w:widowControl w:val="0"/>
               <w:pStyle w:val="Compact"/>
               <w:jc w:val="both"/>
             </w:pPr>
@@ -2205,10 +2342,12 @@
         </w:tc>
       </w:tr>
       <w:tr>
-        <w:tc>
-          <w:tcPr/>
-          <w:p>
-            <w:pPr>
+        <w:trPr/>
+        <w:tc>
+          <w:tcPr/>
+          <w:p>
+            <w:pPr>
+              <w:widowControl w:val="0"/>
               <w:pStyle w:val="Compact"/>
               <w:bidi/>
               <w:jc w:val="both"/>
@@ -2251,6 +2390,7 @@
           <w:tcPr/>
           <w:p>
             <w:pPr>
+              <w:widowControl w:val="0"/>
               <w:pStyle w:val="Compact"/>
               <w:jc w:val="both"/>
             </w:pPr>
@@ -2261,10 +2401,12 @@
         </w:tc>
       </w:tr>
       <w:tr>
-        <w:tc>
-          <w:tcPr/>
-          <w:p>
-            <w:pPr>
+        <w:trPr/>
+        <w:tc>
+          <w:tcPr/>
+          <w:p>
+            <w:pPr>
+              <w:widowControl w:val="0"/>
               <w:pStyle w:val="Compact"/>
               <w:bidi/>
               <w:jc w:val="both"/>
@@ -2307,6 +2449,7 @@
           <w:tcPr/>
           <w:p>
             <w:pPr>
+              <w:widowControl w:val="0"/>
               <w:pStyle w:val="Compact"/>
               <w:jc w:val="both"/>
             </w:pPr>
@@ -2317,10 +2460,12 @@
         </w:tc>
       </w:tr>
       <w:tr>
-        <w:tc>
-          <w:tcPr/>
-          <w:p>
-            <w:pPr>
+        <w:trPr/>
+        <w:tc>
+          <w:tcPr/>
+          <w:p>
+            <w:pPr>
+              <w:widowControl w:val="0"/>
               <w:pStyle w:val="Compact"/>
               <w:bidi/>
               <w:jc w:val="both"/>
@@ -2351,6 +2496,7 @@
           <w:tcPr/>
           <w:p>
             <w:pPr>
+              <w:widowControl w:val="0"/>
               <w:pStyle w:val="Compact"/>
               <w:jc w:val="both"/>
             </w:pPr>
@@ -2365,6 +2511,9 @@
     <w:bookmarkStart w:id="36" w:name="preliminary-results"/>
     <w:p>
       <w:pPr>
+        <w:keepLines w:val="0"/>
+        <w:keepNext w:val="0"/>
+        <w:widowControl w:val="0"/>
         <w:pStyle w:val="Heading3"/>
         <w:jc w:val="left"/>
       </w:pPr>
@@ -2377,6 +2526,7 @@
     </w:p>
     <w:p>
       <w:pPr>
+        <w:widowControl w:val="0"/>
         <w:pStyle w:val="FirstParagraph"/>
         <w:jc w:val="both"/>
       </w:pPr>
@@ -2421,13 +2571,13 @@
         <w:t xml:space="preserve"> </w:t>
       </w:r>
       <w:r>
-        <w:t xml:space="preserve">in a measured-curve simulation, with about 50 percent more work per megawatt behind a fixed GPU power budget. Cap actuation</w:t>
-      </w:r>
-      <w:r>
-        <w:t xml:space="preserve"> </w:t>
-      </w:r>
-      <w:r>
-        <w:t xml:space="preserve">settles in about 191 milliseconds, two orders of magnitude inside any demand-response ramp window. Under the per-instance-hour billing model analyzed in [1], the renter’s cost</w:t>
+        <w:t xml:space="preserve">in a measured-curve simulation. Cap actuation</w:t>
+      </w:r>
+      <w:r>
+        <w:t xml:space="preserve"> </w:t>
+      </w:r>
+      <w:r>
+        <w:t xml:space="preserve">settles in about 191 milliseconds. Under the per-instance-hour billing model analyzed in [1], the renter’s cost</w:t>
       </w:r>
       <w:r>
         <w:t xml:space="preserve"> </w:t>
@@ -2445,19 +2595,7 @@
         <w:t xml:space="preserve"> </w:t>
       </w:r>
       <w:r>
-        <w:t xml:space="preserve">across workloads are 0.88 to 0.92 (Fig. A1). The benefit persists under tight service: in the strict-deadline</w:t>
-      </w:r>
-      <w:r>
-        <w:t xml:space="preserve"> </w:t>
-      </w:r>
-      <w:r>
-        <w:t xml:space="preserve">experiment of [1], capping saved 28 percent of energy while keeping 95 percent of workload value. The harness,</w:t>
-      </w:r>
-      <w:r>
-        <w:t xml:space="preserve"> </w:t>
-      </w:r>
-      <w:r>
-        <w:t xml:space="preserve">simulator and analysis pipeline ran end to end; the project scales them out rather than building from zero.</w:t>
+        <w:t xml:space="preserve">across workloads are 0.88 to 0.92 (Fig. A1). Under the strict-deadline experiment of [1], capping saved 28 percent of energy while keeping 95 percent of workload value.</w:t>
       </w:r>
     </w:p>
     <w:bookmarkEnd w:id="36"/>
@@ -2465,6 +2603,9 @@
     <w:bookmarkStart w:id="40" w:name="application-expected-benefit-and-impact"/>
     <w:p>
       <w:pPr>
+        <w:keepLines w:val="0"/>
+        <w:keepNext w:val="0"/>
+        <w:widowControl w:val="0"/>
         <w:pStyle w:val="Heading2"/>
         <w:pBdr>
           <w:bottom w:val="single" w:sz="6" w:space="2" w:color="C8C8C8"/>
@@ -2481,6 +2622,9 @@
     <w:bookmarkStart w:id="38" w:name="what-the-project-delivers-concretely"/>
     <w:p>
       <w:pPr>
+        <w:keepLines w:val="0"/>
+        <w:keepNext w:val="0"/>
+        <w:widowControl w:val="0"/>
         <w:pStyle w:val="Heading3"/>
         <w:jc w:val="left"/>
       </w:pPr>
@@ -2493,6 +2637,7 @@
     </w:p>
     <w:p>
       <w:pPr>
+        <w:widowControl w:val="0"/>
         <w:pStyle w:val="FirstParagraph"/>
         <w:jc w:val="both"/>
       </w:pPr>
@@ -2504,6 +2649,9 @@
     <w:bookmarkStart w:id="39" w:name="benefit-and-impact"/>
     <w:p>
       <w:pPr>
+        <w:keepLines w:val="0"/>
+        <w:keepNext w:val="0"/>
+        <w:widowControl w:val="0"/>
         <w:pStyle w:val="Heading3"/>
         <w:jc w:val="left"/>
       </w:pPr>
@@ -2516,6 +2664,7 @@
     </w:p>
     <w:p>
       <w:pPr>
+        <w:widowControl w:val="0"/>
         <w:pStyle w:val="FirstParagraph"/>
         <w:jc w:val="both"/>
       </w:pPr>
@@ -2530,11 +2679,12 @@
         <w:t xml:space="preserve"> </w:t>
       </w:r>
       <w:r>
-        <w:t xml:space="preserve">Under the July 2026 freeze [2], Israel faces a binary choice: deny AI-load growth, or overbuild firm generation to serve it. JouleFlex supplies a third path. The binding constraint is connection capacity in megawatts, and the JP converts efficiency into capacity: on the measured A100 curve, a fixed-feed calculation implies about 50 percent more AI work per megawatt of GPU power [1]. Every 1,000 MW of the 27,000 MW queue connected under JP operation could carry the AI work of up to 1,500 MW uncapped, a board-level figure WP1 and WP4 verify at server input and facility level before any coefficient is recommended. WP5 puts a shekel-per-megawatt value on the flexible-connection option from public Noga and Electricity Authority data, entering measured numbers into the Authority's open consultation [19] while the rules are written. With flexibility measured, committed and audited (WP4), the regulator gains a third option and the frozen queue stops being all-or-nothing. The same efficiency avoids about 0.3 TWh per TWh of AI workload, roughly 150,000 tonnes of CO2 at 0.5 kg per kilowatt-hour.</w:t>
-      </w:r>
-    </w:p>
-    <w:p>
-      <w:pPr>
+        <w:t xml:space="preserve">Under the July 2026 freeze [2], Israel faces a binary choice: deny AI-load growth, or overbuild firm generation to serve it. JouleFlex supplies a third path. The binding constraint is connection capacity in megawatts, and the JP converts efficiency into capacity: on the measured A100 curve, a fixed-feed calculation implies about 50 percent more AI work per megawatt of GPU power [1]. Every 1,000 MW of the 27,000 MW queue connected under JP operation could carry the AI work of up to 1,500 MW uncapped, a board-level figure WP1 and WP4 verify at server input and facility level before any coefficient is recommended. WP5 puts a shekel-per-megawatt value on the flexible-connection option from public Noga and Electricity Authority data, entering measured numbers into the Authority's open consultation [19] while the rules are written. With flexibility measured, committed and audited (WP4), the regulator gains a third option and the frozen queue stops being all-or-nothing.</w:t>
+      </w:r>
+    </w:p>
+    <w:p>
+      <w:pPr>
+        <w:widowControl w:val="0"/>
         <w:pStyle w:val="BodyText"/>
         <w:jc w:val="both"/>
       </w:pPr>
@@ -2549,11 +2699,12 @@
         <w:t xml:space="preserve"> </w:t>
       </w:r>
       <w:r>
-        <w:t xml:space="preserve">Israel has little research capacity at the AI-energy interface, and operators and the regulator now both need it. The project builds that capacity on three levels: one postdoctoral researcher trained across a stack no single Israeli group combines (GPU energy measurement with NVML/RAPL/BMC, ML-systems control, and energy-market analysis), employable by Israeli operators, Noga or the Authority; the open ELF-2 dataset, twin and control engine as teaching material at HIT, reusable by any institution; and the Hebrew M8 and M21 briefings plus a public release that carry the methods and numbers to Ministry, Authority and Noga staff and to operators. A trained specialist, an open national dataset and a better-equipped regulator outlast the grant.</w:t>
-      </w:r>
-    </w:p>
-    <w:p>
-      <w:pPr>
+        <w:t xml:space="preserve">Israel has little research capacity at the AI-energy interface, which operators and the regulator now both need. The project builds it on three levels: a postdoctoral researcher trained across a stack no single Israeli group combines (GPU energy measurement with NVML/RAPL/BMC, ML-systems control, and energy-market analysis); the open ELF-2 dataset, twin and control engine as teaching material at HIT; and the Hebrew M8 and M21 briefings and public release that carry the methods to Ministry, Authority and Noga staff and to operators. A trained specialist, an open national dataset and a better-equipped regulator outlast the grant.</w:t>
+      </w:r>
+    </w:p>
+    <w:p>
+      <w:pPr>
+        <w:widowControl w:val="0"/>
         <w:pStyle w:val="BodyText"/>
         <w:jc w:val="both"/>
       </w:pPr>
@@ -2576,6 +2727,9 @@
     <w:bookmarkStart w:id="44" w:name="work-plan"/>
     <w:p>
       <w:pPr>
+        <w:keepLines w:val="0"/>
+        <w:keepNext w:val="0"/>
+        <w:widowControl w:val="0"/>
         <w:pStyle w:val="Heading2"/>
         <w:pBdr>
           <w:bottom w:val="single" w:sz="6" w:space="2" w:color="C8C8C8"/>
@@ -2592,6 +2746,9 @@
     <w:bookmarkStart w:id="41" w:name="X667c3ec6dfb794f21fdd4a234ae848af0d17922"/>
     <w:p>
       <w:pPr>
+        <w:keepLines w:val="0"/>
+        <w:keepNext w:val="0"/>
+        <w:widowControl w:val="0"/>
         <w:pStyle w:val="Heading3"/>
         <w:jc w:val="left"/>
       </w:pPr>
@@ -2630,6 +2787,7 @@
           <w:tcPr/>
           <w:p>
             <w:pPr>
+              <w:widowControl w:val="0"/>
               <w:pStyle w:val="Compact"/>
               <w:jc w:val="both"/>
             </w:pPr>
@@ -2642,6 +2800,7 @@
           <w:tcPr/>
           <w:p>
             <w:pPr>
+              <w:widowControl w:val="0"/>
               <w:pStyle w:val="Compact"/>
               <w:jc w:val="both"/>
             </w:pPr>
@@ -2654,6 +2813,7 @@
           <w:tcPr/>
           <w:p>
             <w:pPr>
+              <w:widowControl w:val="0"/>
               <w:pStyle w:val="Compact"/>
               <w:jc w:val="both"/>
             </w:pPr>
@@ -2666,6 +2826,7 @@
           <w:tcPr/>
           <w:p>
             <w:pPr>
+              <w:widowControl w:val="0"/>
               <w:pStyle w:val="Compact"/>
               <w:jc w:val="both"/>
             </w:pPr>
@@ -2676,10 +2837,12 @@
         </w:tc>
       </w:tr>
       <w:tr>
-        <w:tc>
-          <w:tcPr/>
-          <w:p>
-            <w:pPr>
+        <w:trPr/>
+        <w:tc>
+          <w:tcPr/>
+          <w:p>
+            <w:pPr>
+              <w:widowControl w:val="0"/>
               <w:pStyle w:val="Compact"/>
               <w:jc w:val="both"/>
             </w:pPr>
@@ -2692,6 +2855,7 @@
           <w:tcPr/>
           <w:p>
             <w:pPr>
+              <w:widowControl w:val="0"/>
               <w:pStyle w:val="Compact"/>
               <w:jc w:val="both"/>
             </w:pPr>
@@ -2704,6 +2868,7 @@
           <w:tcPr/>
           <w:p>
             <w:pPr>
+              <w:widowControl w:val="0"/>
               <w:pStyle w:val="Compact"/>
               <w:jc w:val="both"/>
             </w:pPr>
@@ -2716,6 +2881,7 @@
           <w:tcPr/>
           <w:p>
             <w:pPr>
+              <w:widowControl w:val="0"/>
               <w:pStyle w:val="Compact"/>
               <w:jc w:val="both"/>
             </w:pPr>
@@ -2726,10 +2892,12 @@
         </w:tc>
       </w:tr>
       <w:tr>
-        <w:tc>
-          <w:tcPr/>
-          <w:p>
-            <w:pPr>
+        <w:trPr/>
+        <w:tc>
+          <w:tcPr/>
+          <w:p>
+            <w:pPr>
+              <w:widowControl w:val="0"/>
               <w:pStyle w:val="Compact"/>
               <w:jc w:val="both"/>
             </w:pPr>
@@ -2742,6 +2910,7 @@
           <w:tcPr/>
           <w:p>
             <w:pPr>
+              <w:widowControl w:val="0"/>
               <w:pStyle w:val="Compact"/>
               <w:jc w:val="both"/>
             </w:pPr>
@@ -2754,6 +2923,7 @@
           <w:tcPr/>
           <w:p>
             <w:pPr>
+              <w:widowControl w:val="0"/>
               <w:pStyle w:val="Compact"/>
               <w:jc w:val="both"/>
             </w:pPr>
@@ -2766,6 +2936,7 @@
           <w:tcPr/>
           <w:p>
             <w:pPr>
+              <w:widowControl w:val="0"/>
               <w:pStyle w:val="Compact"/>
               <w:jc w:val="both"/>
             </w:pPr>
@@ -2776,10 +2947,12 @@
         </w:tc>
       </w:tr>
       <w:tr>
-        <w:tc>
-          <w:tcPr/>
-          <w:p>
-            <w:pPr>
+        <w:trPr/>
+        <w:tc>
+          <w:tcPr/>
+          <w:p>
+            <w:pPr>
+              <w:widowControl w:val="0"/>
               <w:pStyle w:val="Compact"/>
               <w:jc w:val="both"/>
             </w:pPr>
@@ -2792,6 +2965,7 @@
           <w:tcPr/>
           <w:p>
             <w:pPr>
+              <w:widowControl w:val="0"/>
               <w:pStyle w:val="Compact"/>
               <w:jc w:val="both"/>
             </w:pPr>
@@ -2804,6 +2978,7 @@
           <w:tcPr/>
           <w:p>
             <w:pPr>
+              <w:widowControl w:val="0"/>
               <w:pStyle w:val="Compact"/>
               <w:jc w:val="both"/>
             </w:pPr>
@@ -2816,6 +2991,7 @@
           <w:tcPr/>
           <w:p>
             <w:pPr>
+              <w:widowControl w:val="0"/>
               <w:pStyle w:val="Compact"/>
               <w:jc w:val="both"/>
             </w:pPr>
@@ -2826,10 +3002,12 @@
         </w:tc>
       </w:tr>
       <w:tr>
-        <w:tc>
-          <w:tcPr/>
-          <w:p>
-            <w:pPr>
+        <w:trPr/>
+        <w:tc>
+          <w:tcPr/>
+          <w:p>
+            <w:pPr>
+              <w:widowControl w:val="0"/>
               <w:pStyle w:val="Compact"/>
               <w:jc w:val="both"/>
             </w:pPr>
@@ -2842,6 +3020,7 @@
           <w:tcPr/>
           <w:p>
             <w:pPr>
+              <w:widowControl w:val="0"/>
               <w:pStyle w:val="Compact"/>
               <w:jc w:val="both"/>
             </w:pPr>
@@ -2854,6 +3033,7 @@
           <w:tcPr/>
           <w:p>
             <w:pPr>
+              <w:widowControl w:val="0"/>
               <w:pStyle w:val="Compact"/>
               <w:jc w:val="both"/>
             </w:pPr>
@@ -2866,6 +3046,7 @@
           <w:tcPr/>
           <w:p>
             <w:pPr>
+              <w:widowControl w:val="0"/>
               <w:pStyle w:val="Compact"/>
               <w:jc w:val="both"/>
             </w:pPr>
@@ -2876,10 +3057,12 @@
         </w:tc>
       </w:tr>
       <w:tr>
-        <w:tc>
-          <w:tcPr/>
-          <w:p>
-            <w:pPr>
+        <w:trPr/>
+        <w:tc>
+          <w:tcPr/>
+          <w:p>
+            <w:pPr>
+              <w:widowControl w:val="0"/>
               <w:pStyle w:val="Compact"/>
               <w:jc w:val="both"/>
             </w:pPr>
@@ -2892,6 +3075,7 @@
           <w:tcPr/>
           <w:p>
             <w:pPr>
+              <w:widowControl w:val="0"/>
               <w:pStyle w:val="Compact"/>
               <w:jc w:val="both"/>
             </w:pPr>
@@ -2904,6 +3088,7 @@
           <w:tcPr/>
           <w:p>
             <w:pPr>
+              <w:widowControl w:val="0"/>
               <w:pStyle w:val="Compact"/>
               <w:jc w:val="both"/>
             </w:pPr>
@@ -2916,6 +3101,7 @@
           <w:tcPr/>
           <w:p>
             <w:pPr>
+              <w:widowControl w:val="0"/>
               <w:pStyle w:val="Compact"/>
               <w:jc w:val="both"/>
             </w:pPr>
@@ -2926,10 +3112,12 @@
         </w:tc>
       </w:tr>
       <w:tr>
-        <w:tc>
-          <w:tcPr/>
-          <w:p>
-            <w:pPr>
+        <w:trPr/>
+        <w:tc>
+          <w:tcPr/>
+          <w:p>
+            <w:pPr>
+              <w:widowControl w:val="0"/>
               <w:pStyle w:val="Compact"/>
               <w:jc w:val="both"/>
             </w:pPr>
@@ -2942,6 +3130,7 @@
           <w:tcPr/>
           <w:p>
             <w:pPr>
+              <w:widowControl w:val="0"/>
               <w:pStyle w:val="Compact"/>
               <w:jc w:val="both"/>
             </w:pPr>
@@ -2954,6 +3143,7 @@
           <w:tcPr/>
           <w:p>
             <w:pPr>
+              <w:widowControl w:val="0"/>
               <w:pStyle w:val="Compact"/>
               <w:jc w:val="both"/>
             </w:pPr>
@@ -2966,6 +3156,7 @@
           <w:tcPr/>
           <w:p>
             <w:pPr>
+              <w:widowControl w:val="0"/>
               <w:pStyle w:val="Compact"/>
               <w:jc w:val="both"/>
             </w:pPr>
@@ -2976,10 +3167,12 @@
         </w:tc>
       </w:tr>
       <w:tr>
-        <w:tc>
-          <w:tcPr/>
-          <w:p>
-            <w:pPr>
+        <w:trPr/>
+        <w:tc>
+          <w:tcPr/>
+          <w:p>
+            <w:pPr>
+              <w:widowControl w:val="0"/>
               <w:pStyle w:val="Compact"/>
               <w:jc w:val="both"/>
             </w:pPr>
@@ -2992,6 +3185,7 @@
           <w:tcPr/>
           <w:p>
             <w:pPr>
+              <w:widowControl w:val="0"/>
               <w:pStyle w:val="Compact"/>
               <w:jc w:val="both"/>
             </w:pPr>
@@ -3004,6 +3198,7 @@
           <w:tcPr/>
           <w:p>
             <w:pPr>
+              <w:widowControl w:val="0"/>
               <w:pStyle w:val="Compact"/>
               <w:jc w:val="both"/>
             </w:pPr>
@@ -3016,6 +3211,7 @@
           <w:tcPr/>
           <w:p>
             <w:pPr>
+              <w:widowControl w:val="0"/>
               <w:pStyle w:val="Compact"/>
               <w:jc w:val="both"/>
             </w:pPr>
@@ -3028,6 +3224,7 @@
     </w:tbl>
     <w:p>
       <w:pPr>
+        <w:widowControl w:val="0"/>
         <w:pStyle w:val="BodyText"/>
         <w:jc w:val="both"/>
       </w:pPr>
@@ -3039,6 +3236,9 @@
     <w:bookmarkStart w:id="42" w:name="budget-by-stage"/>
     <w:p>
       <w:pPr>
+        <w:keepLines w:val="0"/>
+        <w:keepNext w:val="0"/>
+        <w:widowControl w:val="0"/>
         <w:pStyle w:val="Heading3"/>
         <w:jc w:val="left"/>
       </w:pPr>
@@ -3077,6 +3277,7 @@
           <w:tcPr/>
           <w:p>
             <w:pPr>
+              <w:widowControl w:val="0"/>
               <w:pStyle w:val="Compact"/>
               <w:jc w:val="both"/>
             </w:pPr>
@@ -3089,6 +3290,7 @@
           <w:tcPr/>
           <w:p>
             <w:pPr>
+              <w:widowControl w:val="0"/>
               <w:pStyle w:val="Compact"/>
               <w:jc w:val="both"/>
             </w:pPr>
@@ -3101,6 +3303,7 @@
           <w:tcPr/>
           <w:p>
             <w:pPr>
+              <w:widowControl w:val="0"/>
               <w:pStyle w:val="Compact"/>
               <w:jc w:val="both"/>
             </w:pPr>
@@ -3113,6 +3316,7 @@
           <w:tcPr/>
           <w:p>
             <w:pPr>
+              <w:widowControl w:val="0"/>
               <w:pStyle w:val="Compact"/>
               <w:jc w:val="both"/>
             </w:pPr>
@@ -3123,10 +3327,12 @@
         </w:tc>
       </w:tr>
       <w:tr>
-        <w:tc>
-          <w:tcPr/>
-          <w:p>
-            <w:pPr>
+        <w:trPr/>
+        <w:tc>
+          <w:tcPr/>
+          <w:p>
+            <w:pPr>
+              <w:widowControl w:val="0"/>
               <w:pStyle w:val="Compact"/>
               <w:jc w:val="both"/>
             </w:pPr>
@@ -3139,6 +3345,7 @@
           <w:tcPr/>
           <w:p>
             <w:pPr>
+              <w:widowControl w:val="0"/>
               <w:pStyle w:val="Compact"/>
               <w:jc w:val="both"/>
             </w:pPr>
@@ -3151,6 +3358,7 @@
           <w:tcPr/>
           <w:p>
             <w:pPr>
+              <w:widowControl w:val="0"/>
               <w:pStyle w:val="Compact"/>
               <w:jc w:val="both"/>
             </w:pPr>
@@ -3163,6 +3371,7 @@
           <w:tcPr/>
           <w:p>
             <w:pPr>
+              <w:widowControl w:val="0"/>
               <w:pStyle w:val="Compact"/>
               <w:jc w:val="both"/>
             </w:pPr>
@@ -3173,10 +3382,12 @@
         </w:tc>
       </w:tr>
       <w:tr>
-        <w:tc>
-          <w:tcPr/>
-          <w:p>
-            <w:pPr>
+        <w:trPr/>
+        <w:tc>
+          <w:tcPr/>
+          <w:p>
+            <w:pPr>
+              <w:widowControl w:val="0"/>
               <w:pStyle w:val="Compact"/>
               <w:jc w:val="both"/>
             </w:pPr>
@@ -3189,6 +3400,7 @@
           <w:tcPr/>
           <w:p>
             <w:pPr>
+              <w:widowControl w:val="0"/>
               <w:pStyle w:val="Compact"/>
               <w:jc w:val="both"/>
             </w:pPr>
@@ -3201,6 +3413,7 @@
           <w:tcPr/>
           <w:p>
             <w:pPr>
+              <w:widowControl w:val="0"/>
               <w:pStyle w:val="Compact"/>
               <w:jc w:val="both"/>
             </w:pPr>
@@ -3213,6 +3426,7 @@
           <w:tcPr/>
           <w:p>
             <w:pPr>
+              <w:widowControl w:val="0"/>
               <w:pStyle w:val="Compact"/>
               <w:jc w:val="both"/>
             </w:pPr>
@@ -3223,10 +3437,12 @@
         </w:tc>
       </w:tr>
       <w:tr>
-        <w:tc>
-          <w:tcPr/>
-          <w:p>
-            <w:pPr>
+        <w:trPr/>
+        <w:tc>
+          <w:tcPr/>
+          <w:p>
+            <w:pPr>
+              <w:widowControl w:val="0"/>
               <w:pStyle w:val="Compact"/>
               <w:jc w:val="both"/>
             </w:pPr>
@@ -3239,6 +3455,7 @@
           <w:tcPr/>
           <w:p>
             <w:pPr>
+              <w:widowControl w:val="0"/>
               <w:pStyle w:val="Compact"/>
               <w:jc w:val="both"/>
             </w:pPr>
@@ -3251,6 +3468,7 @@
           <w:tcPr/>
           <w:p>
             <w:pPr>
+              <w:widowControl w:val="0"/>
               <w:pStyle w:val="Compact"/>
               <w:jc w:val="both"/>
             </w:pPr>
@@ -3263,6 +3481,7 @@
           <w:tcPr/>
           <w:p>
             <w:pPr>
+              <w:widowControl w:val="0"/>
               <w:pStyle w:val="Compact"/>
               <w:jc w:val="both"/>
             </w:pPr>
@@ -3273,10 +3492,12 @@
         </w:tc>
       </w:tr>
       <w:tr>
-        <w:tc>
-          <w:tcPr/>
-          <w:p>
-            <w:pPr>
+        <w:trPr/>
+        <w:tc>
+          <w:tcPr/>
+          <w:p>
+            <w:pPr>
+              <w:widowControl w:val="0"/>
               <w:pStyle w:val="Compact"/>
               <w:jc w:val="both"/>
             </w:pPr>
@@ -3289,6 +3510,7 @@
           <w:tcPr/>
           <w:p>
             <w:pPr>
+              <w:widowControl w:val="0"/>
               <w:pStyle w:val="Compact"/>
               <w:jc w:val="both"/>
             </w:pPr>
@@ -3301,6 +3523,7 @@
           <w:tcPr/>
           <w:p>
             <w:pPr>
+              <w:widowControl w:val="0"/>
               <w:pStyle w:val="Compact"/>
               <w:jc w:val="both"/>
             </w:pPr>
@@ -3313,6 +3536,7 @@
           <w:tcPr/>
           <w:p>
             <w:pPr>
+              <w:widowControl w:val="0"/>
               <w:pStyle w:val="Compact"/>
               <w:jc w:val="both"/>
             </w:pPr>
@@ -3323,12 +3547,14 @@
         </w:tc>
       </w:tr>
       <w:tr>
+        <w:trPr/>
         <w:tc>
           <w:tcPr>
             <w:gridSpan w:val="2"/>
           </w:tcPr>
           <w:p>
             <w:pPr>
+              <w:widowControl w:val="0"/>
               <w:pStyle w:val="Compact"/>
               <w:jc w:val="both"/>
             </w:pPr>
@@ -3345,6 +3571,7 @@
           <w:tcPr/>
           <w:p>
             <w:pPr>
+              <w:widowControl w:val="0"/>
               <w:pStyle w:val="Compact"/>
               <w:jc w:val="both"/>
             </w:pPr>
@@ -3361,6 +3588,7 @@
           <w:tcPr/>
           <w:p>
             <w:pPr>
+              <w:widowControl w:val="0"/>
               <w:pStyle w:val="Compact"/>
               <w:jc w:val="both"/>
             </w:pPr>
@@ -3375,6 +3603,9 @@
     <w:bookmarkStart w:id="43" w:name="risks-and-mitigation"/>
     <w:p>
       <w:pPr>
+        <w:keepLines w:val="0"/>
+        <w:keepNext w:val="0"/>
+        <w:widowControl w:val="0"/>
         <w:pStyle w:val="Heading3"/>
         <w:jc w:val="left"/>
       </w:pPr>
@@ -3412,6 +3643,7 @@
           <w:tcPr/>
           <w:p>
             <w:pPr>
+              <w:widowControl w:val="0"/>
               <w:pStyle w:val="Compact"/>
               <w:jc w:val="both"/>
             </w:pPr>
@@ -3424,6 +3656,7 @@
           <w:tcPr/>
           <w:p>
             <w:pPr>
+              <w:widowControl w:val="0"/>
               <w:pStyle w:val="Compact"/>
               <w:jc w:val="both"/>
             </w:pPr>
@@ -3436,6 +3669,7 @@
           <w:tcPr/>
           <w:p>
             <w:pPr>
+              <w:widowControl w:val="0"/>
               <w:pStyle w:val="Compact"/>
               <w:jc w:val="both"/>
             </w:pPr>
@@ -3446,10 +3680,12 @@
         </w:tc>
       </w:tr>
       <w:tr>
-        <w:tc>
-          <w:tcPr/>
-          <w:p>
-            <w:pPr>
+        <w:trPr/>
+        <w:tc>
+          <w:tcPr/>
+          <w:p>
+            <w:pPr>
+              <w:widowControl w:val="0"/>
               <w:pStyle w:val="Compact"/>
               <w:jc w:val="both"/>
             </w:pPr>
@@ -3462,6 +3698,7 @@
           <w:tcPr/>
           <w:p>
             <w:pPr>
+              <w:widowControl w:val="0"/>
               <w:pStyle w:val="Compact"/>
               <w:jc w:val="both"/>
             </w:pPr>
@@ -3474,6 +3711,7 @@
           <w:tcPr/>
           <w:p>
             <w:pPr>
+              <w:widowControl w:val="0"/>
               <w:pStyle w:val="Compact"/>
               <w:jc w:val="both"/>
             </w:pPr>
@@ -3484,10 +3722,12 @@
         </w:tc>
       </w:tr>
       <w:tr>
-        <w:tc>
-          <w:tcPr/>
-          <w:p>
-            <w:pPr>
+        <w:trPr/>
+        <w:tc>
+          <w:tcPr/>
+          <w:p>
+            <w:pPr>
+              <w:widowControl w:val="0"/>
               <w:pStyle w:val="Compact"/>
               <w:jc w:val="both"/>
             </w:pPr>
@@ -3500,6 +3740,7 @@
           <w:tcPr/>
           <w:p>
             <w:pPr>
+              <w:widowControl w:val="0"/>
               <w:pStyle w:val="Compact"/>
               <w:jc w:val="both"/>
             </w:pPr>
@@ -3512,6 +3753,7 @@
           <w:tcPr/>
           <w:p>
             <w:pPr>
+              <w:widowControl w:val="0"/>
               <w:pStyle w:val="Compact"/>
               <w:jc w:val="both"/>
             </w:pPr>
@@ -3522,10 +3764,12 @@
         </w:tc>
       </w:tr>
       <w:tr>
-        <w:tc>
-          <w:tcPr/>
-          <w:p>
-            <w:pPr>
+        <w:trPr/>
+        <w:tc>
+          <w:tcPr/>
+          <w:p>
+            <w:pPr>
+              <w:widowControl w:val="0"/>
               <w:pStyle w:val="Compact"/>
               <w:jc w:val="both"/>
             </w:pPr>
@@ -3538,6 +3782,7 @@
           <w:tcPr/>
           <w:p>
             <w:pPr>
+              <w:widowControl w:val="0"/>
               <w:pStyle w:val="Compact"/>
               <w:jc w:val="both"/>
             </w:pPr>
@@ -3550,6 +3795,7 @@
           <w:tcPr/>
           <w:p>
             <w:pPr>
+              <w:widowControl w:val="0"/>
               <w:pStyle w:val="Compact"/>
               <w:jc w:val="both"/>
             </w:pPr>
@@ -3560,10 +3806,12 @@
         </w:tc>
       </w:tr>
       <w:tr>
-        <w:tc>
-          <w:tcPr/>
-          <w:p>
-            <w:pPr>
+        <w:trPr/>
+        <w:tc>
+          <w:tcPr/>
+          <w:p>
+            <w:pPr>
+              <w:widowControl w:val="0"/>
               <w:pStyle w:val="Compact"/>
               <w:jc w:val="both"/>
             </w:pPr>
@@ -3576,6 +3824,7 @@
           <w:tcPr/>
           <w:p>
             <w:pPr>
+              <w:widowControl w:val="0"/>
               <w:pStyle w:val="Compact"/>
               <w:jc w:val="both"/>
             </w:pPr>
@@ -3588,6 +3837,7 @@
           <w:tcPr/>
           <w:p>
             <w:pPr>
+              <w:widowControl w:val="0"/>
               <w:pStyle w:val="Compact"/>
               <w:jc w:val="both"/>
             </w:pPr>
@@ -3603,6 +3853,9 @@
     <w:bookmarkStart w:id="45" w:name="the-applicant"/>
     <w:p>
       <w:pPr>
+        <w:keepLines w:val="0"/>
+        <w:keepNext w:val="0"/>
+        <w:widowControl w:val="0"/>
         <w:pStyle w:val="Heading2"/>
         <w:pBdr>
           <w:bottom w:val="single" w:sz="6" w:space="2" w:color="C8C8C8"/>
@@ -3618,6 +3871,7 @@
     </w:p>
     <w:p>
       <w:pPr>
+        <w:widowControl w:val="0"/>
         <w:pStyle w:val="FirstParagraph"/>
         <w:jc w:val="both"/>
       </w:pPr>
@@ -3637,6 +3891,7 @@
     </w:p>
     <w:p>
       <w:pPr>
+        <w:widowControl w:val="0"/>
         <w:pStyle w:val="BodyText"/>
         <w:jc w:val="both"/>
       </w:pPr>
@@ -3656,6 +3911,7 @@
     </w:p>
     <w:p>
       <w:pPr>
+        <w:widowControl w:val="0"/>
         <w:pStyle w:val="BodyText"/>
         <w:jc w:val="both"/>
       </w:pPr>
@@ -3675,6 +3931,7 @@
     </w:p>
     <w:p>
       <w:pPr>
+        <w:widowControl w:val="0"/>
         <w:pStyle w:val="BodyText"/>
         <w:jc w:val="both"/>
       </w:pPr>
@@ -3694,6 +3951,7 @@
     </w:p>
     <w:p>
       <w:pPr>
+        <w:widowControl w:val="0"/>
         <w:pStyle w:val="BodyText"/>
         <w:jc w:val="both"/>
       </w:pPr>
@@ -3715,6 +3973,9 @@
     <w:bookmarkStart w:id="46" w:name="funding"/>
     <w:p>
       <w:pPr>
+        <w:keepLines w:val="0"/>
+        <w:keepNext w:val="0"/>
+        <w:widowControl w:val="0"/>
         <w:pStyle w:val="Heading2"/>
         <w:pBdr>
           <w:bottom w:val="single" w:sz="6" w:space="2" w:color="C8C8C8"/>
@@ -3730,6 +3991,7 @@
     </w:p>
     <w:p>
       <w:pPr>
+        <w:widowControl w:val="0"/>
         <w:pStyle w:val="FirstParagraph"/>
         <w:jc w:val="both"/>
       </w:pPr>
@@ -3741,6 +4003,9 @@
     <w:bookmarkStart w:id="52" w:name="bibliography"/>
     <w:p>
       <w:pPr>
+        <w:keepLines w:val="0"/>
+        <w:keepNext w:val="0"/>
+        <w:widowControl w:val="0"/>
         <w:pStyle w:val="Heading2"/>
         <w:pBdr>
           <w:bottom w:val="single" w:sz="6" w:space="2" w:color="C8C8C8"/>
@@ -3756,6 +4021,7 @@
     </w:p>
     <w:p>
       <w:pPr>
+        <w:widowControl w:val="0"/>
         <w:pStyle w:val="Compact"/>
         <w:numPr>
           <w:ilvl w:val="0"/>
@@ -3802,6 +4068,7 @@
     </w:p>
     <w:p>
       <w:pPr>
+        <w:widowControl w:val="0"/>
         <w:pStyle w:val="Compact"/>
         <w:numPr>
           <w:ilvl w:val="0"/>
@@ -3831,6 +4098,7 @@
     </w:p>
     <w:p>
       <w:pPr>
+        <w:widowControl w:val="0"/>
         <w:pStyle w:val="Compact"/>
         <w:numPr>
           <w:ilvl w:val="0"/>
@@ -3860,6 +4128,7 @@
     </w:p>
     <w:p>
       <w:pPr>
+        <w:widowControl w:val="0"/>
         <w:pStyle w:val="Compact"/>
         <w:numPr>
           <w:ilvl w:val="0"/>
@@ -3889,6 +4158,7 @@
     </w:p>
     <w:p>
       <w:pPr>
+        <w:widowControl w:val="0"/>
         <w:pStyle w:val="Compact"/>
         <w:numPr>
           <w:ilvl w:val="0"/>
@@ -3918,6 +4188,7 @@
     </w:p>
     <w:p>
       <w:pPr>
+        <w:widowControl w:val="0"/>
         <w:pStyle w:val="Compact"/>
         <w:numPr>
           <w:ilvl w:val="0"/>
@@ -3947,6 +4218,7 @@
     </w:p>
     <w:p>
       <w:pPr>
+        <w:widowControl w:val="0"/>
         <w:pStyle w:val="Compact"/>
         <w:numPr>
           <w:ilvl w:val="0"/>
@@ -3976,6 +4248,7 @@
     </w:p>
     <w:p>
       <w:pPr>
+        <w:widowControl w:val="0"/>
         <w:pStyle w:val="Compact"/>
         <w:numPr>
           <w:ilvl w:val="0"/>
@@ -4005,6 +4278,7 @@
     </w:p>
     <w:p>
       <w:pPr>
+        <w:widowControl w:val="0"/>
         <w:pStyle w:val="Compact"/>
         <w:numPr>
           <w:ilvl w:val="0"/>
@@ -4034,6 +4308,7 @@
     </w:p>
     <w:p>
       <w:pPr>
+        <w:widowControl w:val="0"/>
         <w:pStyle w:val="Compact"/>
         <w:numPr>
           <w:ilvl w:val="0"/>
@@ -4063,6 +4338,7 @@
     </w:p>
     <w:p>
       <w:pPr>
+        <w:widowControl w:val="0"/>
         <w:pStyle w:val="Compact"/>
         <w:numPr>
           <w:ilvl w:val="0"/>
@@ -4092,6 +4368,7 @@
     </w:p>
     <w:p>
       <w:pPr>
+        <w:widowControl w:val="0"/>
         <w:pStyle w:val="Compact"/>
         <w:numPr>
           <w:ilvl w:val="0"/>
@@ -4121,6 +4398,7 @@
     </w:p>
     <w:p>
       <w:pPr>
+        <w:widowControl w:val="0"/>
         <w:pStyle w:val="Compact"/>
         <w:numPr>
           <w:ilvl w:val="0"/>
@@ -4150,6 +4428,7 @@
     </w:p>
     <w:p>
       <w:pPr>
+        <w:widowControl w:val="0"/>
         <w:pStyle w:val="Compact"/>
         <w:numPr>
           <w:ilvl w:val="0"/>
@@ -4179,6 +4458,7 @@
     </w:p>
     <w:p>
       <w:pPr>
+        <w:widowControl w:val="0"/>
         <w:pStyle w:val="Compact"/>
         <w:numPr>
           <w:ilvl w:val="0"/>
@@ -4208,6 +4488,7 @@
     </w:p>
     <w:p>
       <w:pPr>
+        <w:widowControl w:val="0"/>
         <w:pStyle w:val="Compact"/>
         <w:numPr>
           <w:ilvl w:val="0"/>
@@ -4237,6 +4518,7 @@
     </w:p>
     <w:p>
       <w:pPr>
+        <w:widowControl w:val="0"/>
         <w:pStyle w:val="Compact"/>
         <w:numPr>
           <w:ilvl w:val="0"/>
@@ -4266,6 +4548,7 @@
     </w:p>
     <w:p>
       <w:pPr>
+        <w:widowControl w:val="0"/>
         <w:pStyle w:val="Compact"/>
         <w:numPr>
           <w:ilvl w:val="0"/>
@@ -4295,6 +4578,7 @@
     </w:p>
     <w:p>
       <w:pPr>
+        <w:widowControl w:val="0"/>
         <w:pStyle w:val="Compact"/>
         <w:numPr>
           <w:ilvl w:val="0"/>
@@ -4308,6 +4592,7 @@
     </w:p>
     <w:p>
       <w:pPr>
+        <w:widowControl w:val="0"/>
         <w:pStyle w:val="Compact"/>
         <w:numPr>
           <w:ilvl w:val="0"/>
@@ -4351,6 +4636,7 @@
     </w:p>
     <w:p>
       <w:pPr>
+        <w:widowControl w:val="0"/>
         <w:pStyle w:val="Compact"/>
         <w:numPr>
           <w:ilvl w:val="0"/>
@@ -4394,6 +4680,7 @@
     </w:p>
     <w:p>
       <w:pPr>
+        <w:widowControl w:val="0"/>
         <w:pStyle w:val="Compact"/>
         <w:numPr>
           <w:ilvl w:val="0"/>
@@ -4423,6 +4710,7 @@
     </w:p>
     <w:p>
       <w:pPr>
+        <w:widowControl w:val="0"/>
         <w:pStyle w:val="Compact"/>
         <w:numPr>
           <w:ilvl w:val="0"/>
@@ -4452,6 +4740,7 @@
     </w:p>
     <w:p>
       <w:pPr>
+        <w:widowControl w:val="0"/>
         <w:pStyle w:val="Compact"/>
         <w:numPr>
           <w:ilvl w:val="0"/>
@@ -4495,6 +4784,7 @@
     </w:p>
     <w:p>
       <w:pPr>
+        <w:widowControl w:val="0"/>
         <w:pStyle w:val="Compact"/>
         <w:numPr>
           <w:ilvl w:val="0"/>
@@ -4540,6 +4830,9 @@
     <w:bookmarkStart w:id="62" w:name="X5d5bc83c2eef3c669b01ea2354df53c4eb22d2f"/>
     <w:p>
       <w:pPr>
+        <w:keepLines w:val="0"/>
+        <w:keepNext w:val="0"/>
+        <w:widowControl w:val="0"/>
         <w:pStyle w:val="Heading2"/>
         <w:pBdr>
           <w:bottom w:val="single" w:sz="6" w:space="2" w:color="C8C8C8"/>
@@ -4555,6 +4848,7 @@
     </w:p>
     <w:p>
       <w:pPr>
+        <w:widowControl w:val="0"/>
         <w:pStyle w:val="FirstParagraph"/>
         <w:jc w:val="both"/>
       </w:pPr>
@@ -4570,6 +4864,7 @@
     </w:p>
     <w:p>
       <w:pPr>
+        <w:widowControl w:val="0"/>
         <w:pStyle w:val="BodyText"/>
         <w:jc w:val="both"/>
       </w:pPr>
@@ -4618,6 +4913,7 @@
     </w:p>
     <w:p>
       <w:pPr>
+        <w:widowControl w:val="0"/>
         <w:pStyle w:val="BodyText"/>
         <w:jc w:val="both"/>
       </w:pPr>
@@ -4758,6 +5054,7 @@
     </w:p>
     <w:p>
       <w:pPr>
+        <w:widowControl w:val="0"/>
         <w:pStyle w:val="BodyText"/>
         <w:jc w:val="both"/>
       </w:pPr>
@@ -4806,6 +5103,7 @@
     </w:p>
     <w:p>
       <w:pPr>
+        <w:widowControl w:val="0"/>
         <w:pStyle w:val="BodyText"/>
         <w:jc w:val="both"/>
       </w:pPr>
@@ -4845,6 +5143,7 @@
     </w:p>
     <w:p>
       <w:pPr>
+        <w:widowControl w:val="0"/>
         <w:pStyle w:val="BodyText"/>
         <w:jc w:val="both"/>
       </w:pPr>
@@ -4893,6 +5192,7 @@
     </w:p>
     <w:p>
       <w:pPr>
+        <w:widowControl w:val="0"/>
         <w:pStyle w:val="BodyText"/>
         <w:jc w:val="both"/>
       </w:pPr>
@@ -4928,6 +5228,9 @@
     <w:bookmarkStart w:id="63" w:name="Xb70b95b8b38ded80618834689cadeac3dd55d32"/>
     <w:p>
       <w:pPr>
+        <w:keepLines w:val="0"/>
+        <w:keepNext w:val="0"/>
+        <w:widowControl w:val="0"/>
         <w:pStyle w:val="Heading2"/>
         <w:pBdr>
           <w:bottom w:val="single" w:sz="6" w:space="2" w:color="C8C8C8"/>
@@ -4943,6 +5246,7 @@
     </w:p>
     <w:p>
       <w:pPr>
+        <w:widowControl w:val="0"/>
         <w:pStyle w:val="FirstParagraph"/>
         <w:jc w:val="both"/>
       </w:pPr>
@@ -4977,6 +5281,7 @@
           <w:tcPr/>
           <w:p>
             <w:pPr>
+              <w:widowControl w:val="0"/>
               <w:pStyle w:val="Compact"/>
               <w:jc w:val="both"/>
             </w:pPr>
@@ -4989,6 +5294,7 @@
           <w:tcPr/>
           <w:p>
             <w:pPr>
+              <w:widowControl w:val="0"/>
               <w:pStyle w:val="Compact"/>
               <w:jc w:val="both"/>
             </w:pPr>
@@ -5001,6 +5307,7 @@
           <w:tcPr/>
           <w:p>
             <w:pPr>
+              <w:widowControl w:val="0"/>
               <w:pStyle w:val="Compact"/>
               <w:jc w:val="both"/>
             </w:pPr>
@@ -5011,10 +5318,12 @@
         </w:tc>
       </w:tr>
       <w:tr>
-        <w:tc>
-          <w:tcPr/>
-          <w:p>
-            <w:pPr>
+        <w:trPr/>
+        <w:tc>
+          <w:tcPr/>
+          <w:p>
+            <w:pPr>
+              <w:widowControl w:val="0"/>
               <w:pStyle w:val="Compact"/>
               <w:jc w:val="both"/>
             </w:pPr>
@@ -5031,6 +5340,7 @@
           <w:tcPr/>
           <w:p>
             <w:pPr>
+              <w:widowControl w:val="0"/>
               <w:pStyle w:val="Compact"/>
               <w:jc w:val="both"/>
             </w:pPr>
@@ -5043,6 +5353,7 @@
           <w:tcPr/>
           <w:p>
             <w:pPr>
+              <w:widowControl w:val="0"/>
               <w:pStyle w:val="Compact"/>
               <w:jc w:val="both"/>
             </w:pPr>
@@ -5053,10 +5364,12 @@
         </w:tc>
       </w:tr>
       <w:tr>
-        <w:tc>
-          <w:tcPr/>
-          <w:p>
-            <w:pPr>
+        <w:trPr/>
+        <w:tc>
+          <w:tcPr/>
+          <w:p>
+            <w:pPr>
+              <w:widowControl w:val="0"/>
               <w:pStyle w:val="Compact"/>
               <w:jc w:val="both"/>
             </w:pPr>
@@ -5073,6 +5386,7 @@
           <w:tcPr/>
           <w:p>
             <w:pPr>
+              <w:widowControl w:val="0"/>
               <w:pStyle w:val="Compact"/>
               <w:jc w:val="both"/>
             </w:pPr>
@@ -5085,6 +5399,7 @@
           <w:tcPr/>
           <w:p>
             <w:pPr>
+              <w:widowControl w:val="0"/>
               <w:pStyle w:val="Compact"/>
               <w:jc w:val="both"/>
             </w:pPr>
@@ -5095,10 +5410,12 @@
         </w:tc>
       </w:tr>
       <w:tr>
-        <w:tc>
-          <w:tcPr/>
-          <w:p>
-            <w:pPr>
+        <w:trPr/>
+        <w:tc>
+          <w:tcPr/>
+          <w:p>
+            <w:pPr>
+              <w:widowControl w:val="0"/>
               <w:pStyle w:val="Compact"/>
               <w:jc w:val="both"/>
             </w:pPr>
@@ -5115,6 +5432,7 @@
           <w:tcPr/>
           <w:p>
             <w:pPr>
+              <w:widowControl w:val="0"/>
               <w:pStyle w:val="Compact"/>
               <w:jc w:val="both"/>
             </w:pPr>
@@ -5127,6 +5445,7 @@
           <w:tcPr/>
           <w:p>
             <w:pPr>
+              <w:widowControl w:val="0"/>
               <w:pStyle w:val="Compact"/>
               <w:jc w:val="both"/>
             </w:pPr>
@@ -5137,10 +5456,12 @@
         </w:tc>
       </w:tr>
       <w:tr>
-        <w:tc>
-          <w:tcPr/>
-          <w:p>
-            <w:pPr>
+        <w:trPr/>
+        <w:tc>
+          <w:tcPr/>
+          <w:p>
+            <w:pPr>
+              <w:widowControl w:val="0"/>
               <w:pStyle w:val="Compact"/>
               <w:jc w:val="both"/>
             </w:pPr>
@@ -5157,6 +5478,7 @@
           <w:tcPr/>
           <w:p>
             <w:pPr>
+              <w:widowControl w:val="0"/>
               <w:pStyle w:val="Compact"/>
               <w:jc w:val="both"/>
             </w:pPr>
@@ -5169,6 +5491,7 @@
           <w:tcPr/>
           <w:p>
             <w:pPr>
+              <w:widowControl w:val="0"/>
               <w:pStyle w:val="Compact"/>
               <w:jc w:val="both"/>
             </w:pPr>
@@ -5179,10 +5502,12 @@
         </w:tc>
       </w:tr>
       <w:tr>
-        <w:tc>
-          <w:tcPr/>
-          <w:p>
-            <w:pPr>
+        <w:trPr/>
+        <w:tc>
+          <w:tcPr/>
+          <w:p>
+            <w:pPr>
+              <w:widowControl w:val="0"/>
               <w:pStyle w:val="Compact"/>
               <w:jc w:val="both"/>
             </w:pPr>
@@ -5199,6 +5524,7 @@
           <w:tcPr/>
           <w:p>
             <w:pPr>
+              <w:widowControl w:val="0"/>
               <w:pStyle w:val="Compact"/>
               <w:jc w:val="both"/>
             </w:pPr>
@@ -5211,6 +5537,7 @@
           <w:tcPr/>
           <w:p>
             <w:pPr>
+              <w:widowControl w:val="0"/>
               <w:pStyle w:val="Compact"/>
               <w:jc w:val="both"/>
             </w:pPr>
@@ -5223,6 +5550,7 @@
     </w:tbl>
     <w:p>
       <w:pPr>
+        <w:widowControl w:val="0"/>
         <w:pStyle w:val="BodyText"/>
         <w:jc w:val="both"/>
       </w:pPr>

</xml_diff>

<commit_message>
Sync: Word doc core now 10 pages in real Word (table typography matches PDF)
Co-Authored-By: Claude Opus 4.8 <noreply@anthropic.com>
</commit_message>
<xml_diff>
--- a/JouleFlex-proposal-2026-09-06.docx
+++ b/JouleFlex-proposal-2026-09-06.docx
@@ -282,11 +282,16 @@
           <w:tcPr/>
           <w:p>
             <w:pPr>
-              <w:widowControl w:val="0"/>
-              <w:pStyle w:val="Compact"/>
-              <w:jc w:val="both"/>
-            </w:pPr>
-            <w:r>
+              <w:spacing w:line="317" w:lineRule="auto" w:before="20" w:after="20"/>
+              <w:widowControl w:val="0"/>
+              <w:pStyle w:val="Compact"/>
+              <w:jc w:val="both"/>
+            </w:pPr>
+            <w:r>
+              <w:rPr>
+                <w:sz w:val="21"/>
+                <w:szCs w:val="21"/>
+              </w:rPr>
               <w:t xml:space="preserve">Term</w:t>
             </w:r>
           </w:p>
@@ -295,11 +300,16 @@
           <w:tcPr/>
           <w:p>
             <w:pPr>
-              <w:widowControl w:val="0"/>
-              <w:pStyle w:val="Compact"/>
-              <w:jc w:val="both"/>
-            </w:pPr>
-            <w:r>
+              <w:spacing w:line="317" w:lineRule="auto" w:before="20" w:after="20"/>
+              <w:widowControl w:val="0"/>
+              <w:pStyle w:val="Compact"/>
+              <w:jc w:val="both"/>
+            </w:pPr>
+            <w:r>
+              <w:rPr>
+                <w:sz w:val="21"/>
+                <w:szCs w:val="21"/>
+              </w:rPr>
               <w:t xml:space="preserve">Meaning</w:t>
             </w:r>
           </w:p>
@@ -311,11 +321,16 @@
           <w:tcPr/>
           <w:p>
             <w:pPr>
-              <w:widowControl w:val="0"/>
-              <w:pStyle w:val="Compact"/>
-              <w:jc w:val="both"/>
-            </w:pPr>
-            <w:r>
+              <w:spacing w:line="317" w:lineRule="auto" w:before="20" w:after="20"/>
+              <w:widowControl w:val="0"/>
+              <w:pStyle w:val="Compact"/>
+              <w:jc w:val="both"/>
+            </w:pPr>
+            <w:r>
+              <w:rPr>
+                <w:sz w:val="21"/>
+                <w:szCs w:val="21"/>
+              </w:rPr>
               <w:t xml:space="preserve">Power</w:t>
             </w:r>
           </w:p>
@@ -324,11 +339,16 @@
           <w:tcPr/>
           <w:p>
             <w:pPr>
-              <w:widowControl w:val="0"/>
-              <w:pStyle w:val="Compact"/>
-              <w:jc w:val="both"/>
-            </w:pPr>
-            <w:r>
+              <w:spacing w:line="317" w:lineRule="auto" w:before="20" w:after="20"/>
+              <w:widowControl w:val="0"/>
+              <w:pStyle w:val="Compact"/>
+              <w:jc w:val="both"/>
+            </w:pPr>
+            <w:r>
+              <w:rPr>
+                <w:sz w:val="21"/>
+                <w:szCs w:val="21"/>
+              </w:rPr>
               <w:t xml:space="preserve">How fast electricity is drawn at a given moment; watts (W) or megawatts (MW). The grid connection is sized by peak power.</w:t>
             </w:r>
           </w:p>
@@ -340,11 +360,16 @@
           <w:tcPr/>
           <w:p>
             <w:pPr>
-              <w:widowControl w:val="0"/>
-              <w:pStyle w:val="Compact"/>
-              <w:jc w:val="both"/>
-            </w:pPr>
-            <w:r>
+              <w:spacing w:line="317" w:lineRule="auto" w:before="20" w:after="20"/>
+              <w:widowControl w:val="0"/>
+              <w:pStyle w:val="Compact"/>
+              <w:jc w:val="both"/>
+            </w:pPr>
+            <w:r>
+              <w:rPr>
+                <w:sz w:val="21"/>
+                <w:szCs w:val="21"/>
+              </w:rPr>
               <w:t xml:space="preserve">Energy</w:t>
             </w:r>
           </w:p>
@@ -353,11 +378,16 @@
           <w:tcPr/>
           <w:p>
             <w:pPr>
-              <w:widowControl w:val="0"/>
-              <w:pStyle w:val="Compact"/>
-              <w:jc w:val="both"/>
-            </w:pPr>
-            <w:r>
+              <w:spacing w:line="317" w:lineRule="auto" w:before="20" w:after="20"/>
+              <w:widowControl w:val="0"/>
+              <w:pStyle w:val="Compact"/>
+              <w:jc w:val="both"/>
+            </w:pPr>
+            <w:r>
+              <w:rPr>
+                <w:sz w:val="21"/>
+                <w:szCs w:val="21"/>
+              </w:rPr>
               <w:t xml:space="preserve">The total electricity consumed: power × time; joules or kilowatt-hours. The bill and the carbon footprint are set by energy.</w:t>
             </w:r>
           </w:p>
@@ -369,11 +399,16 @@
           <w:tcPr/>
           <w:p>
             <w:pPr>
-              <w:widowControl w:val="0"/>
-              <w:pStyle w:val="Compact"/>
-              <w:jc w:val="both"/>
-            </w:pPr>
-            <w:r>
+              <w:spacing w:line="317" w:lineRule="auto" w:before="20" w:after="20"/>
+              <w:widowControl w:val="0"/>
+              <w:pStyle w:val="Compact"/>
+              <w:jc w:val="both"/>
+            </w:pPr>
+            <w:r>
+              <w:rPr>
+                <w:sz w:val="21"/>
+                <w:szCs w:val="21"/>
+              </w:rPr>
               <w:t xml:space="preserve">Power cap</w:t>
             </w:r>
           </w:p>
@@ -382,11 +417,16 @@
           <w:tcPr/>
           <w:p>
             <w:pPr>
-              <w:widowControl w:val="0"/>
-              <w:pStyle w:val="Compact"/>
-              <w:jc w:val="both"/>
-            </w:pPr>
-            <w:r>
+              <w:spacing w:line="317" w:lineRule="auto" w:before="20" w:after="20"/>
+              <w:widowControl w:val="0"/>
+              <w:pStyle w:val="Compact"/>
+              <w:jc w:val="both"/>
+            </w:pPr>
+            <w:r>
+              <w:rPr>
+                <w:sz w:val="21"/>
+                <w:szCs w:val="21"/>
+              </w:rPr>
               <w:t xml:space="preserve">A software limit on a GPU's power draw. Set with one command; takes effect in ~0.2 seconds. The control knob of this project.</w:t>
             </w:r>
           </w:p>
@@ -398,11 +438,16 @@
           <w:tcPr/>
           <w:p>
             <w:pPr>
-              <w:widowControl w:val="0"/>
-              <w:pStyle w:val="Compact"/>
-              <w:jc w:val="both"/>
-            </w:pPr>
-            <w:r>
+              <w:spacing w:line="317" w:lineRule="auto" w:before="20" w:after="20"/>
+              <w:widowControl w:val="0"/>
+              <w:pStyle w:val="Compact"/>
+              <w:jc w:val="both"/>
+            </w:pPr>
+            <w:r>
+              <w:rPr>
+                <w:sz w:val="21"/>
+                <w:szCs w:val="21"/>
+              </w:rPr>
               <w:t xml:space="preserve">TDP</w:t>
             </w:r>
           </w:p>
@@ -411,11 +456,16 @@
           <w:tcPr/>
           <w:p>
             <w:pPr>
-              <w:widowControl w:val="0"/>
-              <w:pStyle w:val="Compact"/>
-              <w:jc w:val="both"/>
-            </w:pPr>
-            <w:r>
+              <w:spacing w:line="317" w:lineRule="auto" w:before="20" w:after="20"/>
+              <w:widowControl w:val="0"/>
+              <w:pStyle w:val="Compact"/>
+              <w:jc w:val="both"/>
+            </w:pPr>
+            <w:r>
+              <w:rPr>
+                <w:sz w:val="21"/>
+                <w:szCs w:val="21"/>
+              </w:rPr>
               <w:t xml:space="preserve">A GPU's full rated power. Running at TDP is today's default.</w:t>
             </w:r>
           </w:p>
@@ -427,11 +477,16 @@
           <w:tcPr/>
           <w:p>
             <w:pPr>
-              <w:widowControl w:val="0"/>
-              <w:pStyle w:val="Compact"/>
-              <w:jc w:val="both"/>
-            </w:pPr>
-            <w:r>
+              <w:spacing w:line="317" w:lineRule="auto" w:before="20" w:after="20"/>
+              <w:widowControl w:val="0"/>
+              <w:pStyle w:val="Compact"/>
+              <w:jc w:val="both"/>
+            </w:pPr>
+            <w:r>
+              <w:rPr>
+                <w:sz w:val="21"/>
+                <w:szCs w:val="21"/>
+              </w:rPr>
               <w:t xml:space="preserve">Joule Point (JP)</w:t>
             </w:r>
           </w:p>
@@ -440,11 +495,16 @@
           <w:tcPr/>
           <w:p>
             <w:pPr>
-              <w:widowControl w:val="0"/>
-              <w:pStyle w:val="Compact"/>
-              <w:jc w:val="both"/>
-            </w:pPr>
-            <w:r>
+              <w:spacing w:line="317" w:lineRule="auto" w:before="20" w:after="20"/>
+              <w:widowControl w:val="0"/>
+              <w:pStyle w:val="Compact"/>
+              <w:jc w:val="both"/>
+            </w:pPr>
+            <w:r>
+              <w:rPr>
+                <w:sz w:val="21"/>
+                <w:szCs w:val="21"/>
+              </w:rPr>
               <w:t xml:space="preserve">The power cap at which energy per task is lowest for a given card; measured at 43–46% of TDP on large GPUs.</w:t>
             </w:r>
           </w:p>
@@ -456,11 +516,16 @@
           <w:tcPr/>
           <w:p>
             <w:pPr>
-              <w:widowControl w:val="0"/>
-              <w:pStyle w:val="Compact"/>
-              <w:jc w:val="both"/>
-            </w:pPr>
-            <w:r>
+              <w:spacing w:line="317" w:lineRule="auto" w:before="20" w:after="20"/>
+              <w:widowControl w:val="0"/>
+              <w:pStyle w:val="Compact"/>
+              <w:jc w:val="both"/>
+            </w:pPr>
+            <w:r>
+              <w:rPr>
+                <w:sz w:val="21"/>
+                <w:szCs w:val="21"/>
+              </w:rPr>
               <w:t xml:space="preserve">Operating point</w:t>
             </w:r>
           </w:p>
@@ -469,11 +534,16 @@
           <w:tcPr/>
           <w:p>
             <w:pPr>
-              <w:widowControl w:val="0"/>
-              <w:pStyle w:val="Compact"/>
-              <w:jc w:val="both"/>
-            </w:pPr>
-            <w:r>
+              <w:spacing w:line="317" w:lineRule="auto" w:before="20" w:after="20"/>
+              <w:widowControl w:val="0"/>
+              <w:pStyle w:val="Compact"/>
+              <w:jc w:val="both"/>
+            </w:pPr>
+            <w:r>
+              <w:rPr>
+                <w:sz w:val="21"/>
+                <w:szCs w:val="21"/>
+              </w:rPr>
               <w:t xml:space="preserve">The pair (GPU, power cap) a job runs at.</w:t>
             </w:r>
           </w:p>
@@ -485,11 +555,16 @@
           <w:tcPr/>
           <w:p>
             <w:pPr>
-              <w:widowControl w:val="0"/>
-              <w:pStyle w:val="Compact"/>
-              <w:jc w:val="both"/>
-            </w:pPr>
-            <w:r>
+              <w:spacing w:line="317" w:lineRule="auto" w:before="20" w:after="20"/>
+              <w:widowControl w:val="0"/>
+              <w:pStyle w:val="Compact"/>
+              <w:jc w:val="both"/>
+            </w:pPr>
+            <w:r>
+              <w:rPr>
+                <w:sz w:val="21"/>
+                <w:szCs w:val="21"/>
+              </w:rPr>
               <w:t xml:space="preserve">Power envelope</w:t>
             </w:r>
           </w:p>
@@ -498,11 +573,16 @@
           <w:tcPr/>
           <w:p>
             <w:pPr>
-              <w:widowControl w:val="0"/>
-              <w:pStyle w:val="Compact"/>
-              <w:jc w:val="both"/>
-            </w:pPr>
-            <w:r>
+              <w:spacing w:line="317" w:lineRule="auto" w:before="20" w:after="20"/>
+              <w:widowControl w:val="0"/>
+              <w:pStyle w:val="Compact"/>
+              <w:jc w:val="both"/>
+            </w:pPr>
+            <w:r>
+              <w:rPr>
+                <w:sz w:val="21"/>
+                <w:szCs w:val="21"/>
+              </w:rPr>
               <w:t xml:space="preserve">A limit on a facility's total power draw that can change over time, set by a budget, a price or carbon signal, or a grid instruction.</w:t>
             </w:r>
           </w:p>
@@ -514,11 +594,16 @@
           <w:tcPr/>
           <w:p>
             <w:pPr>
-              <w:widowControl w:val="0"/>
-              <w:pStyle w:val="Compact"/>
-              <w:jc w:val="both"/>
-            </w:pPr>
-            <w:r>
+              <w:spacing w:line="317" w:lineRule="auto" w:before="20" w:after="20"/>
+              <w:widowControl w:val="0"/>
+              <w:pStyle w:val="Compact"/>
+              <w:jc w:val="both"/>
+            </w:pPr>
+            <w:r>
+              <w:rPr>
+                <w:sz w:val="21"/>
+                <w:szCs w:val="21"/>
+              </w:rPr>
               <w:t xml:space="preserve">Power shaping</w:t>
             </w:r>
           </w:p>
@@ -527,11 +612,16 @@
           <w:tcPr/>
           <w:p>
             <w:pPr>
-              <w:widowControl w:val="0"/>
-              <w:pStyle w:val="Compact"/>
-              <w:jc w:val="both"/>
-            </w:pPr>
-            <w:r>
+              <w:spacing w:line="317" w:lineRule="auto" w:before="20" w:after="20"/>
+              <w:widowControl w:val="0"/>
+              <w:pStyle w:val="Compact"/>
+              <w:jc w:val="both"/>
+            </w:pPr>
+            <w:r>
+              <w:rPr>
+                <w:sz w:val="21"/>
+                <w:szCs w:val="21"/>
+              </w:rPr>
               <w:t xml:space="preserve">Keeping a fleet inside a power envelope by capping jobs, like traffic shaping in networks.</w:t>
             </w:r>
           </w:p>
@@ -543,11 +633,16 @@
           <w:tcPr/>
           <w:p>
             <w:pPr>
-              <w:widowControl w:val="0"/>
-              <w:pStyle w:val="Compact"/>
-              <w:jc w:val="both"/>
-            </w:pPr>
-            <w:r>
+              <w:spacing w:line="317" w:lineRule="auto" w:before="20" w:after="20"/>
+              <w:widowControl w:val="0"/>
+              <w:pStyle w:val="Compact"/>
+              <w:jc w:val="both"/>
+            </w:pPr>
+            <w:r>
+              <w:rPr>
+                <w:sz w:val="21"/>
+                <w:szCs w:val="21"/>
+              </w:rPr>
               <w:t xml:space="preserve">ELF</w:t>
             </w:r>
           </w:p>
@@ -556,11 +651,16 @@
           <w:tcPr/>
           <w:p>
             <w:pPr>
-              <w:widowControl w:val="0"/>
-              <w:pStyle w:val="Compact"/>
-              <w:jc w:val="both"/>
-            </w:pPr>
-            <w:r>
+              <w:spacing w:line="317" w:lineRule="auto" w:before="20" w:after="20"/>
+              <w:widowControl w:val="0"/>
+              <w:pStyle w:val="Compact"/>
+              <w:jc w:val="both"/>
+            </w:pPr>
+            <w:r>
+              <w:rPr>
+                <w:sz w:val="21"/>
+                <w:szCs w:val="21"/>
+              </w:rPr>
               <w:t xml:space="preserve">Our released dataset: dense power-cap sweeps of 20 AI models on 4 GPUs, ~5,500 measured rows.</w:t>
             </w:r>
           </w:p>
@@ -572,11 +672,16 @@
           <w:tcPr/>
           <w:p>
             <w:pPr>
-              <w:widowControl w:val="0"/>
-              <w:pStyle w:val="Compact"/>
-              <w:jc w:val="both"/>
-            </w:pPr>
-            <w:r>
+              <w:spacing w:line="317" w:lineRule="auto" w:before="20" w:after="20"/>
+              <w:widowControl w:val="0"/>
+              <w:pStyle w:val="Compact"/>
+              <w:jc w:val="both"/>
+            </w:pPr>
+            <w:r>
+              <w:rPr>
+                <w:sz w:val="21"/>
+                <w:szCs w:val="21"/>
+              </w:rPr>
               <w:t xml:space="preserve">SLO</w:t>
             </w:r>
           </w:p>
@@ -585,11 +690,16 @@
           <w:tcPr/>
           <w:p>
             <w:pPr>
-              <w:widowControl w:val="0"/>
-              <w:pStyle w:val="Compact"/>
-              <w:jc w:val="both"/>
-            </w:pPr>
-            <w:r>
+              <w:spacing w:line="317" w:lineRule="auto" w:before="20" w:after="20"/>
+              <w:widowControl w:val="0"/>
+              <w:pStyle w:val="Compact"/>
+              <w:jc w:val="both"/>
+            </w:pPr>
+            <w:r>
+              <w:rPr>
+                <w:sz w:val="21"/>
+                <w:szCs w:val="21"/>
+              </w:rPr>
               <w:t xml:space="preserve">Service level objective: the deadline or latency a job must meet.</w:t>
             </w:r>
           </w:p>
@@ -601,11 +711,16 @@
           <w:tcPr/>
           <w:p>
             <w:pPr>
-              <w:widowControl w:val="0"/>
-              <w:pStyle w:val="Compact"/>
-              <w:jc w:val="both"/>
-            </w:pPr>
-            <w:r>
+              <w:spacing w:line="317" w:lineRule="auto" w:before="20" w:after="20"/>
+              <w:widowControl w:val="0"/>
+              <w:pStyle w:val="Compact"/>
+              <w:jc w:val="both"/>
+            </w:pPr>
+            <w:r>
+              <w:rPr>
+                <w:sz w:val="21"/>
+                <w:szCs w:val="21"/>
+              </w:rPr>
               <w:t xml:space="preserve">Firm / flexible capacity</w:t>
             </w:r>
           </w:p>
@@ -614,11 +729,16 @@
           <w:tcPr/>
           <w:p>
             <w:pPr>
-              <w:widowControl w:val="0"/>
-              <w:pStyle w:val="Compact"/>
-              <w:jc w:val="both"/>
-            </w:pPr>
-            <w:r>
+              <w:spacing w:line="317" w:lineRule="auto" w:before="20" w:after="20"/>
+              <w:widowControl w:val="0"/>
+              <w:pStyle w:val="Compact"/>
+              <w:jc w:val="both"/>
+            </w:pPr>
+            <w:r>
+              <w:rPr>
+                <w:sz w:val="21"/>
+                <w:szCs w:val="21"/>
+              </w:rPr>
               <w:t xml:space="preserve">Grid connection capacity guaranteed at all times, versus capacity given on condition that the facility reduces power when instructed.</w:t>
             </w:r>
           </w:p>
@@ -630,11 +750,16 @@
           <w:tcPr/>
           <w:p>
             <w:pPr>
-              <w:widowControl w:val="0"/>
-              <w:pStyle w:val="Compact"/>
-              <w:jc w:val="both"/>
-            </w:pPr>
-            <w:r>
+              <w:spacing w:line="317" w:lineRule="auto" w:before="20" w:after="20"/>
+              <w:widowControl w:val="0"/>
+              <w:pStyle w:val="Compact"/>
+              <w:jc w:val="both"/>
+            </w:pPr>
+            <w:r>
+              <w:rPr>
+                <w:sz w:val="21"/>
+                <w:szCs w:val="21"/>
+              </w:rPr>
               <w:t xml:space="preserve">Card multiplier</w:t>
             </w:r>
           </w:p>
@@ -643,11 +768,16 @@
           <w:tcPr/>
           <w:p>
             <w:pPr>
-              <w:widowControl w:val="0"/>
-              <w:pStyle w:val="Compact"/>
-              <w:jc w:val="both"/>
-            </w:pPr>
-            <w:r>
+              <w:spacing w:line="317" w:lineRule="auto" w:before="20" w:after="20"/>
+              <w:widowControl w:val="0"/>
+              <w:pStyle w:val="Compact"/>
+              <w:jc w:val="both"/>
+            </w:pPr>
+            <w:r>
+              <w:rPr>
+                <w:sz w:val="21"/>
+                <w:szCs w:val="21"/>
+              </w:rPr>
               <w:t xml:space="preserve">The extra cards needed to keep total throughput when capping. It equals the latency ratio (~1.2×).</w:t>
             </w:r>
           </w:p>
@@ -658,6 +788,7 @@
     <w:bookmarkStart w:id="28" w:name="objectives-of-the-program"/>
     <w:p>
       <w:pPr>
+        <w:pageBreakBefore/>
         <w:keepLines w:val="0"/>
         <w:keepNext w:val="0"/>
         <w:widowControl w:val="0"/>
@@ -1655,11 +1786,16 @@
           <w:tcPr/>
           <w:p>
             <w:pPr>
-              <w:widowControl w:val="0"/>
-              <w:pStyle w:val="Compact"/>
-              <w:jc w:val="both"/>
-            </w:pPr>
-            <w:r>
+              <w:spacing w:line="317" w:lineRule="auto" w:before="20" w:after="20"/>
+              <w:widowControl w:val="0"/>
+              <w:pStyle w:val="Compact"/>
+              <w:jc w:val="both"/>
+            </w:pPr>
+            <w:r>
+              <w:rPr>
+                <w:sz w:val="21"/>
+                <w:szCs w:val="21"/>
+              </w:rPr>
               <w:t xml:space="preserve">WP</w:t>
             </w:r>
           </w:p>
@@ -1668,11 +1804,16 @@
           <w:tcPr/>
           <w:p>
             <w:pPr>
-              <w:widowControl w:val="0"/>
-              <w:pStyle w:val="Compact"/>
-              <w:jc w:val="both"/>
-            </w:pPr>
-            <w:r>
+              <w:spacing w:line="317" w:lineRule="auto" w:before="20" w:after="20"/>
+              <w:widowControl w:val="0"/>
+              <w:pStyle w:val="Compact"/>
+              <w:jc w:val="both"/>
+            </w:pPr>
+            <w:r>
+              <w:rPr>
+                <w:sz w:val="21"/>
+                <w:szCs w:val="21"/>
+              </w:rPr>
               <w:t xml:space="preserve">Objective</w:t>
             </w:r>
           </w:p>
@@ -1681,11 +1822,16 @@
           <w:tcPr/>
           <w:p>
             <w:pPr>
-              <w:widowControl w:val="0"/>
-              <w:pStyle w:val="Compact"/>
-              <w:jc w:val="both"/>
-            </w:pPr>
-            <w:r>
+              <w:spacing w:line="317" w:lineRule="auto" w:before="20" w:after="20"/>
+              <w:widowControl w:val="0"/>
+              <w:pStyle w:val="Compact"/>
+              <w:jc w:val="both"/>
+            </w:pPr>
+            <w:r>
+              <w:rPr>
+                <w:sz w:val="21"/>
+                <w:szCs w:val="21"/>
+              </w:rPr>
               <w:t xml:space="preserve">Approach and output</w:t>
             </w:r>
           </w:p>
@@ -1697,6 +1843,7 @@
           <w:tcPr/>
           <w:p>
             <w:pPr>
+              <w:spacing w:line="317" w:lineRule="auto" w:before="20" w:after="20"/>
               <w:widowControl w:val="0"/>
               <w:pStyle w:val="Compact"/>
               <w:jc w:val="both"/>
@@ -1705,6 +1852,8 @@
               <w:rPr>
                 <w:b/>
                 <w:bCs/>
+                <w:sz w:val="21"/>
+                <w:szCs w:val="21"/>
               </w:rPr>
               <w:t xml:space="preserve">WP1</w:t>
             </w:r>
@@ -1714,11 +1863,16 @@
           <w:tcPr/>
           <w:p>
             <w:pPr>
-              <w:widowControl w:val="0"/>
-              <w:pStyle w:val="Compact"/>
-              <w:jc w:val="both"/>
-            </w:pPr>
-            <w:r>
+              <w:spacing w:line="317" w:lineRule="auto" w:before="20" w:after="20"/>
+              <w:widowControl w:val="0"/>
+              <w:pStyle w:val="Compact"/>
+              <w:jc w:val="both"/>
+            </w:pPr>
+            <w:r>
+              <w:rPr>
+                <w:sz w:val="21"/>
+                <w:szCs w:val="21"/>
+              </w:rPr>
               <w:t xml:space="preserve">Extend the energy-versus-power measurements to current GPUs, production software, and whole-server power.</w:t>
             </w:r>
           </w:p>
@@ -1727,27 +1881,46 @@
           <w:tcPr/>
           <w:p>
             <w:pPr>
-              <w:widowControl w:val="0"/>
-              <w:pStyle w:val="Compact"/>
-              <w:jc w:val="both"/>
-            </w:pPr>
-            <w:r>
+              <w:spacing w:line="317" w:lineRule="auto" w:before="20" w:after="20"/>
+              <w:widowControl w:val="0"/>
+              <w:pStyle w:val="Compact"/>
+              <w:jc w:val="both"/>
+            </w:pPr>
+            <w:r>
+              <w:rPr>
+                <w:sz w:val="21"/>
+                <w:szCs w:val="21"/>
+              </w:rPr>
               <w:t xml:space="preserve">Re-run the study's measurement sweep on current GPUs (H100/L40S class) and production serving engines (vLLM [16], TensorRT-LLM), reading power at three tiers: GPU board (NVML), host CPU (RAPL), and server-input, the wall tier (BMC via IPMI/Redfish). The JP is the energy minimum, where the tangent from the origin meets P(θ) (dE/dθ = 0); a meter gain error leaves its location unchanged while an additive offset shifts it, so JP location and per-card savings are gain-robust, while absolute board-to-wall and megawatt figures carry the offset caveat.</w:t>
             </w:r>
             <w:r>
+              <w:rPr>
+                <w:sz w:val="21"/>
+                <w:szCs w:val="21"/>
+              </w:rPr>
               <w:t xml:space="preserve"> </w:t>
             </w:r>
             <w:r>
               <w:rPr>
                 <w:i/>
                 <w:iCs/>
+                <w:sz w:val="21"/>
+                <w:szCs w:val="21"/>
               </w:rPr>
               <w:t xml:space="preserve">Output:</w:t>
             </w:r>
             <w:r>
+              <w:rPr>
+                <w:sz w:val="21"/>
+                <w:szCs w:val="21"/>
+              </w:rPr>
               <w:t xml:space="preserve"> </w:t>
             </w:r>
             <w:r>
+              <w:rPr>
+                <w:sz w:val="21"/>
+                <w:szCs w:val="21"/>
+              </w:rPr>
               <w:t xml:space="preserve">the ELF-2 open dataset (board and server-input).</w:t>
             </w:r>
           </w:p>
@@ -1759,6 +1932,7 @@
           <w:tcPr/>
           <w:p>
             <w:pPr>
+              <w:spacing w:line="317" w:lineRule="auto" w:before="20" w:after="20"/>
               <w:widowControl w:val="0"/>
               <w:pStyle w:val="Compact"/>
               <w:jc w:val="both"/>
@@ -1767,6 +1941,8 @@
               <w:rPr>
                 <w:b/>
                 <w:bCs/>
+                <w:sz w:val="21"/>
+                <w:szCs w:val="21"/>
               </w:rPr>
               <w:t xml:space="preserve">WP2</w:t>
             </w:r>
@@ -1776,11 +1952,16 @@
           <w:tcPr/>
           <w:p>
             <w:pPr>
-              <w:widowControl w:val="0"/>
-              <w:pStyle w:val="Compact"/>
-              <w:jc w:val="both"/>
-            </w:pPr>
-            <w:r>
+              <w:spacing w:line="317" w:lineRule="auto" w:before="20" w:after="20"/>
+              <w:widowControl w:val="0"/>
+              <w:pStyle w:val="Compact"/>
+              <w:jc w:val="both"/>
+            </w:pPr>
+            <w:r>
+              <w:rPr>
+                <w:sz w:val="21"/>
+                <w:szCs w:val="21"/>
+              </w:rPr>
               <w:t xml:space="preserve">Predict any new card's or job's efficient operating point without a full measurement sweep.</w:t>
             </w:r>
           </w:p>
@@ -1789,27 +1970,46 @@
           <w:tcPr/>
           <w:p>
             <w:pPr>
-              <w:widowControl w:val="0"/>
-              <w:pStyle w:val="Compact"/>
-              <w:jc w:val="both"/>
-            </w:pPr>
-            <w:r>
+              <w:spacing w:line="317" w:lineRule="auto" w:before="20" w:after="20"/>
+              <w:widowControl w:val="0"/>
+              <w:pStyle w:val="Compact"/>
+              <w:jc w:val="both"/>
+            </w:pPr>
+            <w:r>
+              <w:rPr>
+                <w:sz w:val="21"/>
+                <w:szCs w:val="21"/>
+              </w:rPr>
               <w:t xml:space="preserve">A job model predicts a job's best power cap from its features; a transfer model predicts a new card's curve from published specifications plus one short test. Both report error bars and a stated range of validity, and a short proof bounds the small penalty of one cap per card.</w:t>
             </w:r>
             <w:r>
+              <w:rPr>
+                <w:sz w:val="21"/>
+                <w:szCs w:val="21"/>
+              </w:rPr>
               <w:t xml:space="preserve"> </w:t>
             </w:r>
             <w:r>
               <w:rPr>
                 <w:i/>
                 <w:iCs/>
+                <w:sz w:val="21"/>
+                <w:szCs w:val="21"/>
               </w:rPr>
               <w:t xml:space="preserve">Output:</w:t>
             </w:r>
             <w:r>
+              <w:rPr>
+                <w:sz w:val="21"/>
+                <w:szCs w:val="21"/>
+              </w:rPr>
               <w:t xml:space="preserve"> </w:t>
             </w:r>
             <w:r>
+              <w:rPr>
+                <w:sz w:val="21"/>
+                <w:szCs w:val="21"/>
+              </w:rPr>
               <w:t xml:space="preserve">the characterization kit (models and one-test protocol).</w:t>
             </w:r>
           </w:p>
@@ -1821,6 +2021,7 @@
           <w:tcPr/>
           <w:p>
             <w:pPr>
+              <w:spacing w:line="317" w:lineRule="auto" w:before="20" w:after="20"/>
               <w:widowControl w:val="0"/>
               <w:pStyle w:val="Compact"/>
               <w:jc w:val="both"/>
@@ -1829,6 +2030,8 @@
               <w:rPr>
                 <w:b/>
                 <w:bCs/>
+                <w:sz w:val="21"/>
+                <w:szCs w:val="21"/>
               </w:rPr>
               <w:t xml:space="preserve">WP3</w:t>
             </w:r>
@@ -1838,11 +2041,16 @@
           <w:tcPr/>
           <w:p>
             <w:pPr>
-              <w:widowControl w:val="0"/>
-              <w:pStyle w:val="Compact"/>
-              <w:jc w:val="both"/>
-            </w:pPr>
-            <w:r>
+              <w:spacing w:line="317" w:lineRule="auto" w:before="20" w:after="20"/>
+              <w:widowControl w:val="0"/>
+              <w:pStyle w:val="Compact"/>
+              <w:jc w:val="both"/>
+            </w:pPr>
+            <w:r>
+              <w:rPr>
+                <w:sz w:val="21"/>
+                <w:szCs w:val="21"/>
+              </w:rPr>
               <w:t xml:space="preserve">Decide, in real time, which job runs on which card and at what power cap, to do the most useful work within a changing power limit.</w:t>
             </w:r>
           </w:p>
@@ -1851,27 +2059,46 @@
           <w:tcPr/>
           <w:p>
             <w:pPr>
-              <w:widowControl w:val="0"/>
-              <w:pStyle w:val="Compact"/>
-              <w:jc w:val="both"/>
-            </w:pPr>
-            <w:r>
+              <w:spacing w:line="317" w:lineRule="auto" w:before="20" w:after="20"/>
+              <w:widowControl w:val="0"/>
+              <w:pStyle w:val="Compact"/>
+              <w:jc w:val="both"/>
+            </w:pPr>
+            <w:r>
+              <w:rPr>
+                <w:sz w:val="21"/>
+                <w:szCs w:val="21"/>
+              </w:rPr>
               <w:t xml:space="preserve">A controller that makes both choices together, since moving a job changes the power left for others, tested in a digital twin that replays measured curves against exact baselines. When power is tight it defers low-priority work and reports the cost. The joint problem is NP-hard; the per-card capping step is solved exactly.</w:t>
             </w:r>
             <w:r>
+              <w:rPr>
+                <w:sz w:val="21"/>
+                <w:szCs w:val="21"/>
+              </w:rPr>
               <w:t xml:space="preserve"> </w:t>
             </w:r>
             <w:r>
               <w:rPr>
                 <w:i/>
                 <w:iCs/>
+                <w:sz w:val="21"/>
+                <w:szCs w:val="21"/>
               </w:rPr>
               <w:t xml:space="preserve">Output:</w:t>
             </w:r>
             <w:r>
+              <w:rPr>
+                <w:sz w:val="21"/>
+                <w:szCs w:val="21"/>
+              </w:rPr>
               <w:t xml:space="preserve"> </w:t>
             </w:r>
             <w:r>
+              <w:rPr>
+                <w:sz w:val="21"/>
+                <w:szCs w:val="21"/>
+              </w:rPr>
               <w:t xml:space="preserve">the open control engine and digital twin.</w:t>
             </w:r>
           </w:p>
@@ -1883,6 +2110,7 @@
           <w:tcPr/>
           <w:p>
             <w:pPr>
+              <w:spacing w:line="317" w:lineRule="auto" w:before="20" w:after="20"/>
               <w:widowControl w:val="0"/>
               <w:pStyle w:val="Compact"/>
               <w:jc w:val="both"/>
@@ -1891,6 +2119,8 @@
               <w:rPr>
                 <w:b/>
                 <w:bCs/>
+                <w:sz w:val="21"/>
+                <w:szCs w:val="21"/>
               </w:rPr>
               <w:t xml:space="preserve">WP4</w:t>
             </w:r>
@@ -1900,11 +2130,16 @@
           <w:tcPr/>
           <w:p>
             <w:pPr>
-              <w:widowControl w:val="0"/>
-              <w:pStyle w:val="Compact"/>
-              <w:jc w:val="both"/>
-            </w:pPr>
-            <w:r>
+              <w:spacing w:line="317" w:lineRule="auto" w:before="20" w:after="20"/>
+              <w:widowControl w:val="0"/>
+              <w:pStyle w:val="Compact"/>
+              <w:jc w:val="both"/>
+            </w:pPr>
+            <w:r>
+              <w:rPr>
+                <w:sz w:val="21"/>
+                <w:szCs w:val="21"/>
+              </w:rPr>
               <w:t xml:space="preserve">Define what flexibility a controlled facility can offer the grid, and measure it.</w:t>
             </w:r>
           </w:p>
@@ -1913,27 +2148,46 @@
           <w:tcPr/>
           <w:p>
             <w:pPr>
-              <w:widowControl w:val="0"/>
-              <w:pStyle w:val="Compact"/>
-              <w:jc w:val="both"/>
-            </w:pPr>
-            <w:r>
+              <w:spacing w:line="317" w:lineRule="auto" w:before="20" w:after="20"/>
+              <w:widowControl w:val="0"/>
+              <w:pStyle w:val="Compact"/>
+              <w:jc w:val="both"/>
+            </w:pPr>
+            <w:r>
+              <w:rPr>
+                <w:sz w:val="21"/>
+                <w:szCs w:val="21"/>
+              </w:rPr>
               <w:t xml:space="preserve">Specify the contractable quantities, a committed power envelope, a flexibility offer, and an auditable delivery record, with ramp and recovery metrics; demonstrate them on a rented metered server and at fleet scale in the twin, under an Israeli firm-plus-flexible scenario.</w:t>
             </w:r>
             <w:r>
+              <w:rPr>
+                <w:sz w:val="21"/>
+                <w:szCs w:val="21"/>
+              </w:rPr>
               <w:t xml:space="preserve"> </w:t>
             </w:r>
             <w:r>
               <w:rPr>
                 <w:i/>
                 <w:iCs/>
+                <w:sz w:val="21"/>
+                <w:szCs w:val="21"/>
               </w:rPr>
               <w:t xml:space="preserve">Output:</w:t>
             </w:r>
             <w:r>
+              <w:rPr>
+                <w:sz w:val="21"/>
+                <w:szCs w:val="21"/>
+              </w:rPr>
               <w:t xml:space="preserve"> </w:t>
             </w:r>
             <w:r>
+              <w:rPr>
+                <w:sz w:val="21"/>
+                <w:szCs w:val="21"/>
+              </w:rPr>
               <w:t xml:space="preserve">the flexibility products and the Israel demonstration.</w:t>
             </w:r>
           </w:p>
@@ -1945,6 +2199,7 @@
           <w:tcPr/>
           <w:p>
             <w:pPr>
+              <w:spacing w:line="317" w:lineRule="auto" w:before="20" w:after="20"/>
               <w:widowControl w:val="0"/>
               <w:pStyle w:val="Compact"/>
               <w:jc w:val="both"/>
@@ -1953,6 +2208,8 @@
               <w:rPr>
                 <w:b/>
                 <w:bCs/>
+                <w:sz w:val="21"/>
+                <w:szCs w:val="21"/>
               </w:rPr>
               <w:t xml:space="preserve">WP5</w:t>
             </w:r>
@@ -1962,11 +2219,16 @@
           <w:tcPr/>
           <w:p>
             <w:pPr>
-              <w:widowControl w:val="0"/>
-              <w:pStyle w:val="Compact"/>
-              <w:jc w:val="both"/>
-            </w:pPr>
-            <w:r>
+              <w:spacing w:line="317" w:lineRule="auto" w:before="20" w:after="20"/>
+              <w:widowControl w:val="0"/>
+              <w:pStyle w:val="Compact"/>
+              <w:jc w:val="both"/>
+            </w:pPr>
+            <w:r>
+              <w:rPr>
+                <w:sz w:val="21"/>
+                <w:szCs w:val="21"/>
+              </w:rPr>
               <w:t xml:space="preserve">Find pricing and connection rules that reward efficient operation, and release everything openly.</w:t>
             </w:r>
           </w:p>
@@ -1975,27 +2237,46 @@
           <w:tcPr/>
           <w:p>
             <w:pPr>
-              <w:widowControl w:val="0"/>
-              <w:pStyle w:val="Compact"/>
-              <w:jc w:val="both"/>
-            </w:pPr>
-            <w:r>
+              <w:spacing w:line="317" w:lineRule="auto" w:before="20" w:after="20"/>
+              <w:widowControl w:val="0"/>
+              <w:pStyle w:val="Compact"/>
+              <w:jc w:val="both"/>
+            </w:pPr>
+            <w:r>
+              <w:rPr>
+                <w:sz w:val="21"/>
+                <w:szCs w:val="21"/>
+              </w:rPr>
               <w:t xml:space="preserve">An incentive model showing why per-hour billing rewards the energy-worst point and what changes fix it; a valuation of the flexible-connection option from public Noga and Electricity Authority data; each rule tested in the WP3 twin.</w:t>
             </w:r>
             <w:r>
+              <w:rPr>
+                <w:sz w:val="21"/>
+                <w:szCs w:val="21"/>
+              </w:rPr>
               <w:t xml:space="preserve"> </w:t>
             </w:r>
             <w:r>
               <w:rPr>
                 <w:i/>
                 <w:iCs/>
+                <w:sz w:val="21"/>
+                <w:szCs w:val="21"/>
               </w:rPr>
               <w:t xml:space="preserve">Output:</w:t>
             </w:r>
             <w:r>
+              <w:rPr>
+                <w:sz w:val="21"/>
+                <w:szCs w:val="21"/>
+              </w:rPr>
               <w:t xml:space="preserve"> </w:t>
             </w:r>
             <w:r>
+              <w:rPr>
+                <w:sz w:val="21"/>
+                <w:szCs w:val="21"/>
+              </w:rPr>
               <w:t xml:space="preserve">the policy report and the open release of the dataset, control engine, twin, and interfaces.</w:t>
             </w:r>
           </w:p>
@@ -2212,11 +2493,16 @@
           <w:tcPr/>
           <w:p>
             <w:pPr>
-              <w:widowControl w:val="0"/>
-              <w:pStyle w:val="Compact"/>
-              <w:jc w:val="both"/>
-            </w:pPr>
-            <w:r>
+              <w:spacing w:line="317" w:lineRule="auto" w:before="20" w:after="20"/>
+              <w:widowControl w:val="0"/>
+              <w:pStyle w:val="Compact"/>
+              <w:jc w:val="both"/>
+            </w:pPr>
+            <w:r>
+              <w:rPr>
+                <w:sz w:val="21"/>
+                <w:szCs w:val="21"/>
+              </w:rPr>
               <w:t xml:space="preserve">Clause</w:t>
             </w:r>
           </w:p>
@@ -2225,11 +2511,16 @@
           <w:tcPr/>
           <w:p>
             <w:pPr>
-              <w:widowControl w:val="0"/>
-              <w:pStyle w:val="Compact"/>
-              <w:jc w:val="both"/>
-            </w:pPr>
-            <w:r>
+              <w:spacing w:line="317" w:lineRule="auto" w:before="20" w:after="20"/>
+              <w:widowControl w:val="0"/>
+              <w:pStyle w:val="Compact"/>
+              <w:jc w:val="both"/>
+            </w:pPr>
+            <w:r>
+              <w:rPr>
+                <w:sz w:val="21"/>
+                <w:szCs w:val="21"/>
+              </w:rPr>
               <w:t xml:space="preserve">How the project addresses it</w:t>
             </w:r>
           </w:p>
@@ -2241,6 +2532,7 @@
           <w:tcPr/>
           <w:p>
             <w:pPr>
+              <w:spacing w:line="317" w:lineRule="auto" w:before="20" w:after="20"/>
               <w:widowControl w:val="0"/>
               <w:pStyle w:val="Compact"/>
               <w:bidi/>
@@ -2251,18 +2543,24 @@
                 <w:b/>
                 <w:bCs/>
                 <w:rtl/>
+                <w:sz w:val="21"/>
+                <w:szCs w:val="21"/>
               </w:rPr>
               <w:t xml:space="preserve">16.2</w:t>
             </w:r>
             <w:r>
               <w:rPr>
                 <w:rtl/>
+                <w:sz w:val="21"/>
+                <w:szCs w:val="21"/>
               </w:rPr>
               <w:t xml:space="preserve"> </w:t>
             </w:r>
             <w:r>
               <w:rPr>
                 <w:rtl/>
+                <w:sz w:val="21"/>
+                <w:szCs w:val="21"/>
               </w:rPr>
               <w:t xml:space="preserve">· טכנולוגיות תכנון וניהול הספקת אנרגיה לחוות שרתים</w:t>
             </w:r>
@@ -2272,11 +2570,16 @@
           <w:tcPr/>
           <w:p>
             <w:pPr>
-              <w:widowControl w:val="0"/>
-              <w:pStyle w:val="Compact"/>
-              <w:jc w:val="both"/>
-            </w:pPr>
-            <w:r>
+              <w:spacing w:line="317" w:lineRule="auto" w:before="20" w:after="20"/>
+              <w:widowControl w:val="0"/>
+              <w:pStyle w:val="Compact"/>
+              <w:jc w:val="both"/>
+            </w:pPr>
+            <w:r>
+              <w:rPr>
+                <w:sz w:val="21"/>
+                <w:szCs w:val="21"/>
+              </w:rPr>
               <w:t xml:space="preserve">The core deliverable. The control engine manages a farm’s energy supply in real time (each card at its measured optimum, the fleet held to a committed envelope); the twin sizes how many cards run behind a given connection and how much power can be shed.</w:t>
             </w:r>
           </w:p>
@@ -2288,6 +2591,7 @@
           <w:tcPr/>
           <w:p>
             <w:pPr>
+              <w:spacing w:line="317" w:lineRule="auto" w:before="20" w:after="20"/>
               <w:widowControl w:val="0"/>
               <w:pStyle w:val="Compact"/>
               <w:bidi/>
@@ -2298,30 +2602,40 @@
                 <w:b/>
                 <w:bCs/>
                 <w:rtl/>
+                <w:sz w:val="21"/>
+                <w:szCs w:val="21"/>
               </w:rPr>
               <w:t xml:space="preserve">8</w:t>
             </w:r>
             <w:r>
               <w:rPr>
                 <w:rtl/>
+                <w:sz w:val="21"/>
+                <w:szCs w:val="21"/>
               </w:rPr>
               <w:t xml:space="preserve"> </w:t>
             </w:r>
             <w:r>
               <w:rPr>
                 <w:rtl/>
+                <w:sz w:val="21"/>
+                <w:szCs w:val="21"/>
               </w:rPr>
               <w:t xml:space="preserve">· התייעלות באנרגיה וביזור מערכות אנרגיה</w:t>
             </w:r>
             <w:r>
               <w:rPr>
                 <w:rtl/>
+                <w:sz w:val="21"/>
+                <w:szCs w:val="21"/>
               </w:rPr>
               <w:t xml:space="preserve"> </w:t>
             </w:r>
             <w:r>
               <w:rPr>
                 <w:rtl/>
+                <w:sz w:val="21"/>
+                <w:szCs w:val="21"/>
               </w:rPr>
               <w:t xml:space="preserve">(2026 priority)</w:t>
             </w:r>
@@ -2331,11 +2645,16 @@
           <w:tcPr/>
           <w:p>
             <w:pPr>
-              <w:widowControl w:val="0"/>
-              <w:pStyle w:val="Compact"/>
-              <w:jc w:val="both"/>
-            </w:pPr>
-            <w:r>
+              <w:spacing w:line="317" w:lineRule="auto" w:before="20" w:after="20"/>
+              <w:widowControl w:val="0"/>
+              <w:pStyle w:val="Compact"/>
+              <w:jc w:val="both"/>
+            </w:pPr>
+            <w:r>
+              <w:rPr>
+                <w:sz w:val="21"/>
+                <w:szCs w:val="21"/>
+              </w:rPr>
               <w:t xml:space="preserve">Energy efficiency of a new industrial load class (8.1, 8.3): 29–31 percent less energy per task at the card [1] and 18–45 percent per served job at the fleet (simulation), in software on installed hardware.</w:t>
             </w:r>
           </w:p>
@@ -2347,6 +2666,7 @@
           <w:tcPr/>
           <w:p>
             <w:pPr>
+              <w:spacing w:line="317" w:lineRule="auto" w:before="20" w:after="20"/>
               <w:widowControl w:val="0"/>
               <w:pStyle w:val="Compact"/>
               <w:bidi/>
@@ -2357,30 +2677,40 @@
                 <w:b/>
                 <w:bCs/>
                 <w:rtl/>
+                <w:sz w:val="21"/>
+                <w:szCs w:val="21"/>
               </w:rPr>
               <w:t xml:space="preserve">16.1</w:t>
             </w:r>
             <w:r>
               <w:rPr>
                 <w:rtl/>
+                <w:sz w:val="21"/>
+                <w:szCs w:val="21"/>
               </w:rPr>
               <w:t xml:space="preserve"> </w:t>
             </w:r>
             <w:r>
               <w:rPr>
                 <w:rtl/>
+                <w:sz w:val="21"/>
+                <w:szCs w:val="21"/>
               </w:rPr>
               <w:t xml:space="preserve">· שימוש בבינה מלאכותית ככלי עזר לפיתוח ומחקר בכל הנושאים לעיל (סעיפים 1-15)</w:t>
             </w:r>
             <w:r>
               <w:rPr>
                 <w:rtl/>
+                <w:sz w:val="21"/>
+                <w:szCs w:val="21"/>
               </w:rPr>
               <w:t xml:space="preserve"> </w:t>
             </w:r>
             <w:r>
               <w:rPr>
                 <w:rtl/>
+                <w:sz w:val="21"/>
+                <w:szCs w:val="21"/>
               </w:rPr>
               <w:t xml:space="preserve">(2026 priority)</w:t>
             </w:r>
@@ -2390,11 +2720,16 @@
           <w:tcPr/>
           <w:p>
             <w:pPr>
-              <w:widowControl w:val="0"/>
-              <w:pStyle w:val="Compact"/>
-              <w:jc w:val="both"/>
-            </w:pPr>
-            <w:r>
+              <w:spacing w:line="317" w:lineRule="auto" w:before="20" w:after="20"/>
+              <w:widowControl w:val="0"/>
+              <w:pStyle w:val="Compact"/>
+              <w:jc w:val="both"/>
+            </w:pPr>
+            <w:r>
+              <w:rPr>
+                <w:sz w:val="21"/>
+                <w:szCs w:val="21"/>
+              </w:rPr>
               <w:t xml:space="preserve">Machine learning as the instrument for topics 8 and 6: the WP2 job model predicts a job’s energy-optimal cap from its features and the transfer model predicts a new card’s curve from its specifications plus one short test; the WP3 controller solves joint allocation-and-capping over the learned curves.</w:t>
             </w:r>
           </w:p>
@@ -2406,6 +2741,7 @@
           <w:tcPr/>
           <w:p>
             <w:pPr>
+              <w:spacing w:line="317" w:lineRule="auto" w:before="20" w:after="20"/>
               <w:widowControl w:val="0"/>
               <w:pStyle w:val="Compact"/>
               <w:bidi/>
@@ -2416,30 +2752,40 @@
                 <w:b/>
                 <w:bCs/>
                 <w:rtl/>
+                <w:sz w:val="21"/>
+                <w:szCs w:val="21"/>
               </w:rPr>
               <w:t xml:space="preserve">6.2 / 6.3</w:t>
             </w:r>
             <w:r>
               <w:rPr>
                 <w:rtl/>
+                <w:sz w:val="21"/>
+                <w:szCs w:val="21"/>
               </w:rPr>
               <w:t xml:space="preserve"> </w:t>
             </w:r>
             <w:r>
               <w:rPr>
                 <w:rtl/>
+                <w:sz w:val="21"/>
+                <w:szCs w:val="21"/>
               </w:rPr>
               <w:t xml:space="preserve">· ניהול אנרגיה מקומי וניהול ביקושים · בקרה וניהול רשת בחדירת מתחדשות גבוהה</w:t>
             </w:r>
             <w:r>
               <w:rPr>
                 <w:rtl/>
+                <w:sz w:val="21"/>
+                <w:szCs w:val="21"/>
               </w:rPr>
               <w:t xml:space="preserve"> </w:t>
             </w:r>
             <w:r>
               <w:rPr>
                 <w:rtl/>
+                <w:sz w:val="21"/>
+                <w:szCs w:val="21"/>
               </w:rPr>
               <w:t xml:space="preserve">(6.3: 2026 priority)</w:t>
             </w:r>
@@ -2449,11 +2795,16 @@
           <w:tcPr/>
           <w:p>
             <w:pPr>
-              <w:widowControl w:val="0"/>
-              <w:pStyle w:val="Compact"/>
-              <w:jc w:val="both"/>
-            </w:pPr>
-            <w:r>
+              <w:spacing w:line="317" w:lineRule="auto" w:before="20" w:after="20"/>
+              <w:widowControl w:val="0"/>
+              <w:pStyle w:val="Compact"/>
+              <w:jc w:val="both"/>
+            </w:pPr>
+            <w:r>
+              <w:rPr>
+                <w:sz w:val="21"/>
+                <w:szCs w:val="21"/>
+              </w:rPr>
               <w:t xml:space="preserve">Demand management: a facility holding a committed envelope and shedding on instruction is a demand-response resource; cap actuation settles in about 0.2 s at the card and the demonstration targets a 60-second facility ramp, a response time within a demand-response window, letting a system operator on an isolated grid count AI load as reserve.</w:t>
             </w:r>
           </w:p>
@@ -2465,6 +2816,7 @@
           <w:tcPr/>
           <w:p>
             <w:pPr>
+              <w:spacing w:line="317" w:lineRule="auto" w:before="20" w:after="20"/>
               <w:widowControl w:val="0"/>
               <w:pStyle w:val="Compact"/>
               <w:bidi/>
@@ -2475,18 +2827,24 @@
                 <w:b/>
                 <w:bCs/>
                 <w:rtl/>
+                <w:sz w:val="21"/>
+                <w:szCs w:val="21"/>
               </w:rPr>
               <w:t xml:space="preserve">15.1 / 15.3</w:t>
             </w:r>
             <w:r>
               <w:rPr>
                 <w:rtl/>
+                <w:sz w:val="21"/>
+                <w:szCs w:val="21"/>
               </w:rPr>
               <w:t xml:space="preserve"> </w:t>
             </w:r>
             <w:r>
               <w:rPr>
                 <w:rtl/>
+                <w:sz w:val="21"/>
+                <w:szCs w:val="21"/>
               </w:rPr>
               <w:t xml:space="preserve">· כלי מדיניות לייעול השימוש באנרגיה · מתודולוגיה וכלי עזר בקבלת החלטות</w:t>
             </w:r>
@@ -2496,11 +2854,16 @@
           <w:tcPr/>
           <w:p>
             <w:pPr>
-              <w:widowControl w:val="0"/>
-              <w:pStyle w:val="Compact"/>
-              <w:jc w:val="both"/>
-            </w:pPr>
-            <w:r>
+              <w:spacing w:line="317" w:lineRule="auto" w:before="20" w:after="20"/>
+              <w:widowControl w:val="0"/>
+              <w:pStyle w:val="Compact"/>
+              <w:jc w:val="both"/>
+            </w:pPr>
+            <w:r>
+              <w:rPr>
+                <w:sz w:val="21"/>
+                <w:szCs w:val="21"/>
+              </w:rPr>
               <w:t xml:space="preserve">Policy tools for efficient energy use (15.1): WP5 tests billing and connection rules in the twin and shows which reward the energy-optimal point. Decision support (15.3): the regulator-facing report quantifies firm-plus-flexible connections against the queue.</w:t>
             </w:r>
           </w:p>
@@ -2787,11 +3150,16 @@
           <w:tcPr/>
           <w:p>
             <w:pPr>
-              <w:widowControl w:val="0"/>
-              <w:pStyle w:val="Compact"/>
-              <w:jc w:val="both"/>
-            </w:pPr>
-            <w:r>
+              <w:spacing w:line="317" w:lineRule="auto" w:before="20" w:after="20"/>
+              <w:widowControl w:val="0"/>
+              <w:pStyle w:val="Compact"/>
+              <w:jc w:val="both"/>
+            </w:pPr>
+            <w:r>
+              <w:rPr>
+                <w:sz w:val="21"/>
+                <w:szCs w:val="21"/>
+              </w:rPr>
               <w:t xml:space="preserve">Months</w:t>
             </w:r>
           </w:p>
@@ -2800,11 +3168,16 @@
           <w:tcPr/>
           <w:p>
             <w:pPr>
-              <w:widowControl w:val="0"/>
-              <w:pStyle w:val="Compact"/>
-              <w:jc w:val="both"/>
-            </w:pPr>
-            <w:r>
+              <w:spacing w:line="317" w:lineRule="auto" w:before="20" w:after="20"/>
+              <w:widowControl w:val="0"/>
+              <w:pStyle w:val="Compact"/>
+              <w:jc w:val="both"/>
+            </w:pPr>
+            <w:r>
+              <w:rPr>
+                <w:sz w:val="21"/>
+                <w:szCs w:val="21"/>
+              </w:rPr>
               <w:t xml:space="preserve">Stage</w:t>
             </w:r>
           </w:p>
@@ -2813,11 +3186,16 @@
           <w:tcPr/>
           <w:p>
             <w:pPr>
-              <w:widowControl w:val="0"/>
-              <w:pStyle w:val="Compact"/>
-              <w:jc w:val="both"/>
-            </w:pPr>
-            <w:r>
+              <w:spacing w:line="317" w:lineRule="auto" w:before="20" w:after="20"/>
+              <w:widowControl w:val="0"/>
+              <w:pStyle w:val="Compact"/>
+              <w:jc w:val="both"/>
+            </w:pPr>
+            <w:r>
+              <w:rPr>
+                <w:sz w:val="21"/>
+                <w:szCs w:val="21"/>
+              </w:rPr>
               <w:t xml:space="preserve">Deliverable</w:t>
             </w:r>
           </w:p>
@@ -2826,11 +3204,16 @@
           <w:tcPr/>
           <w:p>
             <w:pPr>
-              <w:widowControl w:val="0"/>
-              <w:pStyle w:val="Compact"/>
-              <w:jc w:val="both"/>
-            </w:pPr>
-            <w:r>
+              <w:spacing w:line="317" w:lineRule="auto" w:before="20" w:after="20"/>
+              <w:widowControl w:val="0"/>
+              <w:pStyle w:val="Compact"/>
+              <w:jc w:val="both"/>
+            </w:pPr>
+            <w:r>
+              <w:rPr>
+                <w:sz w:val="21"/>
+                <w:szCs w:val="21"/>
+              </w:rPr>
               <w:t xml:space="preserve">Success metric</w:t>
             </w:r>
           </w:p>
@@ -2842,11 +3225,16 @@
           <w:tcPr/>
           <w:p>
             <w:pPr>
-              <w:widowControl w:val="0"/>
-              <w:pStyle w:val="Compact"/>
-              <w:jc w:val="both"/>
-            </w:pPr>
-            <w:r>
+              <w:spacing w:line="317" w:lineRule="auto" w:before="20" w:after="20"/>
+              <w:widowControl w:val="0"/>
+              <w:pStyle w:val="Compact"/>
+              <w:jc w:val="both"/>
+            </w:pPr>
+            <w:r>
+              <w:rPr>
+                <w:sz w:val="21"/>
+                <w:szCs w:val="21"/>
+              </w:rPr>
               <w:t xml:space="preserve">M1–M6</w:t>
             </w:r>
           </w:p>
@@ -2855,11 +3243,16 @@
           <w:tcPr/>
           <w:p>
             <w:pPr>
-              <w:widowControl w:val="0"/>
-              <w:pStyle w:val="Compact"/>
-              <w:jc w:val="both"/>
-            </w:pPr>
-            <w:r>
+              <w:spacing w:line="317" w:lineRule="auto" w:before="20" w:after="20"/>
+              <w:widowControl w:val="0"/>
+              <w:pStyle w:val="Compact"/>
+              <w:jc w:val="both"/>
+            </w:pPr>
+            <w:r>
+              <w:rPr>
+                <w:sz w:val="21"/>
+                <w:szCs w:val="21"/>
+              </w:rPr>
               <w:t xml:space="preserve">WP1: harness; new-generation and production-engine (vLLM) sweeps; board and node instrumentation</w:t>
             </w:r>
           </w:p>
@@ -2868,11 +3261,16 @@
           <w:tcPr/>
           <w:p>
             <w:pPr>
-              <w:widowControl w:val="0"/>
-              <w:pStyle w:val="Compact"/>
-              <w:jc w:val="both"/>
-            </w:pPr>
-            <w:r>
+              <w:spacing w:line="317" w:lineRule="auto" w:before="20" w:after="20"/>
+              <w:widowControl w:val="0"/>
+              <w:pStyle w:val="Compact"/>
+              <w:jc w:val="both"/>
+            </w:pPr>
+            <w:r>
+              <w:rPr>
+                <w:sz w:val="21"/>
+                <w:szCs w:val="21"/>
+              </w:rPr>
               <w:t xml:space="preserve">D1: ELF-2 v1</w:t>
             </w:r>
           </w:p>
@@ -2881,11 +3279,16 @@
           <w:tcPr/>
           <w:p>
             <w:pPr>
-              <w:widowControl w:val="0"/>
-              <w:pStyle w:val="Compact"/>
-              <w:jc w:val="both"/>
-            </w:pPr>
-            <w:r>
+              <w:spacing w:line="317" w:lineRule="auto" w:before="20" w:after="20"/>
+              <w:widowControl w:val="0"/>
+              <w:pStyle w:val="Compact"/>
+              <w:jc w:val="both"/>
+            </w:pPr>
+            <w:r>
+              <w:rPr>
+                <w:sz w:val="21"/>
+                <w:szCs w:val="21"/>
+              </w:rPr>
               <w:t xml:space="preserve">Law fit R² ≥ 0.95 per sweep (measured median 0.99 [1]); any platform where it fails is documented as a bounding result; JP located (or absence documented) per platform at board and node power</w:t>
             </w:r>
           </w:p>
@@ -2897,11 +3300,16 @@
           <w:tcPr/>
           <w:p>
             <w:pPr>
-              <w:widowControl w:val="0"/>
-              <w:pStyle w:val="Compact"/>
-              <w:jc w:val="both"/>
-            </w:pPr>
-            <w:r>
+              <w:spacing w:line="317" w:lineRule="auto" w:before="20" w:after="20"/>
+              <w:widowControl w:val="0"/>
+              <w:pStyle w:val="Compact"/>
+              <w:jc w:val="both"/>
+            </w:pPr>
+            <w:r>
+              <w:rPr>
+                <w:sz w:val="21"/>
+                <w:szCs w:val="21"/>
+              </w:rPr>
               <w:t xml:space="preserve">M5–M8</w:t>
             </w:r>
           </w:p>
@@ -2910,11 +3318,16 @@
           <w:tcPr/>
           <w:p>
             <w:pPr>
-              <w:widowControl w:val="0"/>
-              <w:pStyle w:val="Compact"/>
-              <w:jc w:val="both"/>
-            </w:pPr>
-            <w:r>
+              <w:spacing w:line="317" w:lineRule="auto" w:before="20" w:after="20"/>
+              <w:widowControl w:val="0"/>
+              <w:pStyle w:val="Compact"/>
+              <w:jc w:val="both"/>
+            </w:pPr>
+            <w:r>
+              <w:rPr>
+                <w:sz w:val="21"/>
+                <w:szCs w:val="21"/>
+              </w:rPr>
               <w:t xml:space="preserve">WP1: shared GPUs, LLM phases, fine-tuning; sweeps where the constant should break</w:t>
             </w:r>
           </w:p>
@@ -2923,11 +3336,16 @@
           <w:tcPr/>
           <w:p>
             <w:pPr>
-              <w:widowControl w:val="0"/>
-              <w:pStyle w:val="Compact"/>
-              <w:jc w:val="both"/>
-            </w:pPr>
-            <w:r>
+              <w:spacing w:line="317" w:lineRule="auto" w:before="20" w:after="20"/>
+              <w:widowControl w:val="0"/>
+              <w:pStyle w:val="Compact"/>
+              <w:jc w:val="both"/>
+            </w:pPr>
+            <w:r>
+              <w:rPr>
+                <w:sz w:val="21"/>
+                <w:szCs w:val="21"/>
+              </w:rPr>
               <w:t xml:space="preserve">MS1: regime map</w:t>
             </w:r>
           </w:p>
@@ -2936,11 +3354,16 @@
           <w:tcPr/>
           <w:p>
             <w:pPr>
-              <w:widowControl w:val="0"/>
-              <w:pStyle w:val="Compact"/>
-              <w:jc w:val="both"/>
-            </w:pPr>
-            <w:r>
+              <w:spacing w:line="317" w:lineRule="auto" w:before="20" w:after="20"/>
+              <w:widowControl w:val="0"/>
+              <w:pStyle w:val="Compact"/>
+              <w:jc w:val="both"/>
+            </w:pPr>
+            <w:r>
+              <w:rPr>
+                <w:sz w:val="21"/>
+                <w:szCs w:val="21"/>
+              </w:rPr>
               <w:t xml:space="preserve">Server-input (BMC) wall tier validated; validity domain documented, including the pre-registered JP shift (percentage points of TDP) at which the per-card constant breaks</w:t>
             </w:r>
           </w:p>
@@ -2952,11 +3375,16 @@
           <w:tcPr/>
           <w:p>
             <w:pPr>
-              <w:widowControl w:val="0"/>
-              <w:pStyle w:val="Compact"/>
-              <w:jc w:val="both"/>
-            </w:pPr>
-            <w:r>
+              <w:spacing w:line="317" w:lineRule="auto" w:before="20" w:after="20"/>
+              <w:widowControl w:val="0"/>
+              <w:pStyle w:val="Compact"/>
+              <w:jc w:val="both"/>
+            </w:pPr>
+            <w:r>
+              <w:rPr>
+                <w:sz w:val="21"/>
+                <w:szCs w:val="21"/>
+              </w:rPr>
               <w:t xml:space="preserve">M7–M12</w:t>
             </w:r>
           </w:p>
@@ -2965,11 +3393,16 @@
           <w:tcPr/>
           <w:p>
             <w:pPr>
-              <w:widowControl w:val="0"/>
-              <w:pStyle w:val="Compact"/>
-              <w:jc w:val="both"/>
-            </w:pPr>
-            <w:r>
+              <w:spacing w:line="317" w:lineRule="auto" w:before="20" w:after="20"/>
+              <w:widowControl w:val="0"/>
+              <w:pStyle w:val="Compact"/>
+              <w:jc w:val="both"/>
+            </w:pPr>
+            <w:r>
+              <w:rPr>
+                <w:sz w:val="21"/>
+                <w:szCs w:val="21"/>
+              </w:rPr>
               <w:t xml:space="preserve">WP2: job model; transfer model; one-test characterization protocol</w:t>
             </w:r>
           </w:p>
@@ -2978,11 +3411,16 @@
           <w:tcPr/>
           <w:p>
             <w:pPr>
-              <w:widowControl w:val="0"/>
-              <w:pStyle w:val="Compact"/>
-              <w:jc w:val="both"/>
-            </w:pPr>
-            <w:r>
+              <w:spacing w:line="317" w:lineRule="auto" w:before="20" w:after="20"/>
+              <w:widowControl w:val="0"/>
+              <w:pStyle w:val="Compact"/>
+              <w:jc w:val="both"/>
+            </w:pPr>
+            <w:r>
+              <w:rPr>
+                <w:sz w:val="21"/>
+                <w:szCs w:val="21"/>
+              </w:rPr>
               <w:t xml:space="preserve">MS2: models result</w:t>
             </w:r>
           </w:p>
@@ -2991,11 +3429,16 @@
           <w:tcPr/>
           <w:p>
             <w:pPr>
-              <w:widowControl w:val="0"/>
-              <w:pStyle w:val="Compact"/>
-              <w:jc w:val="both"/>
-            </w:pPr>
-            <w:r>
+              <w:spacing w:line="317" w:lineRule="auto" w:before="20" w:after="20"/>
+              <w:widowControl w:val="0"/>
+              <w:pStyle w:val="Compact"/>
+              <w:jc w:val="both"/>
+            </w:pPr>
+            <w:r>
+              <w:rPr>
+                <w:sz w:val="21"/>
+                <w:szCs w:val="21"/>
+              </w:rPr>
               <w:t xml:space="preserve">Job-model placement within 5 percentage points of TDP where the constant breaks; transfer-model placement within 5 percentage points of TDP on held-out cards; protocol cost ≤ 8 hours and ≤ ₪1,500 per card model</w:t>
             </w:r>
           </w:p>
@@ -3007,11 +3450,16 @@
           <w:tcPr/>
           <w:p>
             <w:pPr>
-              <w:widowControl w:val="0"/>
-              <w:pStyle w:val="Compact"/>
-              <w:jc w:val="both"/>
-            </w:pPr>
-            <w:r>
+              <w:spacing w:line="317" w:lineRule="auto" w:before="20" w:after="20"/>
+              <w:widowControl w:val="0"/>
+              <w:pStyle w:val="Compact"/>
+              <w:jc w:val="both"/>
+            </w:pPr>
+            <w:r>
+              <w:rPr>
+                <w:sz w:val="21"/>
+                <w:szCs w:val="21"/>
+              </w:rPr>
               <w:t xml:space="preserve">M9–M16</w:t>
             </w:r>
           </w:p>
@@ -3020,11 +3468,16 @@
           <w:tcPr/>
           <w:p>
             <w:pPr>
-              <w:widowControl w:val="0"/>
-              <w:pStyle w:val="Compact"/>
-              <w:jc w:val="both"/>
-            </w:pPr>
-            <w:r>
+              <w:spacing w:line="317" w:lineRule="auto" w:before="20" w:after="20"/>
+              <w:widowControl w:val="0"/>
+              <w:pStyle w:val="Compact"/>
+              <w:jc w:val="both"/>
+            </w:pPr>
+            <w:r>
+              <w:rPr>
+                <w:sz w:val="21"/>
+                <w:szCs w:val="21"/>
+              </w:rPr>
               <w:t xml:space="preserve">WP3: twin; joint controller under fixed, price, carbon and curtailment envelopes</w:t>
             </w:r>
           </w:p>
@@ -3033,11 +3486,16 @@
           <w:tcPr/>
           <w:p>
             <w:pPr>
-              <w:widowControl w:val="0"/>
-              <w:pStyle w:val="Compact"/>
-              <w:jc w:val="both"/>
-            </w:pPr>
-            <w:r>
+              <w:spacing w:line="317" w:lineRule="auto" w:before="20" w:after="20"/>
+              <w:widowControl w:val="0"/>
+              <w:pStyle w:val="Compact"/>
+              <w:jc w:val="both"/>
+            </w:pPr>
+            <w:r>
+              <w:rPr>
+                <w:sz w:val="21"/>
+                <w:szCs w:val="21"/>
+              </w:rPr>
               <w:t xml:space="preserve">MS3: controller result</w:t>
             </w:r>
           </w:p>
@@ -3046,11 +3504,16 @@
           <w:tcPr/>
           <w:p>
             <w:pPr>
-              <w:widowControl w:val="0"/>
-              <w:pStyle w:val="Compact"/>
-              <w:jc w:val="both"/>
-            </w:pPr>
-            <w:r>
+              <w:spacing w:line="317" w:lineRule="auto" w:before="20" w:after="20"/>
+              <w:widowControl w:val="0"/>
+              <w:pStyle w:val="Compact"/>
+              <w:jc w:val="both"/>
+            </w:pPr>
+            <w:r>
+              <w:rPr>
+                <w:sz w:val="21"/>
+                <w:szCs w:val="21"/>
+              </w:rPr>
               <w:t xml:space="preserve">Energy per served job and SLO compliance versus uncapped, static-cap and cap-only baselines; a pre-registered floor of at least 10 percent below cap-only at equal compliance (incremental gain over an already-capped fleet, not over full power); zero exceedance beyond the WP1 noise band in committed windows, transient violations (under 1 percent of control intervals) reported</w:t>
             </w:r>
           </w:p>
@@ -3062,11 +3525,16 @@
           <w:tcPr/>
           <w:p>
             <w:pPr>
-              <w:widowControl w:val="0"/>
-              <w:pStyle w:val="Compact"/>
-              <w:jc w:val="both"/>
-            </w:pPr>
-            <w:r>
+              <w:spacing w:line="317" w:lineRule="auto" w:before="20" w:after="20"/>
+              <w:widowControl w:val="0"/>
+              <w:pStyle w:val="Compact"/>
+              <w:jc w:val="both"/>
+            </w:pPr>
+            <w:r>
+              <w:rPr>
+                <w:sz w:val="21"/>
+                <w:szCs w:val="21"/>
+              </w:rPr>
               <w:t xml:space="preserve">M14–M20</w:t>
             </w:r>
           </w:p>
@@ -3075,11 +3543,16 @@
           <w:tcPr/>
           <w:p>
             <w:pPr>
-              <w:widowControl w:val="0"/>
-              <w:pStyle w:val="Compact"/>
-              <w:jc w:val="both"/>
-            </w:pPr>
-            <w:r>
+              <w:spacing w:line="317" w:lineRule="auto" w:before="20" w:after="20"/>
+              <w:widowControl w:val="0"/>
+              <w:pStyle w:val="Compact"/>
+              <w:jc w:val="both"/>
+            </w:pPr>
+            <w:r>
+              <w:rPr>
+                <w:sz w:val="21"/>
+                <w:szCs w:val="21"/>
+              </w:rPr>
               <w:t xml:space="preserve">WP4: flexibility products and metrics; demonstration on rented BMC-metered servers; Israel scenario</w:t>
             </w:r>
           </w:p>
@@ -3088,11 +3561,16 @@
           <w:tcPr/>
           <w:p>
             <w:pPr>
-              <w:widowControl w:val="0"/>
-              <w:pStyle w:val="Compact"/>
-              <w:jc w:val="both"/>
-            </w:pPr>
-            <w:r>
+              <w:spacing w:line="317" w:lineRule="auto" w:before="20" w:after="20"/>
+              <w:widowControl w:val="0"/>
+              <w:pStyle w:val="Compact"/>
+              <w:jc w:val="both"/>
+            </w:pPr>
+            <w:r>
+              <w:rPr>
+                <w:sz w:val="21"/>
+                <w:szCs w:val="21"/>
+              </w:rPr>
               <w:t xml:space="preserve">MS4: flexibility demonstration</w:t>
             </w:r>
           </w:p>
@@ -3101,11 +3579,16 @@
           <w:tcPr/>
           <w:p>
             <w:pPr>
-              <w:widowControl w:val="0"/>
-              <w:pStyle w:val="Compact"/>
-              <w:jc w:val="both"/>
-            </w:pPr>
-            <w:r>
+              <w:spacing w:line="317" w:lineRule="auto" w:before="20" w:after="20"/>
+              <w:widowControl w:val="0"/>
+              <w:pStyle w:val="Compact"/>
+              <w:jc w:val="both"/>
+            </w:pPr>
+            <w:r>
+              <w:rPr>
+                <w:sz w:val="21"/>
+                <w:szCs w:val="21"/>
+              </w:rPr>
               <w:t xml:space="preserve">Sheddable power as a fraction of the committed envelope (pre-registered floor: at least 15 percent within the ramp deadline at bounded SLO loss), measured on a BMC-metered server, projected to fleet scale in the twin; ramp within 60 seconds and recovery within 5 minutes, a response time compatible with the curtailment right proposed in the Authority's hearing [19]; delivery-record compliance and service cost</w:t>
             </w:r>
           </w:p>
@@ -3117,11 +3600,16 @@
           <w:tcPr/>
           <w:p>
             <w:pPr>
-              <w:widowControl w:val="0"/>
-              <w:pStyle w:val="Compact"/>
-              <w:jc w:val="both"/>
-            </w:pPr>
-            <w:r>
+              <w:spacing w:line="317" w:lineRule="auto" w:before="20" w:after="20"/>
+              <w:widowControl w:val="0"/>
+              <w:pStyle w:val="Compact"/>
+              <w:jc w:val="both"/>
+            </w:pPr>
+            <w:r>
+              <w:rPr>
+                <w:sz w:val="21"/>
+                <w:szCs w:val="21"/>
+              </w:rPr>
               <w:t xml:space="preserve">M17–M21</w:t>
             </w:r>
           </w:p>
@@ -3130,11 +3618,16 @@
           <w:tcPr/>
           <w:p>
             <w:pPr>
-              <w:widowControl w:val="0"/>
-              <w:pStyle w:val="Compact"/>
-              <w:jc w:val="both"/>
-            </w:pPr>
-            <w:r>
+              <w:spacing w:line="317" w:lineRule="auto" w:before="20" w:after="20"/>
+              <w:widowControl w:val="0"/>
+              <w:pStyle w:val="Compact"/>
+              <w:jc w:val="both"/>
+            </w:pPr>
+            <w:r>
+              <w:rPr>
+                <w:sz w:val="21"/>
+                <w:szCs w:val="21"/>
+              </w:rPr>
               <w:t xml:space="preserve">WP5: incentive model; connection valuation on published Israeli data; twin evaluation</w:t>
             </w:r>
           </w:p>
@@ -3143,11 +3636,16 @@
           <w:tcPr/>
           <w:p>
             <w:pPr>
-              <w:widowControl w:val="0"/>
-              <w:pStyle w:val="Compact"/>
-              <w:jc w:val="both"/>
-            </w:pPr>
-            <w:r>
+              <w:spacing w:line="317" w:lineRule="auto" w:before="20" w:after="20"/>
+              <w:widowControl w:val="0"/>
+              <w:pStyle w:val="Compact"/>
+              <w:jc w:val="both"/>
+            </w:pPr>
+            <w:r>
+              <w:rPr>
+                <w:sz w:val="21"/>
+                <w:szCs w:val="21"/>
+              </w:rPr>
               <w:t xml:space="preserve">MS5: policy report draft</w:t>
             </w:r>
           </w:p>
@@ -3156,11 +3654,16 @@
           <w:tcPr/>
           <w:p>
             <w:pPr>
-              <w:widowControl w:val="0"/>
-              <w:pStyle w:val="Compact"/>
-              <w:jc w:val="both"/>
-            </w:pPr>
-            <w:r>
+              <w:spacing w:line="317" w:lineRule="auto" w:before="20" w:after="20"/>
+              <w:widowControl w:val="0"/>
+              <w:pStyle w:val="Compact"/>
+              <w:jc w:val="both"/>
+            </w:pPr>
+            <w:r>
+              <w:rPr>
+                <w:sz w:val="21"/>
+                <w:szCs w:val="21"/>
+              </w:rPr>
               <w:t xml:space="preserve">Alignment condition per billing structure, confirmed in the twin; option value per MW and break-even curtailment frequency, with sensitivity to every price input</w:t>
             </w:r>
           </w:p>
@@ -3172,11 +3675,16 @@
           <w:tcPr/>
           <w:p>
             <w:pPr>
-              <w:widowControl w:val="0"/>
-              <w:pStyle w:val="Compact"/>
-              <w:jc w:val="both"/>
-            </w:pPr>
-            <w:r>
+              <w:spacing w:line="317" w:lineRule="auto" w:before="20" w:after="20"/>
+              <w:widowControl w:val="0"/>
+              <w:pStyle w:val="Compact"/>
+              <w:jc w:val="both"/>
+            </w:pPr>
+            <w:r>
+              <w:rPr>
+                <w:sz w:val="21"/>
+                <w:szCs w:val="21"/>
+              </w:rPr>
               <w:t xml:space="preserve">M21–M24</w:t>
             </w:r>
           </w:p>
@@ -3185,11 +3693,16 @@
           <w:tcPr/>
           <w:p>
             <w:pPr>
-              <w:widowControl w:val="0"/>
-              <w:pStyle w:val="Compact"/>
-              <w:jc w:val="both"/>
-            </w:pPr>
-            <w:r>
+              <w:spacing w:line="317" w:lineRule="auto" w:before="20" w:after="20"/>
+              <w:widowControl w:val="0"/>
+              <w:pStyle w:val="Compact"/>
+              <w:jc w:val="both"/>
+            </w:pPr>
+            <w:r>
+              <w:rPr>
+                <w:sz w:val="21"/>
+                <w:szCs w:val="21"/>
+              </w:rPr>
               <w:t xml:space="preserve">WP5: release, documentation, validation, publication</w:t>
             </w:r>
           </w:p>
@@ -3198,11 +3711,16 @@
           <w:tcPr/>
           <w:p>
             <w:pPr>
-              <w:widowControl w:val="0"/>
-              <w:pStyle w:val="Compact"/>
-              <w:jc w:val="both"/>
-            </w:pPr>
-            <w:r>
+              <w:spacing w:line="317" w:lineRule="auto" w:before="20" w:after="20"/>
+              <w:widowControl w:val="0"/>
+              <w:pStyle w:val="Compact"/>
+              <w:jc w:val="both"/>
+            </w:pPr>
+            <w:r>
+              <w:rPr>
+                <w:sz w:val="21"/>
+                <w:szCs w:val="21"/>
+              </w:rPr>
               <w:t xml:space="preserve">D2: open release; D3: final report</w:t>
             </w:r>
           </w:p>
@@ -3211,11 +3729,16 @@
           <w:tcPr/>
           <w:p>
             <w:pPr>
-              <w:widowControl w:val="0"/>
-              <w:pStyle w:val="Compact"/>
-              <w:jc w:val="both"/>
-            </w:pPr>
-            <w:r>
+              <w:spacing w:line="317" w:lineRule="auto" w:before="20" w:after="20"/>
+              <w:widowControl w:val="0"/>
+              <w:pStyle w:val="Compact"/>
+              <w:jc w:val="both"/>
+            </w:pPr>
+            <w:r>
+              <w:rPr>
+                <w:sz w:val="21"/>
+                <w:szCs w:val="21"/>
+              </w:rPr>
               <w:t xml:space="preserve">Public repositories with reproducing pipelines; metered validation; final scientific and policy reports</w:t>
             </w:r>
           </w:p>
@@ -3277,11 +3800,16 @@
           <w:tcPr/>
           <w:p>
             <w:pPr>
-              <w:widowControl w:val="0"/>
-              <w:pStyle w:val="Compact"/>
-              <w:jc w:val="both"/>
-            </w:pPr>
-            <w:r>
+              <w:spacing w:line="317" w:lineRule="auto" w:before="20" w:after="20"/>
+              <w:widowControl w:val="0"/>
+              <w:pStyle w:val="Compact"/>
+              <w:jc w:val="both"/>
+            </w:pPr>
+            <w:r>
+              <w:rPr>
+                <w:sz w:val="21"/>
+                <w:szCs w:val="21"/>
+              </w:rPr>
               <w:t xml:space="preserve">Stage</w:t>
             </w:r>
           </w:p>
@@ -3290,11 +3818,16 @@
           <w:tcPr/>
           <w:p>
             <w:pPr>
-              <w:widowControl w:val="0"/>
-              <w:pStyle w:val="Compact"/>
-              <w:jc w:val="both"/>
-            </w:pPr>
-            <w:r>
+              <w:spacing w:line="317" w:lineRule="auto" w:before="20" w:after="20"/>
+              <w:widowControl w:val="0"/>
+              <w:pStyle w:val="Compact"/>
+              <w:jc w:val="both"/>
+            </w:pPr>
+            <w:r>
+              <w:rPr>
+                <w:sz w:val="21"/>
+                <w:szCs w:val="21"/>
+              </w:rPr>
               <w:t xml:space="preserve">Share</w:t>
             </w:r>
           </w:p>
@@ -3303,11 +3836,16 @@
           <w:tcPr/>
           <w:p>
             <w:pPr>
-              <w:widowControl w:val="0"/>
-              <w:pStyle w:val="Compact"/>
-              <w:jc w:val="both"/>
-            </w:pPr>
-            <w:r>
+              <w:spacing w:line="317" w:lineRule="auto" w:before="20" w:after="20"/>
+              <w:widowControl w:val="0"/>
+              <w:pStyle w:val="Compact"/>
+              <w:jc w:val="both"/>
+            </w:pPr>
+            <w:r>
+              <w:rPr>
+                <w:sz w:val="21"/>
+                <w:szCs w:val="21"/>
+              </w:rPr>
               <w:t xml:space="preserve">Amount (₪)</w:t>
             </w:r>
           </w:p>
@@ -3316,11 +3854,16 @@
           <w:tcPr/>
           <w:p>
             <w:pPr>
-              <w:widowControl w:val="0"/>
-              <w:pStyle w:val="Compact"/>
-              <w:jc w:val="both"/>
-            </w:pPr>
-            <w:r>
+              <w:spacing w:line="317" w:lineRule="auto" w:before="20" w:after="20"/>
+              <w:widowControl w:val="0"/>
+              <w:pStyle w:val="Compact"/>
+              <w:jc w:val="both"/>
+            </w:pPr>
+            <w:r>
+              <w:rPr>
+                <w:sz w:val="21"/>
+                <w:szCs w:val="21"/>
+              </w:rPr>
               <w:t xml:space="preserve">Principal costs</w:t>
             </w:r>
           </w:p>
@@ -3332,11 +3875,16 @@
           <w:tcPr/>
           <w:p>
             <w:pPr>
-              <w:widowControl w:val="0"/>
-              <w:pStyle w:val="Compact"/>
-              <w:jc w:val="both"/>
-            </w:pPr>
-            <w:r>
+              <w:spacing w:line="317" w:lineRule="auto" w:before="20" w:after="20"/>
+              <w:widowControl w:val="0"/>
+              <w:pStyle w:val="Compact"/>
+              <w:jc w:val="both"/>
+            </w:pPr>
+            <w:r>
+              <w:rPr>
+                <w:sz w:val="21"/>
+                <w:szCs w:val="21"/>
+              </w:rPr>
               <w:t xml:space="preserve">M1–M8 (WP1; WP2 begins)</w:t>
             </w:r>
           </w:p>
@@ -3345,11 +3893,16 @@
           <w:tcPr/>
           <w:p>
             <w:pPr>
-              <w:widowControl w:val="0"/>
-              <w:pStyle w:val="Compact"/>
-              <w:jc w:val="both"/>
-            </w:pPr>
-            <w:r>
+              <w:spacing w:line="317" w:lineRule="auto" w:before="20" w:after="20"/>
+              <w:widowControl w:val="0"/>
+              <w:pStyle w:val="Compact"/>
+              <w:jc w:val="both"/>
+            </w:pPr>
+            <w:r>
+              <w:rPr>
+                <w:sz w:val="21"/>
+                <w:szCs w:val="21"/>
+              </w:rPr>
               <w:t xml:space="preserve">30%</w:t>
             </w:r>
           </w:p>
@@ -3358,11 +3911,16 @@
           <w:tcPr/>
           <w:p>
             <w:pPr>
-              <w:widowControl w:val="0"/>
-              <w:pStyle w:val="Compact"/>
-              <w:jc w:val="both"/>
-            </w:pPr>
-            <w:r>
+              <w:spacing w:line="317" w:lineRule="auto" w:before="20" w:after="20"/>
+              <w:widowControl w:val="0"/>
+              <w:pStyle w:val="Compact"/>
+              <w:jc w:val="both"/>
+            </w:pPr>
+            <w:r>
+              <w:rPr>
+                <w:sz w:val="21"/>
+                <w:szCs w:val="21"/>
+              </w:rPr>
               <w:t xml:space="preserve">148,314</w:t>
             </w:r>
           </w:p>
@@ -3371,11 +3929,16 @@
           <w:tcPr/>
           <w:p>
             <w:pPr>
-              <w:widowControl w:val="0"/>
-              <w:pStyle w:val="Compact"/>
-              <w:jc w:val="both"/>
-            </w:pPr>
-            <w:r>
+              <w:spacing w:line="317" w:lineRule="auto" w:before="20" w:after="20"/>
+              <w:widowControl w:val="0"/>
+              <w:pStyle w:val="Compact"/>
+              <w:jc w:val="both"/>
+            </w:pPr>
+            <w:r>
+              <w:rPr>
+                <w:sz w:val="21"/>
+                <w:szCs w:val="21"/>
+              </w:rPr>
               <w:t xml:space="preserve">Postdoctoral researcher; GPU rentals for cap sweeps</w:t>
             </w:r>
           </w:p>
@@ -3387,11 +3950,16 @@
           <w:tcPr/>
           <w:p>
             <w:pPr>
-              <w:widowControl w:val="0"/>
-              <w:pStyle w:val="Compact"/>
-              <w:jc w:val="both"/>
-            </w:pPr>
-            <w:r>
+              <w:spacing w:line="317" w:lineRule="auto" w:before="20" w:after="20"/>
+              <w:widowControl w:val="0"/>
+              <w:pStyle w:val="Compact"/>
+              <w:jc w:val="both"/>
+            </w:pPr>
+            <w:r>
+              <w:rPr>
+                <w:sz w:val="21"/>
+                <w:szCs w:val="21"/>
+              </w:rPr>
               <w:t xml:space="preserve">M9–M16 (WP2 ends; WP3; WP4 begins)</w:t>
             </w:r>
           </w:p>
@@ -3400,11 +3968,16 @@
           <w:tcPr/>
           <w:p>
             <w:pPr>
-              <w:widowControl w:val="0"/>
-              <w:pStyle w:val="Compact"/>
-              <w:jc w:val="both"/>
-            </w:pPr>
-            <w:r>
+              <w:spacing w:line="317" w:lineRule="auto" w:before="20" w:after="20"/>
+              <w:widowControl w:val="0"/>
+              <w:pStyle w:val="Compact"/>
+              <w:jc w:val="both"/>
+            </w:pPr>
+            <w:r>
+              <w:rPr>
+                <w:sz w:val="21"/>
+                <w:szCs w:val="21"/>
+              </w:rPr>
               <w:t xml:space="preserve">33%</w:t>
             </w:r>
           </w:p>
@@ -3413,11 +3986,16 @@
           <w:tcPr/>
           <w:p>
             <w:pPr>
-              <w:widowControl w:val="0"/>
-              <w:pStyle w:val="Compact"/>
-              <w:jc w:val="both"/>
-            </w:pPr>
-            <w:r>
+              <w:spacing w:line="317" w:lineRule="auto" w:before="20" w:after="20"/>
+              <w:widowControl w:val="0"/>
+              <w:pStyle w:val="Compact"/>
+              <w:jc w:val="both"/>
+            </w:pPr>
+            <w:r>
+              <w:rPr>
+                <w:sz w:val="21"/>
+                <w:szCs w:val="21"/>
+              </w:rPr>
               <w:t xml:space="preserve">163,145</w:t>
             </w:r>
           </w:p>
@@ -3426,11 +4004,16 @@
           <w:tcPr/>
           <w:p>
             <w:pPr>
-              <w:widowControl w:val="0"/>
-              <w:pStyle w:val="Compact"/>
-              <w:jc w:val="both"/>
-            </w:pPr>
-            <w:r>
+              <w:spacing w:line="317" w:lineRule="auto" w:before="20" w:after="20"/>
+              <w:widowControl w:val="0"/>
+              <w:pStyle w:val="Compact"/>
+              <w:jc w:val="both"/>
+            </w:pPr>
+            <w:r>
+              <w:rPr>
+                <w:sz w:val="21"/>
+                <w:szCs w:val="21"/>
+              </w:rPr>
               <w:t xml:space="preserve">Postdoctoral researcher; card-model rentals for transfer validation; twin and controller work</w:t>
             </w:r>
           </w:p>
@@ -3442,11 +4025,16 @@
           <w:tcPr/>
           <w:p>
             <w:pPr>
-              <w:widowControl w:val="0"/>
-              <w:pStyle w:val="Compact"/>
-              <w:jc w:val="both"/>
-            </w:pPr>
-            <w:r>
+              <w:spacing w:line="317" w:lineRule="auto" w:before="20" w:after="20"/>
+              <w:widowControl w:val="0"/>
+              <w:pStyle w:val="Compact"/>
+              <w:jc w:val="both"/>
+            </w:pPr>
+            <w:r>
+              <w:rPr>
+                <w:sz w:val="21"/>
+                <w:szCs w:val="21"/>
+              </w:rPr>
               <w:t xml:space="preserve">M17–M21 (WP4 ends; WP5)</w:t>
             </w:r>
           </w:p>
@@ -3455,11 +4043,16 @@
           <w:tcPr/>
           <w:p>
             <w:pPr>
-              <w:widowControl w:val="0"/>
-              <w:pStyle w:val="Compact"/>
-              <w:jc w:val="both"/>
-            </w:pPr>
-            <w:r>
+              <w:spacing w:line="317" w:lineRule="auto" w:before="20" w:after="20"/>
+              <w:widowControl w:val="0"/>
+              <w:pStyle w:val="Compact"/>
+              <w:jc w:val="both"/>
+            </w:pPr>
+            <w:r>
+              <w:rPr>
+                <w:sz w:val="21"/>
+                <w:szCs w:val="21"/>
+              </w:rPr>
               <w:t xml:space="preserve">25%</w:t>
             </w:r>
           </w:p>
@@ -3468,11 +4061,16 @@
           <w:tcPr/>
           <w:p>
             <w:pPr>
-              <w:widowControl w:val="0"/>
-              <w:pStyle w:val="Compact"/>
-              <w:jc w:val="both"/>
-            </w:pPr>
-            <w:r>
+              <w:spacing w:line="317" w:lineRule="auto" w:before="20" w:after="20"/>
+              <w:widowControl w:val="0"/>
+              <w:pStyle w:val="Compact"/>
+              <w:jc w:val="both"/>
+            </w:pPr>
+            <w:r>
+              <w:rPr>
+                <w:sz w:val="21"/>
+                <w:szCs w:val="21"/>
+              </w:rPr>
               <w:t xml:space="preserve">123,595</w:t>
             </w:r>
           </w:p>
@@ -3481,11 +4079,16 @@
           <w:tcPr/>
           <w:p>
             <w:pPr>
-              <w:widowControl w:val="0"/>
-              <w:pStyle w:val="Compact"/>
-              <w:jc w:val="both"/>
-            </w:pPr>
-            <w:r>
+              <w:spacing w:line="317" w:lineRule="auto" w:before="20" w:after="20"/>
+              <w:widowControl w:val="0"/>
+              <w:pStyle w:val="Compact"/>
+              <w:jc w:val="both"/>
+            </w:pPr>
+            <w:r>
+              <w:rPr>
+                <w:sz w:val="21"/>
+                <w:szCs w:val="21"/>
+              </w:rPr>
               <w:t xml:space="preserve">Postdoctoral researcher; BMC-metered rentals; flexibility campaign</w:t>
             </w:r>
           </w:p>
@@ -3497,11 +4100,16 @@
           <w:tcPr/>
           <w:p>
             <w:pPr>
-              <w:widowControl w:val="0"/>
-              <w:pStyle w:val="Compact"/>
-              <w:jc w:val="both"/>
-            </w:pPr>
-            <w:r>
+              <w:spacing w:line="317" w:lineRule="auto" w:before="20" w:after="20"/>
+              <w:widowControl w:val="0"/>
+              <w:pStyle w:val="Compact"/>
+              <w:jc w:val="both"/>
+            </w:pPr>
+            <w:r>
+              <w:rPr>
+                <w:sz w:val="21"/>
+                <w:szCs w:val="21"/>
+              </w:rPr>
               <w:t xml:space="preserve">M22–M24 (WP5: release and validation)</w:t>
             </w:r>
           </w:p>
@@ -3510,11 +4118,16 @@
           <w:tcPr/>
           <w:p>
             <w:pPr>
-              <w:widowControl w:val="0"/>
-              <w:pStyle w:val="Compact"/>
-              <w:jc w:val="both"/>
-            </w:pPr>
-            <w:r>
+              <w:spacing w:line="317" w:lineRule="auto" w:before="20" w:after="20"/>
+              <w:widowControl w:val="0"/>
+              <w:pStyle w:val="Compact"/>
+              <w:jc w:val="both"/>
+            </w:pPr>
+            <w:r>
+              <w:rPr>
+                <w:sz w:val="21"/>
+                <w:szCs w:val="21"/>
+              </w:rPr>
               <w:t xml:space="preserve">12%</w:t>
             </w:r>
           </w:p>
@@ -3523,11 +4136,16 @@
           <w:tcPr/>
           <w:p>
             <w:pPr>
-              <w:widowControl w:val="0"/>
-              <w:pStyle w:val="Compact"/>
-              <w:jc w:val="both"/>
-            </w:pPr>
-            <w:r>
+              <w:spacing w:line="317" w:lineRule="auto" w:before="20" w:after="20"/>
+              <w:widowControl w:val="0"/>
+              <w:pStyle w:val="Compact"/>
+              <w:jc w:val="both"/>
+            </w:pPr>
+            <w:r>
+              <w:rPr>
+                <w:sz w:val="21"/>
+                <w:szCs w:val="21"/>
+              </w:rPr>
               <w:t xml:space="preserve">59,326</w:t>
             </w:r>
           </w:p>
@@ -3536,11 +4154,16 @@
           <w:tcPr/>
           <w:p>
             <w:pPr>
-              <w:widowControl w:val="0"/>
-              <w:pStyle w:val="Compact"/>
-              <w:jc w:val="both"/>
-            </w:pPr>
-            <w:r>
+              <w:spacing w:line="317" w:lineRule="auto" w:before="20" w:after="20"/>
+              <w:widowControl w:val="0"/>
+              <w:pStyle w:val="Compact"/>
+              <w:jc w:val="both"/>
+            </w:pPr>
+            <w:r>
+              <w:rPr>
+                <w:sz w:val="21"/>
+                <w:szCs w:val="21"/>
+              </w:rPr>
               <w:t xml:space="preserve">Postdoctoral researcher; metered validation runs; documentation; dissemination and publication</w:t>
             </w:r>
           </w:p>
@@ -3554,6 +4177,7 @@
           </w:tcPr>
           <w:p>
             <w:pPr>
+              <w:spacing w:line="317" w:lineRule="auto" w:before="20" w:after="20"/>
               <w:widowControl w:val="0"/>
               <w:pStyle w:val="Compact"/>
               <w:jc w:val="both"/>
@@ -3562,6 +4186,8 @@
               <w:rPr>
                 <w:b/>
                 <w:bCs/>
+                <w:sz w:val="21"/>
+                <w:szCs w:val="21"/>
               </w:rPr>
               <w:t xml:space="preserve">Total</w:t>
             </w:r>
@@ -3571,6 +4197,7 @@
           <w:tcPr/>
           <w:p>
             <w:pPr>
+              <w:spacing w:line="317" w:lineRule="auto" w:before="20" w:after="20"/>
               <w:widowControl w:val="0"/>
               <w:pStyle w:val="Compact"/>
               <w:jc w:val="both"/>
@@ -3579,6 +4206,8 @@
               <w:rPr>
                 <w:b/>
                 <w:bCs/>
+                <w:sz w:val="21"/>
+                <w:szCs w:val="21"/>
               </w:rPr>
               <w:t xml:space="preserve">494,380</w:t>
             </w:r>
@@ -3588,11 +4217,16 @@
           <w:tcPr/>
           <w:p>
             <w:pPr>
-              <w:widowControl w:val="0"/>
-              <w:pStyle w:val="Compact"/>
-              <w:jc w:val="both"/>
-            </w:pPr>
-            <w:r>
+              <w:spacing w:line="317" w:lineRule="auto" w:before="20" w:after="20"/>
+              <w:widowControl w:val="0"/>
+              <w:pStyle w:val="Compact"/>
+              <w:jc w:val="both"/>
+            </w:pPr>
+            <w:r>
+              <w:rPr>
+                <w:sz w:val="21"/>
+                <w:szCs w:val="21"/>
+              </w:rPr>
               <w:t xml:space="preserve">Full itemization in the מפרט תקציבי</w:t>
             </w:r>
           </w:p>
@@ -3643,11 +4277,16 @@
           <w:tcPr/>
           <w:p>
             <w:pPr>
-              <w:widowControl w:val="0"/>
-              <w:pStyle w:val="Compact"/>
-              <w:jc w:val="both"/>
-            </w:pPr>
-            <w:r>
+              <w:spacing w:line="317" w:lineRule="auto" w:before="20" w:after="20"/>
+              <w:widowControl w:val="0"/>
+              <w:pStyle w:val="Compact"/>
+              <w:jc w:val="both"/>
+            </w:pPr>
+            <w:r>
+              <w:rPr>
+                <w:sz w:val="21"/>
+                <w:szCs w:val="21"/>
+              </w:rPr>
               <w:t xml:space="preserve">Risk</w:t>
             </w:r>
           </w:p>
@@ -3656,11 +4295,16 @@
           <w:tcPr/>
           <w:p>
             <w:pPr>
-              <w:widowControl w:val="0"/>
-              <w:pStyle w:val="Compact"/>
-              <w:jc w:val="both"/>
-            </w:pPr>
-            <w:r>
+              <w:spacing w:line="317" w:lineRule="auto" w:before="20" w:after="20"/>
+              <w:widowControl w:val="0"/>
+              <w:pStyle w:val="Compact"/>
+              <w:jc w:val="both"/>
+            </w:pPr>
+            <w:r>
+              <w:rPr>
+                <w:sz w:val="21"/>
+                <w:szCs w:val="21"/>
+              </w:rPr>
               <w:t xml:space="preserve">Impact</w:t>
             </w:r>
           </w:p>
@@ -3669,11 +4313,16 @@
           <w:tcPr/>
           <w:p>
             <w:pPr>
-              <w:widowControl w:val="0"/>
-              <w:pStyle w:val="Compact"/>
-              <w:jc w:val="both"/>
-            </w:pPr>
-            <w:r>
+              <w:spacing w:line="317" w:lineRule="auto" w:before="20" w:after="20"/>
+              <w:widowControl w:val="0"/>
+              <w:pStyle w:val="Compact"/>
+              <w:jc w:val="both"/>
+            </w:pPr>
+            <w:r>
+              <w:rPr>
+                <w:sz w:val="21"/>
+                <w:szCs w:val="21"/>
+              </w:rPr>
               <w:t xml:space="preserve">Mitigation</w:t>
             </w:r>
           </w:p>
@@ -3685,11 +4334,16 @@
           <w:tcPr/>
           <w:p>
             <w:pPr>
-              <w:widowControl w:val="0"/>
-              <w:pStyle w:val="Compact"/>
-              <w:jc w:val="both"/>
-            </w:pPr>
-            <w:r>
+              <w:spacing w:line="317" w:lineRule="auto" w:before="20" w:after="20"/>
+              <w:widowControl w:val="0"/>
+              <w:pStyle w:val="Compact"/>
+              <w:jc w:val="both"/>
+            </w:pPr>
+            <w:r>
+              <w:rPr>
+                <w:sz w:val="21"/>
+                <w:szCs w:val="21"/>
+              </w:rPr>
               <w:t xml:space="preserve">Production serving software (continuous batching, shifting phases) blurs the per-card constant</w:t>
             </w:r>
           </w:p>
@@ -3698,11 +4352,16 @@
           <w:tcPr/>
           <w:p>
             <w:pPr>
-              <w:widowControl w:val="0"/>
-              <w:pStyle w:val="Compact"/>
-              <w:jc w:val="both"/>
-            </w:pPr>
-            <w:r>
+              <w:spacing w:line="317" w:lineRule="auto" w:before="20" w:after="20"/>
+              <w:widowControl w:val="0"/>
+              <w:pStyle w:val="Compact"/>
+              <w:jc w:val="both"/>
+            </w:pPr>
+            <w:r>
+              <w:rPr>
+                <w:sz w:val="21"/>
+                <w:szCs w:val="21"/>
+              </w:rPr>
               <w:t xml:space="preserve">Static cap loses near-optimality for LLMs</w:t>
             </w:r>
           </w:p>
@@ -3711,11 +4370,16 @@
           <w:tcPr/>
           <w:p>
             <w:pPr>
-              <w:widowControl w:val="0"/>
-              <w:pStyle w:val="Compact"/>
-              <w:jc w:val="both"/>
-            </w:pPr>
-            <w:r>
+              <w:spacing w:line="317" w:lineRule="auto" w:before="20" w:after="20"/>
+              <w:widowControl w:val="0"/>
+              <w:pStyle w:val="Compact"/>
+              <w:jc w:val="both"/>
+            </w:pPr>
+            <w:r>
+              <w:rPr>
+                <w:sz w:val="21"/>
+                <w:szCs w:val="21"/>
+              </w:rPr>
               <w:t xml:space="preserve">Measured first (WP1, M1); the job model predicts the optimum where the constant breaks</w:t>
             </w:r>
           </w:p>
@@ -3727,11 +4391,16 @@
           <w:tcPr/>
           <w:p>
             <w:pPr>
-              <w:widowControl w:val="0"/>
-              <w:pStyle w:val="Compact"/>
-              <w:jc w:val="both"/>
-            </w:pPr>
-            <w:r>
+              <w:spacing w:line="317" w:lineRule="auto" w:before="20" w:after="20"/>
+              <w:widowControl w:val="0"/>
+              <w:pStyle w:val="Compact"/>
+              <w:jc w:val="both"/>
+            </w:pPr>
+            <w:r>
+              <w:rPr>
+                <w:sz w:val="21"/>
+                <w:szCs w:val="21"/>
+              </w:rPr>
               <w:t xml:space="preserve">Power-cap control unavailable on some rented platforms</w:t>
             </w:r>
           </w:p>
@@ -3740,11 +4409,16 @@
           <w:tcPr/>
           <w:p>
             <w:pPr>
-              <w:widowControl w:val="0"/>
-              <w:pStyle w:val="Compact"/>
-              <w:jc w:val="both"/>
-            </w:pPr>
-            <w:r>
+              <w:spacing w:line="317" w:lineRule="auto" w:before="20" w:after="20"/>
+              <w:widowControl w:val="0"/>
+              <w:pStyle w:val="Compact"/>
+              <w:jc w:val="both"/>
+            </w:pPr>
+            <w:r>
+              <w:rPr>
+                <w:sz w:val="21"/>
+                <w:szCs w:val="21"/>
+              </w:rPr>
               <w:t xml:space="preserve">Measurement campaign narrowed</w:t>
             </w:r>
           </w:p>
@@ -3753,11 +4427,16 @@
           <w:tcPr/>
           <w:p>
             <w:pPr>
-              <w:widowControl w:val="0"/>
-              <w:pStyle w:val="Compact"/>
-              <w:jc w:val="both"/>
-            </w:pPr>
-            <w:r>
+              <w:spacing w:line="317" w:lineRule="auto" w:before="20" w:after="20"/>
+              <w:widowControl w:val="0"/>
+              <w:pStyle w:val="Compact"/>
+              <w:jc w:val="both"/>
+            </w:pPr>
+            <w:r>
+              <w:rPr>
+                <w:sz w:val="21"/>
+                <w:szCs w:val="21"/>
+              </w:rPr>
               <w:t xml:space="preserve">AWS EC2 gives passthrough and root; too-high cap floors are exposed via the graphics clock (L4 [1]); BMC rentals cover the wall tier</w:t>
             </w:r>
           </w:p>
@@ -3769,11 +4448,16 @@
           <w:tcPr/>
           <w:p>
             <w:pPr>
-              <w:widowControl w:val="0"/>
-              <w:pStyle w:val="Compact"/>
-              <w:jc w:val="both"/>
-            </w:pPr>
-            <w:r>
+              <w:spacing w:line="317" w:lineRule="auto" w:before="20" w:after="20"/>
+              <w:widowControl w:val="0"/>
+              <w:pStyle w:val="Compact"/>
+              <w:jc w:val="both"/>
+            </w:pPr>
+            <w:r>
+              <w:rPr>
+                <w:sz w:val="21"/>
+                <w:szCs w:val="21"/>
+              </w:rPr>
               <w:t xml:space="preserve">Postdoc recruitment slips, or the single hire is lost mid-project</w:t>
             </w:r>
           </w:p>
@@ -3782,11 +4466,16 @@
           <w:tcPr/>
           <w:p>
             <w:pPr>
-              <w:widowControl w:val="0"/>
-              <w:pStyle w:val="Compact"/>
-              <w:jc w:val="both"/>
-            </w:pPr>
-            <w:r>
+              <w:spacing w:line="317" w:lineRule="auto" w:before="20" w:after="20"/>
+              <w:widowControl w:val="0"/>
+              <w:pStyle w:val="Compact"/>
+              <w:jc w:val="both"/>
+            </w:pPr>
+            <w:r>
+              <w:rPr>
+                <w:sz w:val="21"/>
+                <w:szCs w:val="21"/>
+              </w:rPr>
               <w:t xml:space="preserve">Schedule and delivery at risk</w:t>
             </w:r>
           </w:p>
@@ -3795,11 +4484,16 @@
           <w:tcPr/>
           <w:p>
             <w:pPr>
-              <w:widowControl w:val="0"/>
-              <w:pStyle w:val="Compact"/>
-              <w:jc w:val="both"/>
-            </w:pPr>
-            <w:r>
+              <w:spacing w:line="317" w:lineRule="auto" w:before="20" w:after="20"/>
+              <w:widowControl w:val="0"/>
+              <w:pStyle w:val="Compact"/>
+              <w:jc w:val="both"/>
+            </w:pPr>
+            <w:r>
+              <w:rPr>
+                <w:sz w:val="21"/>
+                <w:szCs w:val="21"/>
+              </w:rPr>
               <w:t xml:space="preserve">PI runs the WP1 bench directly (the ELF harness is his); the minimum-success path is one-FTE executable; recruitment via HIT and national channels with a fallback</w:t>
             </w:r>
           </w:p>
@@ -3811,11 +4505,16 @@
           <w:tcPr/>
           <w:p>
             <w:pPr>
-              <w:widowControl w:val="0"/>
-              <w:pStyle w:val="Compact"/>
-              <w:jc w:val="both"/>
-            </w:pPr>
-            <w:r>
+              <w:spacing w:line="317" w:lineRule="auto" w:before="20" w:after="20"/>
+              <w:widowControl w:val="0"/>
+              <w:pStyle w:val="Compact"/>
+              <w:jc w:val="both"/>
+            </w:pPr>
+            <w:r>
+              <w:rPr>
+                <w:sz w:val="21"/>
+                <w:szCs w:val="21"/>
+              </w:rPr>
               <w:t xml:space="preserve">Server-input power readout (BMC via IPMI/Redfish) blocked on a rented server</w:t>
             </w:r>
           </w:p>
@@ -3824,11 +4523,16 @@
           <w:tcPr/>
           <w:p>
             <w:pPr>
-              <w:widowControl w:val="0"/>
-              <w:pStyle w:val="Compact"/>
-              <w:jc w:val="both"/>
-            </w:pPr>
-            <w:r>
+              <w:spacing w:line="317" w:lineRule="auto" w:before="20" w:after="20"/>
+              <w:widowControl w:val="0"/>
+              <w:pStyle w:val="Compact"/>
+              <w:jc w:val="both"/>
+            </w:pPr>
+            <w:r>
+              <w:rPr>
+                <w:sz w:val="21"/>
+                <w:szCs w:val="21"/>
+              </w:rPr>
               <w:t xml:space="preserve">Wall-tier measurement narrowed</w:t>
             </w:r>
           </w:p>
@@ -3837,11 +4541,16 @@
           <w:tcPr/>
           <w:p>
             <w:pPr>
-              <w:widowControl w:val="0"/>
-              <w:pStyle w:val="Compact"/>
-              <w:jc w:val="both"/>
-            </w:pPr>
-            <w:r>
+              <w:spacing w:line="317" w:lineRule="auto" w:before="20" w:after="20"/>
+              <w:widowControl w:val="0"/>
+              <w:pStyle w:val="Compact"/>
+              <w:jc w:val="both"/>
+            </w:pPr>
+            <w:r>
+              <w:rPr>
+                <w:sz w:val="21"/>
+                <w:szCs w:val="21"/>
+              </w:rPr>
               <w:t xml:space="preserve">Named BMC-capable bare-metal vendors with dated quotes (GPU Mart and equivalents); fallback to an in-line metered PDU at the wall</w:t>
             </w:r>
           </w:p>
@@ -4003,6 +4712,7 @@
     <w:bookmarkStart w:id="52" w:name="bibliography"/>
     <w:p>
       <w:pPr>
+        <w:pageBreakBefore/>
         <w:keepLines w:val="0"/>
         <w:keepNext w:val="0"/>
         <w:widowControl w:val="0"/>
@@ -5281,11 +5991,16 @@
           <w:tcPr/>
           <w:p>
             <w:pPr>
-              <w:widowControl w:val="0"/>
-              <w:pStyle w:val="Compact"/>
-              <w:jc w:val="both"/>
-            </w:pPr>
-            <w:r>
+              <w:spacing w:line="317" w:lineRule="auto" w:before="20" w:after="20"/>
+              <w:widowControl w:val="0"/>
+              <w:pStyle w:val="Compact"/>
+              <w:jc w:val="both"/>
+            </w:pPr>
+            <w:r>
+              <w:rPr>
+                <w:sz w:val="21"/>
+                <w:szCs w:val="21"/>
+              </w:rPr>
               <w:t xml:space="preserve">Deliverable</w:t>
             </w:r>
           </w:p>
@@ -5294,11 +6009,16 @@
           <w:tcPr/>
           <w:p>
             <w:pPr>
-              <w:widowControl w:val="0"/>
-              <w:pStyle w:val="Compact"/>
-              <w:jc w:val="both"/>
-            </w:pPr>
-            <w:r>
+              <w:spacing w:line="317" w:lineRule="auto" w:before="20" w:after="20"/>
+              <w:widowControl w:val="0"/>
+              <w:pStyle w:val="Compact"/>
+              <w:jc w:val="both"/>
+            </w:pPr>
+            <w:r>
+              <w:rPr>
+                <w:sz w:val="21"/>
+                <w:szCs w:val="21"/>
+              </w:rPr>
               <w:t xml:space="preserve">What it is</w:t>
             </w:r>
           </w:p>
@@ -5307,11 +6027,16 @@
           <w:tcPr/>
           <w:p>
             <w:pPr>
-              <w:widowControl w:val="0"/>
-              <w:pStyle w:val="Compact"/>
-              <w:jc w:val="both"/>
-            </w:pPr>
-            <w:r>
+              <w:spacing w:line="317" w:lineRule="auto" w:before="20" w:after="20"/>
+              <w:widowControl w:val="0"/>
+              <w:pStyle w:val="Compact"/>
+              <w:jc w:val="both"/>
+            </w:pPr>
+            <w:r>
+              <w:rPr>
+                <w:sz w:val="21"/>
+                <w:szCs w:val="21"/>
+              </w:rPr>
               <w:t xml:space="preserve">Who uses it, for what</w:t>
             </w:r>
           </w:p>
@@ -5323,6 +6048,7 @@
           <w:tcPr/>
           <w:p>
             <w:pPr>
+              <w:spacing w:line="317" w:lineRule="auto" w:before="20" w:after="20"/>
               <w:widowControl w:val="0"/>
               <w:pStyle w:val="Compact"/>
               <w:jc w:val="both"/>
@@ -5331,6 +6057,8 @@
               <w:rPr>
                 <w:b/>
                 <w:bCs/>
+                <w:sz w:val="21"/>
+                <w:szCs w:val="21"/>
               </w:rPr>
               <w:t xml:space="preserve">ELF-2</w:t>
             </w:r>
@@ -5340,11 +6068,16 @@
           <w:tcPr/>
           <w:p>
             <w:pPr>
-              <w:widowControl w:val="0"/>
-              <w:pStyle w:val="Compact"/>
-              <w:jc w:val="both"/>
-            </w:pPr>
-            <w:r>
+              <w:spacing w:line="317" w:lineRule="auto" w:before="20" w:after="20"/>
+              <w:widowControl w:val="0"/>
+              <w:pStyle w:val="Compact"/>
+              <w:jc w:val="both"/>
+            </w:pPr>
+            <w:r>
+              <w:rPr>
+                <w:sz w:val="21"/>
+                <w:szCs w:val="21"/>
+              </w:rPr>
               <w:t xml:space="preserve">An open dataset: power, throughput and latency at every operating point, board to wall, on current GPUs and production serving software</w:t>
             </w:r>
           </w:p>
@@ -5353,11 +6086,16 @@
           <w:tcPr/>
           <w:p>
             <w:pPr>
-              <w:widowControl w:val="0"/>
-              <w:pStyle w:val="Compact"/>
-              <w:jc w:val="both"/>
-            </w:pPr>
-            <w:r>
+              <w:spacing w:line="317" w:lineRule="auto" w:before="20" w:after="20"/>
+              <w:widowControl w:val="0"/>
+              <w:pStyle w:val="Compact"/>
+              <w:jc w:val="both"/>
+            </w:pPr>
+            <w:r>
+              <w:rPr>
+                <w:sz w:val="21"/>
+                <w:szCs w:val="21"/>
+              </w:rPr>
               <w:t xml:space="preserve">Researchers and vendors, as ground truth; every other deliverable is built and validated on it</w:t>
             </w:r>
           </w:p>
@@ -5369,6 +6107,7 @@
           <w:tcPr/>
           <w:p>
             <w:pPr>
+              <w:spacing w:line="317" w:lineRule="auto" w:before="20" w:after="20"/>
               <w:widowControl w:val="0"/>
               <w:pStyle w:val="Compact"/>
               <w:jc w:val="both"/>
@@ -5377,6 +6116,8 @@
               <w:rPr>
                 <w:b/>
                 <w:bCs/>
+                <w:sz w:val="21"/>
+                <w:szCs w:val="21"/>
               </w:rPr>
               <w:t xml:space="preserve">The characterization kit</w:t>
             </w:r>
@@ -5386,11 +6127,16 @@
           <w:tcPr/>
           <w:p>
             <w:pPr>
-              <w:widowControl w:val="0"/>
-              <w:pStyle w:val="Compact"/>
-              <w:jc w:val="both"/>
-            </w:pPr>
-            <w:r>
+              <w:spacing w:line="317" w:lineRule="auto" w:before="20" w:after="20"/>
+              <w:widowControl w:val="0"/>
+              <w:pStyle w:val="Compact"/>
+              <w:jc w:val="both"/>
+            </w:pPr>
+            <w:r>
+              <w:rPr>
+                <w:sz w:val="21"/>
+                <w:szCs w:val="21"/>
+              </w:rPr>
               <w:t xml:space="preserve">Software plus protocol: a one-test procedure and the two fitted models placing the JP of a new or unmeasured card within the validated hardware domain, in hours</w:t>
             </w:r>
           </w:p>
@@ -5399,11 +6145,16 @@
           <w:tcPr/>
           <w:p>
             <w:pPr>
-              <w:widowControl w:val="0"/>
-              <w:pStyle w:val="Compact"/>
-              <w:jc w:val="both"/>
-            </w:pPr>
-            <w:r>
+              <w:spacing w:line="317" w:lineRule="auto" w:before="20" w:after="20"/>
+              <w:widowControl w:val="0"/>
+              <w:pStyle w:val="Compact"/>
+              <w:jc w:val="both"/>
+            </w:pPr>
+            <w:r>
+              <w:rPr>
+                <w:sz w:val="21"/>
+                <w:szCs w:val="21"/>
+              </w:rPr>
               <w:t xml:space="preserve">A GPU engineer or operator qualifying a new card model or a new serving stack before deployment, at known cost</w:t>
             </w:r>
           </w:p>
@@ -5415,6 +6166,7 @@
           <w:tcPr/>
           <w:p>
             <w:pPr>
+              <w:spacing w:line="317" w:lineRule="auto" w:before="20" w:after="20"/>
               <w:widowControl w:val="0"/>
               <w:pStyle w:val="Compact"/>
               <w:jc w:val="both"/>
@@ -5423,6 +6175,8 @@
               <w:rPr>
                 <w:b/>
                 <w:bCs/>
+                <w:sz w:val="21"/>
+                <w:szCs w:val="21"/>
               </w:rPr>
               <w:t xml:space="preserve">The control engine</w:t>
             </w:r>
@@ -5432,11 +6186,16 @@
           <w:tcPr/>
           <w:p>
             <w:pPr>
-              <w:widowControl w:val="0"/>
-              <w:pStyle w:val="Compact"/>
-              <w:jc w:val="both"/>
-            </w:pPr>
-            <w:r>
+              <w:spacing w:line="317" w:lineRule="auto" w:before="20" w:after="20"/>
+              <w:widowControl w:val="0"/>
+              <w:pStyle w:val="Compact"/>
+              <w:jc w:val="both"/>
+            </w:pPr>
+            <w:r>
+              <w:rPr>
+                <w:sz w:val="21"/>
+                <w:szCs w:val="21"/>
+              </w:rPr>
               <w:t xml:space="preserve">An open-source control engine that assigns jobs and sets caps to keep a fleet inside its envelope, evaluated in the twin and demonstrated on a metered rented server before any deployment</w:t>
             </w:r>
           </w:p>
@@ -5445,11 +6204,16 @@
           <w:tcPr/>
           <w:p>
             <w:pPr>
-              <w:widowControl w:val="0"/>
-              <w:pStyle w:val="Compact"/>
-              <w:jc w:val="both"/>
-            </w:pPr>
-            <w:r>
+              <w:spacing w:line="317" w:lineRule="auto" w:before="20" w:after="20"/>
+              <w:widowControl w:val="0"/>
+              <w:pStyle w:val="Compact"/>
+              <w:jc w:val="both"/>
+            </w:pPr>
+            <w:r>
+              <w:rPr>
+                <w:sz w:val="21"/>
+                <w:szCs w:val="21"/>
+              </w:rPr>
               <w:t xml:space="preserve">An AI data-center manager, to cut energy per job and honor a committed envelope; its report doubles as the compliance record</w:t>
             </w:r>
           </w:p>
@@ -5461,6 +6225,7 @@
           <w:tcPr/>
           <w:p>
             <w:pPr>
+              <w:spacing w:line="317" w:lineRule="auto" w:before="20" w:after="20"/>
               <w:widowControl w:val="0"/>
               <w:pStyle w:val="Compact"/>
               <w:jc w:val="both"/>
@@ -5469,6 +6234,8 @@
               <w:rPr>
                 <w:b/>
                 <w:bCs/>
+                <w:sz w:val="21"/>
+                <w:szCs w:val="21"/>
               </w:rPr>
               <w:t xml:space="preserve">The digital twin</w:t>
             </w:r>
@@ -5478,11 +6245,16 @@
           <w:tcPr/>
           <w:p>
             <w:pPr>
-              <w:widowControl w:val="0"/>
-              <w:pStyle w:val="Compact"/>
-              <w:jc w:val="both"/>
-            </w:pPr>
-            <w:r>
+              <w:spacing w:line="317" w:lineRule="auto" w:before="20" w:after="20"/>
+              <w:widowControl w:val="0"/>
+              <w:pStyle w:val="Compact"/>
+              <w:jc w:val="both"/>
+            </w:pPr>
+            <w:r>
+              <w:rPr>
+                <w:sz w:val="21"/>
+                <w:szCs w:val="21"/>
+              </w:rPr>
               <w:t xml:space="preserve">A simulator replaying the measured curves of a described fleet and job mix, evaluating any policy or envelope scenario exactly before hardware is touched</w:t>
             </w:r>
           </w:p>
@@ -5491,11 +6263,16 @@
           <w:tcPr/>
           <w:p>
             <w:pPr>
-              <w:widowControl w:val="0"/>
-              <w:pStyle w:val="Compact"/>
-              <w:jc w:val="both"/>
-            </w:pPr>
-            <w:r>
+              <w:spacing w:line="317" w:lineRule="auto" w:before="20" w:after="20"/>
+              <w:widowControl w:val="0"/>
+              <w:pStyle w:val="Compact"/>
+              <w:jc w:val="both"/>
+            </w:pPr>
+            <w:r>
+              <w:rPr>
+                <w:sz w:val="21"/>
+                <w:szCs w:val="21"/>
+              </w:rPr>
               <w:t xml:space="preserve">An operator testing policies before deployment; a planner or regulator asking what a proposed facility could deliver and shed under a given connection</w:t>
             </w:r>
           </w:p>
@@ -5507,6 +6284,7 @@
           <w:tcPr/>
           <w:p>
             <w:pPr>
+              <w:spacing w:line="317" w:lineRule="auto" w:before="20" w:after="20"/>
               <w:widowControl w:val="0"/>
               <w:pStyle w:val="Compact"/>
               <w:jc w:val="both"/>
@@ -5515,6 +6293,8 @@
               <w:rPr>
                 <w:b/>
                 <w:bCs/>
+                <w:sz w:val="21"/>
+                <w:szCs w:val="21"/>
               </w:rPr>
               <w:t xml:space="preserve">The grid interface and policy report</w:t>
             </w:r>
@@ -5524,11 +6304,16 @@
           <w:tcPr/>
           <w:p>
             <w:pPr>
-              <w:widowControl w:val="0"/>
-              <w:pStyle w:val="Compact"/>
-              <w:jc w:val="both"/>
-            </w:pPr>
-            <w:r>
+              <w:spacing w:line="317" w:lineRule="auto" w:before="20" w:after="20"/>
+              <w:widowControl w:val="0"/>
+              <w:pStyle w:val="Compact"/>
+              <w:jc w:val="both"/>
+            </w:pPr>
+            <w:r>
+              <w:rPr>
+                <w:sz w:val="21"/>
+                <w:szCs w:val="21"/>
+              </w:rPr>
               <w:t xml:space="preserve">A blueprint: open formats for the envelope commitment, the flexibility offer and the delivery record, plus a regulator-facing report quantifying firm-plus-flexible connections against the national queue</w:t>
             </w:r>
           </w:p>
@@ -5537,11 +6322,16 @@
           <w:tcPr/>
           <w:p>
             <w:pPr>
-              <w:widowControl w:val="0"/>
-              <w:pStyle w:val="Compact"/>
-              <w:jc w:val="both"/>
-            </w:pPr>
-            <w:r>
+              <w:spacing w:line="317" w:lineRule="auto" w:before="20" w:after="20"/>
+              <w:widowControl w:val="0"/>
+              <w:pStyle w:val="Compact"/>
+              <w:jc w:val="both"/>
+            </w:pPr>
+            <w:r>
+              <w:rPr>
+                <w:sz w:val="21"/>
+                <w:szCs w:val="21"/>
+              </w:rPr>
               <w:t xml:space="preserve">The Electricity Authority and Noga, as the technical basis for offering conditional connections and auditing compliance</w:t>
             </w:r>
           </w:p>
@@ -5957,7 +6747,7 @@
     <w:link w:val="BodyTextChar"/>
     <w:qFormat/>
     <w:pPr>
-      <w:spacing w:after="180" w:before="180"/>
+      <w:spacing w:after="120" w:before="0"/>
     </w:pPr>
   </w:style>
   <w:style w:customStyle="1" w:styleId="FirstParagraph" w:type="paragraph">

</xml_diff>

<commit_message>
Sync: page numbers on submission PDF and Word doc
Co-Authored-By: Claude Opus 4.8 <noreply@anthropic.com>
</commit_message>
<xml_diff>
--- a/JouleFlex-proposal-2026-09-06.docx
+++ b/JouleFlex-proposal-2026-09-06.docx
@@ -6368,6 +6368,7 @@
     </w:p>
     <w:bookmarkEnd w:id="63"/>
     <w:sectPr>
+      <w:footerReference w:type="default" r:id="rId9"/>
       <w:pgSz w:h="16838" w:w="11906"/>
       <w:pgMar w:bottom="1440" w:left="1440" w:right="1440" w:top="1440"/>
     </w:sectPr>
@@ -6377,6 +6378,49 @@
 
 <file path=word/comments.xml><?xml version="1.0" encoding="utf-8"?>
 <w:comments xmlns:w="http://schemas.openxmlformats.org/wordprocessingml/2006/main" xmlns:m="http://schemas.openxmlformats.org/officeDocument/2006/math" xmlns:r="http://schemas.openxmlformats.org/officeDocument/2006/relationships" xmlns:o="urn:schemas-microsoft-com:office:office" xmlns:v="urn:schemas-microsoft-com:vml" xmlns:w10="urn:schemas-microsoft-com:office:word" xmlns:a="http://schemas.openxmlformats.org/drawingml/2006/main" xmlns:pic="http://schemas.openxmlformats.org/drawingml/2006/picture" xmlns:wp="http://schemas.openxmlformats.org/drawingml/2006/wordprocessingDrawing"/>
+</file>
+
+<file path=word/footer1.xml><?xml version="1.0" encoding="utf-8"?>
+<w:ftr xmlns:m="http://schemas.openxmlformats.org/officeDocument/2006/math" xmlns:mc="http://schemas.openxmlformats.org/markup-compatibility/2006" xmlns:mo="http://schemas.microsoft.com/office/mac/office/2008/main" xmlns:mv="urn:schemas-microsoft-com:mac:vml" xmlns:o="urn:schemas-microsoft-com:office:office" xmlns:r="http://schemas.openxmlformats.org/officeDocument/2006/relationships" xmlns:v="urn:schemas-microsoft-com:vml" xmlns:w10="urn:schemas-microsoft-com:office:word" xmlns:w14="http://schemas.microsoft.com/office/word/2010/wordml" xmlns:w="http://schemas.openxmlformats.org/wordprocessingml/2006/main" xmlns:wne="http://schemas.microsoft.com/office/word/2006/wordml" xmlns:wp14="http://schemas.microsoft.com/office/word/2010/wordprocessingDrawing" xmlns:wp="http://schemas.openxmlformats.org/drawingml/2006/wordprocessingDrawing" xmlns:wpc="http://schemas.microsoft.com/office/word/2010/wordprocessingCanvas" xmlns:wpg="http://schemas.microsoft.com/office/word/2010/wordprocessingGroup" xmlns:wpi="http://schemas.microsoft.com/office/word/2010/wordprocessingInk" xmlns:wps="http://schemas.microsoft.com/office/word/2010/wordprocessingShape" mc:Ignorable="w14 wp14">
+  <w:p>
+    <w:pPr>
+      <w:pStyle w:val="Footer"/>
+      <w:jc w:val="center"/>
+    </w:pPr>
+    <w:r>
+      <w:rPr>
+        <w:sz w:val="20"/>
+        <w:szCs w:val="20"/>
+      </w:rPr>
+      <w:t xml:space="preserve">Page </w:t>
+    </w:r>
+    <w:fldSimple w:instr=" PAGE ">
+      <w:r>
+        <w:rPr>
+          <w:sz w:val="20"/>
+          <w:szCs w:val="20"/>
+        </w:rPr>
+        <w:t>1</w:t>
+      </w:r>
+    </w:fldSimple>
+    <w:r>
+      <w:rPr>
+        <w:sz w:val="20"/>
+        <w:szCs w:val="20"/>
+      </w:rPr>
+      <w:t xml:space="preserve"> of </w:t>
+    </w:r>
+    <w:fldSimple w:instr=" NUMPAGES ">
+      <w:r>
+        <w:rPr>
+          <w:sz w:val="20"/>
+          <w:szCs w:val="20"/>
+        </w:rPr>
+        <w:t>1</w:t>
+      </w:r>
+    </w:fldSimple>
+  </w:p>
+</w:ftr>
 </file>
 
 <file path=word/footnotes.xml><?xml version="1.0" encoding="utf-8"?>

</xml_diff>

<commit_message>
Rebuild v1 PDFs/DOCX with arXiv citation for the Joule Point paper
Co-Authored-By: Claude Opus 5.5 <noreply@anthropic.com>
</commit_message>
<xml_diff>
--- a/JouleFlex-proposal-2026-09-06.docx
+++ b/JouleFlex-proposal-2026-09-06.docx
@@ -4756,7 +4756,7 @@
         <w:t xml:space="preserve"> </w:t>
       </w:r>
       <w:r>
-        <w:t xml:space="preserve">Preprint, September 2026. DOI:</w:t>
+        <w:t xml:space="preserve">arXiv preprint, September 2026. arXiv:</w:t>
       </w:r>
       <w:r>
         <w:t xml:space="preserve"> </w:t>
@@ -4766,7 +4766,7 @@
           <w:rPr>
             <w:rStyle w:val="Hyperlink"/>
           </w:rPr>
-          <w:t xml:space="preserve">10.13140/RG.2.2.20385.36964</w:t>
+          <w:t xml:space="preserve">2609.27926</w:t>
         </w:r>
       </w:hyperlink>
       <w:r>
@@ -5867,7 +5867,7 @@
               <a:graphicData uri="http://schemas.openxmlformats.org/drawingml/2006/picture">
                 <pic:pic>
                   <pic:nvPicPr>
-                    <pic:cNvPr descr="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" id="61" name="Picture"/>
+                    <pic:cNvPr descr="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" id="61" name="Picture"/>
                     <pic:cNvPicPr>
                       <a:picLocks noChangeArrowheads="1" noChangeAspect="1"/>
                     </pic:cNvPicPr>

</xml_diff>